<commit_message>
Proposal: research questions, study comparability, PV/wind details, code mapping
- 1.4 Research Questions (RQ1-RQ4) with Table 1.1 linking methods and evidence
- 3.1 comparability of the two studies; Study 2 PV parameters; Study 1 turbine
  dynamics; PV share with clip and lag (3.16a)
- 3.11 Implementation and Reproducibility: equation-to-code map for both
  studies (Study 1 code on branch claude/funny-wright-4vhwhz)

Co-Authored-By: Claude Opus 5.5 <noreply@anthropic.com>
Claude-Session: https://claude.ai/code/session_01FcrrmkJTVMUBqnhfmaF7Pm
</commit_message>
<xml_diff>
--- a/paper/Thesis_Proposal_MB_Khan.docx
+++ b/paper/Thesis_Proposal_MB_Khan.docx
@@ -740,7 +740,767 @@
           <w:sz w:val="28"/>
           <w:szCs w:val="28"/>
         </w:rPr>
-        <w:t xml:space="preserve">1.4	Scope and Limitations</w:t>
+        <w:t xml:space="preserve">1.4	Research Questions</w:t>
+      </w:r>
+    </w:p>
+    <w:p>
+      <w:pPr>
+        <w:spacing w:after="120" w:line="360"/>
+        <w:ind w:firstLine="720"/>
+        <w:jc w:val="both"/>
+      </w:pPr>
+      <w:r>
+        <w:rPr>
+          <w:rFonts w:ascii="Times New Roman" w:cs="Times New Roman" w:eastAsia="Times New Roman" w:hAnsi="Times New Roman"/>
+          <w:sz w:val="28"/>
+          <w:szCs w:val="28"/>
+        </w:rPr>
+        <w:t xml:space="preserve">The thesis answers one main question: </w:t>
+      </w:r>
+      <w:r>
+        <w:rPr>
+          <w:rFonts w:ascii="Times New Roman" w:cs="Times New Roman" w:eastAsia="Times New Roman" w:hAnsi="Times New Roman"/>
+          <w:b w:val="false"/>
+          <w:bCs w:val="false"/>
+          <w:i/>
+          <w:iCs/>
+          <w:sz w:val="28"/>
+          <w:szCs w:val="28"/>
+        </w:rPr>
+        <w:t xml:space="preserve">can deep reinforcement learning schedule the virtual inertia and damping of a BESS-based VSG so that the synthetic inertia is physically feasible, and does it then improve frequency control over a properly tuned conventional VSG?</w:t>
+      </w:r>
+      <w:r>
+        <w:rPr>
+          <w:rFonts w:ascii="Times New Roman" w:cs="Times New Roman" w:eastAsia="Times New Roman" w:hAnsi="Times New Roman"/>
+          <w:sz w:val="28"/>
+          <w:szCs w:val="28"/>
+        </w:rPr>
+        <w:t xml:space="preserve"> The main question is divided into four research questions, each answered by one of the objectives in Section 1.3:</w:t>
+      </w:r>
+    </w:p>
+    <w:p>
+      <w:pPr>
+        <w:pStyle w:val="ListParagraph"/>
+        <w:numPr>
+          <w:ilvl w:val="0"/>
+          <w:numId w:val="3"/>
+        </w:numPr>
+        <w:spacing w:after="60" w:line="360"/>
+        <w:jc w:val="both"/>
+      </w:pPr>
+      <w:r>
+        <w:rPr>
+          <w:rFonts w:ascii="Times New Roman" w:cs="Times New Roman" w:eastAsia="Times New Roman" w:hAnsi="Times New Roman"/>
+          <w:b/>
+          <w:bCs/>
+          <w:i w:val="false"/>
+          <w:iCs w:val="false"/>
+          <w:sz w:val="28"/>
+          <w:szCs w:val="28"/>
+        </w:rPr>
+        <w:t xml:space="preserve">RQ1 (feasibility). </w:t>
+      </w:r>
+      <w:r>
+        <w:rPr>
+          <w:rFonts w:ascii="Times New Roman" w:cs="Times New Roman" w:eastAsia="Times New Roman" w:hAnsi="Times New Roman"/>
+          <w:sz w:val="28"/>
+          <w:szCs w:val="28"/>
+        </w:rPr>
+        <w:t xml:space="preserve">How much converter headroom do virtual inertia and damping require, and how should a controller be limited when that headroom is not available: by a summed or a time-separated requirement, and by clipping each parameter or by scaling both? (Objective 1)</w:t>
+      </w:r>
+    </w:p>
+    <w:p>
+      <w:pPr>
+        <w:pStyle w:val="ListParagraph"/>
+        <w:numPr>
+          <w:ilvl w:val="0"/>
+          <w:numId w:val="3"/>
+        </w:numPr>
+        <w:spacing w:after="60" w:line="360"/>
+        <w:jc w:val="both"/>
+      </w:pPr>
+      <w:r>
+        <w:rPr>
+          <w:rFonts w:ascii="Times New Roman" w:cs="Times New Roman" w:eastAsia="Times New Roman" w:hAnsi="Times New Roman"/>
+          <w:b/>
+          <w:bCs/>
+          <w:i w:val="false"/>
+          <w:iCs w:val="false"/>
+          <w:sz w:val="28"/>
+          <w:szCs w:val="28"/>
+        </w:rPr>
+        <w:t xml:space="preserve">RQ2 (learning). </w:t>
+      </w:r>
+      <w:r>
+        <w:rPr>
+          <w:rFonts w:ascii="Times New Roman" w:cs="Times New Roman" w:eastAsia="Times New Roman" w:hAnsi="Times New Roman"/>
+          <w:sz w:val="28"/>
+          <w:szCs w:val="28"/>
+        </w:rPr>
+        <w:t xml:space="preserve">Can DDPG and TD3 agents learn to schedule the virtual inertia and damping in real time within this constraint, both in a converter-only microgrid and in a hybrid microgrid with a diesel generator? (Objective 2)</w:t>
+      </w:r>
+    </w:p>
+    <w:p>
+      <w:pPr>
+        <w:pStyle w:val="ListParagraph"/>
+        <w:numPr>
+          <w:ilvl w:val="0"/>
+          <w:numId w:val="3"/>
+        </w:numPr>
+        <w:spacing w:after="60" w:line="360"/>
+        <w:jc w:val="both"/>
+      </w:pPr>
+      <w:r>
+        <w:rPr>
+          <w:rFonts w:ascii="Times New Roman" w:cs="Times New Roman" w:eastAsia="Times New Roman" w:hAnsi="Times New Roman"/>
+          <w:b/>
+          <w:bCs/>
+          <w:i w:val="false"/>
+          <w:iCs w:val="false"/>
+          <w:sz w:val="28"/>
+          <w:szCs w:val="28"/>
+        </w:rPr>
+        <w:t xml:space="preserve">RQ3 (benefit). </w:t>
+      </w:r>
+      <w:r>
+        <w:rPr>
+          <w:rFonts w:ascii="Times New Roman" w:cs="Times New Roman" w:eastAsia="Times New Roman" w:hAnsi="Times New Roman"/>
+          <w:sz w:val="28"/>
+          <w:szCs w:val="28"/>
+        </w:rPr>
+        <w:t xml:space="preserve">When compared fairly, against tuned constant and rule-based VSGs, over several seeds and with statistical tests, does learning improve on a tuned VSG, and how much can any adaptive scheduler gain at most? (Objective 3)</w:t>
+      </w:r>
+    </w:p>
+    <w:p>
+      <w:pPr>
+        <w:pStyle w:val="ListParagraph"/>
+        <w:numPr>
+          <w:ilvl w:val="0"/>
+          <w:numId w:val="3"/>
+        </w:numPr>
+        <w:spacing w:after="60" w:line="360"/>
+        <w:jc w:val="both"/>
+      </w:pPr>
+      <w:r>
+        <w:rPr>
+          <w:rFonts w:ascii="Times New Roman" w:cs="Times New Roman" w:eastAsia="Times New Roman" w:hAnsi="Times New Roman"/>
+          <w:b/>
+          <w:bCs/>
+          <w:i w:val="false"/>
+          <w:iCs w:val="false"/>
+          <w:sz w:val="28"/>
+          <w:szCs w:val="28"/>
+        </w:rPr>
+        <w:t xml:space="preserve">RQ4 (fidelity). </w:t>
+      </w:r>
+      <w:r>
+        <w:rPr>
+          <w:rFonts w:ascii="Times New Roman" w:cs="Times New Roman" w:eastAsia="Times New Roman" w:hAnsi="Times New Roman"/>
+          <w:sz w:val="28"/>
+          <w:szCs w:val="28"/>
+        </w:rPr>
+        <w:t xml:space="preserve">Do the conclusions drawn from the averaged model hold in an independent implementation and in a three-phase electromagnetic-transient model? (Objective 4)</w:t>
+      </w:r>
+    </w:p>
+    <w:p>
+      <w:pPr>
+        <w:spacing w:after="120" w:line="360"/>
+        <w:ind w:firstLine="720"/>
+        <w:jc w:val="both"/>
+      </w:pPr>
+      <w:r>
+        <w:rPr>
+          <w:rFonts w:ascii="Times New Roman" w:cs="Times New Roman" w:eastAsia="Times New Roman" w:hAnsi="Times New Roman"/>
+          <w:sz w:val="28"/>
+          <w:szCs w:val="28"/>
+        </w:rPr>
+        <w:t xml:space="preserve">RQ1 to RQ3 correspond directly to the three parts of the main question (feasibility, learning, improvement); RQ4 checks that their answers are not artefacts of the averaged model. Table 1.1 links each question to the methods of Chapter 3 and to the preliminary results of Chapter 4.</w:t>
+      </w:r>
+    </w:p>
+    <w:p>
+      <w:pPr>
+        <w:keepNext/>
+        <w:spacing w:after="80" w:before="200"/>
+        <w:jc w:val="left"/>
+      </w:pPr>
+      <w:r>
+        <w:rPr>
+          <w:rFonts w:ascii="Times New Roman" w:cs="Times New Roman" w:eastAsia="Times New Roman" w:hAnsi="Times New Roman"/>
+          <w:sz w:val="26"/>
+          <w:szCs w:val="26"/>
+        </w:rPr>
+        <w:t xml:space="preserve">Table 1.1 Research questions, methods and preliminary evidence</w:t>
+      </w:r>
+    </w:p>
+    <w:tbl>
+      <w:tblPr>
+        <w:tblW w:type="dxa" w:w="8306"/>
+        <w:tblBorders>
+          <w:top w:val="single" w:color="auto" w:sz="4"/>
+          <w:left w:val="single" w:color="auto" w:sz="4"/>
+          <w:bottom w:val="single" w:color="auto" w:sz="4"/>
+          <w:right w:val="single" w:color="auto" w:sz="4"/>
+          <w:insideH w:val="single" w:color="auto" w:sz="4"/>
+          <w:insideV w:val="single" w:color="auto" w:sz="4"/>
+        </w:tblBorders>
+      </w:tblPr>
+      <w:tblGrid>
+        <w:gridCol w:w="1700"/>
+        <w:gridCol w:w="3600"/>
+        <w:gridCol w:w="3006"/>
+      </w:tblGrid>
+      <w:tr>
+        <w:trPr>
+          <w:cantSplit/>
+          <w:tblHeader/>
+        </w:trPr>
+        <w:tc>
+          <w:tcPr>
+            <w:tcW w:type="dxa" w:w="1700"/>
+            <w:tcBorders>
+              <w:top w:val="single" w:color="000000" w:sz="4"/>
+              <w:left w:val="single" w:color="000000" w:sz="4"/>
+              <w:bottom w:val="single" w:color="000000" w:sz="4"/>
+              <w:right w:val="single" w:color="000000" w:sz="4"/>
+            </w:tcBorders>
+            <w:shd w:fill="E8E8E8" w:color="auto" w:val="clear"/>
+            <w:tcMar>
+              <w:top w:type="dxa" w:w="40"/>
+              <w:left w:type="dxa" w:w="80"/>
+              <w:bottom w:type="dxa" w:w="40"/>
+              <w:right w:type="dxa" w:w="80"/>
+            </w:tcMar>
+            <w:vAlign w:val="center"/>
+          </w:tcPr>
+          <w:p>
+            <w:pPr>
+              <w:jc w:val="center"/>
+            </w:pPr>
+            <w:r>
+              <w:rPr>
+                <w:rFonts w:ascii="Times New Roman" w:cs="Times New Roman" w:eastAsia="Times New Roman" w:hAnsi="Times New Roman"/>
+                <w:b/>
+                <w:bCs/>
+                <w:sz w:val="22"/>
+                <w:szCs w:val="22"/>
+              </w:rPr>
+              <w:t xml:space="preserve">Question</w:t>
+            </w:r>
+          </w:p>
+        </w:tc>
+        <w:tc>
+          <w:tcPr>
+            <w:tcW w:type="dxa" w:w="3600"/>
+            <w:tcBorders>
+              <w:top w:val="single" w:color="000000" w:sz="4"/>
+              <w:left w:val="single" w:color="000000" w:sz="4"/>
+              <w:bottom w:val="single" w:color="000000" w:sz="4"/>
+              <w:right w:val="single" w:color="000000" w:sz="4"/>
+            </w:tcBorders>
+            <w:shd w:fill="E8E8E8" w:color="auto" w:val="clear"/>
+            <w:tcMar>
+              <w:top w:type="dxa" w:w="40"/>
+              <w:left w:type="dxa" w:w="80"/>
+              <w:bottom w:type="dxa" w:w="40"/>
+              <w:right w:type="dxa" w:w="80"/>
+            </w:tcMar>
+            <w:vAlign w:val="center"/>
+          </w:tcPr>
+          <w:p>
+            <w:pPr>
+              <w:jc w:val="center"/>
+            </w:pPr>
+            <w:r>
+              <w:rPr>
+                <w:rFonts w:ascii="Times New Roman" w:cs="Times New Roman" w:eastAsia="Times New Roman" w:hAnsi="Times New Roman"/>
+                <w:b/>
+                <w:bCs/>
+                <w:sz w:val="22"/>
+                <w:szCs w:val="22"/>
+              </w:rPr>
+              <w:t xml:space="preserve">Methods (Chapter 3)</w:t>
+            </w:r>
+          </w:p>
+        </w:tc>
+        <w:tc>
+          <w:tcPr>
+            <w:tcW w:type="dxa" w:w="3006"/>
+            <w:tcBorders>
+              <w:top w:val="single" w:color="000000" w:sz="4"/>
+              <w:left w:val="single" w:color="000000" w:sz="4"/>
+              <w:bottom w:val="single" w:color="000000" w:sz="4"/>
+              <w:right w:val="single" w:color="000000" w:sz="4"/>
+            </w:tcBorders>
+            <w:shd w:fill="E8E8E8" w:color="auto" w:val="clear"/>
+            <w:tcMar>
+              <w:top w:type="dxa" w:w="40"/>
+              <w:left w:type="dxa" w:w="80"/>
+              <w:bottom w:type="dxa" w:w="40"/>
+              <w:right w:type="dxa" w:w="80"/>
+            </w:tcMar>
+            <w:vAlign w:val="center"/>
+          </w:tcPr>
+          <w:p>
+            <w:pPr>
+              <w:jc w:val="center"/>
+            </w:pPr>
+            <w:r>
+              <w:rPr>
+                <w:rFonts w:ascii="Times New Roman" w:cs="Times New Roman" w:eastAsia="Times New Roman" w:hAnsi="Times New Roman"/>
+                <w:b/>
+                <w:bCs/>
+                <w:sz w:val="22"/>
+                <w:szCs w:val="22"/>
+              </w:rPr>
+              <w:t xml:space="preserve">Preliminary evidence (Chapter 4)</w:t>
+            </w:r>
+          </w:p>
+        </w:tc>
+      </w:tr>
+      <w:tr>
+        <w:trPr>
+          <w:cantSplit/>
+          <w:tblHeader w:val="false"/>
+        </w:trPr>
+        <w:tc>
+          <w:tcPr>
+            <w:tcW w:type="dxa" w:w="1700"/>
+            <w:tcBorders>
+              <w:top w:val="single" w:color="000000" w:sz="4"/>
+              <w:left w:val="single" w:color="000000" w:sz="4"/>
+              <w:bottom w:val="single" w:color="000000" w:sz="4"/>
+              <w:right w:val="single" w:color="000000" w:sz="4"/>
+            </w:tcBorders>
+            <w:tcMar>
+              <w:top w:type="dxa" w:w="40"/>
+              <w:left w:type="dxa" w:w="80"/>
+              <w:bottom w:type="dxa" w:w="40"/>
+              <w:right w:type="dxa" w:w="80"/>
+            </w:tcMar>
+            <w:vAlign w:val="center"/>
+          </w:tcPr>
+          <w:p>
+            <w:pPr>
+              <w:jc w:val="left"/>
+            </w:pPr>
+            <w:r>
+              <w:rPr>
+                <w:rFonts w:ascii="Times New Roman" w:cs="Times New Roman" w:eastAsia="Times New Roman" w:hAnsi="Times New Roman"/>
+                <w:b w:val="false"/>
+                <w:bCs w:val="false"/>
+                <w:sz w:val="22"/>
+                <w:szCs w:val="22"/>
+              </w:rPr>
+              <w:t xml:space="preserve">RQ1 Feasibility</w:t>
+            </w:r>
+          </w:p>
+        </w:tc>
+        <w:tc>
+          <w:tcPr>
+            <w:tcW w:type="dxa" w:w="3600"/>
+            <w:tcBorders>
+              <w:top w:val="single" w:color="000000" w:sz="4"/>
+              <w:left w:val="single" w:color="000000" w:sz="4"/>
+              <w:bottom w:val="single" w:color="000000" w:sz="4"/>
+              <w:right w:val="single" w:color="000000" w:sz="4"/>
+            </w:tcBorders>
+            <w:tcMar>
+              <w:top w:type="dxa" w:w="40"/>
+              <w:left w:type="dxa" w:w="80"/>
+              <w:bottom w:type="dxa" w:w="40"/>
+              <w:right w:type="dxa" w:w="80"/>
+            </w:tcMar>
+            <w:vAlign w:val="center"/>
+          </w:tcPr>
+          <w:p>
+            <w:pPr>
+              <w:jc w:val="left"/>
+            </w:pPr>
+            <w:r>
+              <w:rPr>
+                <w:rFonts w:ascii="Times New Roman" w:cs="Times New Roman" w:eastAsia="Times New Roman" w:hAnsi="Times New Roman"/>
+                <w:b w:val="false"/>
+                <w:bCs w:val="false"/>
+                <w:sz w:val="22"/>
+                <w:szCs w:val="22"/>
+              </w:rPr>
+              <w:t xml:space="preserve">Headroom requirement and derating, Eqs. (3.17)–(3.21), Section 3.6</w:t>
+            </w:r>
+          </w:p>
+        </w:tc>
+        <w:tc>
+          <w:tcPr>
+            <w:tcW w:type="dxa" w:w="3006"/>
+            <w:tcBorders>
+              <w:top w:val="single" w:color="000000" w:sz="4"/>
+              <w:left w:val="single" w:color="000000" w:sz="4"/>
+              <w:bottom w:val="single" w:color="000000" w:sz="4"/>
+              <w:right w:val="single" w:color="000000" w:sz="4"/>
+            </w:tcBorders>
+            <w:tcMar>
+              <w:top w:type="dxa" w:w="40"/>
+              <w:left w:type="dxa" w:w="80"/>
+              <w:bottom w:type="dxa" w:w="40"/>
+              <w:right w:type="dxa" w:w="80"/>
+            </w:tcMar>
+            <w:vAlign w:val="center"/>
+          </w:tcPr>
+          <w:p>
+            <w:pPr>
+              <w:jc w:val="left"/>
+            </w:pPr>
+            <w:r>
+              <w:rPr>
+                <w:rFonts w:ascii="Times New Roman" w:cs="Times New Roman" w:eastAsia="Times New Roman" w:hAnsi="Times New Roman"/>
+                <w:b w:val="false"/>
+                <w:bCs w:val="false"/>
+                <w:sz w:val="22"/>
+                <w:szCs w:val="22"/>
+              </w:rPr>
+              <w:t xml:space="preserve">Sections 4.2.3 and 4.3.3; Table 4.3</w:t>
+            </w:r>
+          </w:p>
+        </w:tc>
+      </w:tr>
+      <w:tr>
+        <w:trPr>
+          <w:cantSplit/>
+          <w:tblHeader w:val="false"/>
+        </w:trPr>
+        <w:tc>
+          <w:tcPr>
+            <w:tcW w:type="dxa" w:w="1700"/>
+            <w:tcBorders>
+              <w:top w:val="single" w:color="000000" w:sz="4"/>
+              <w:left w:val="single" w:color="000000" w:sz="4"/>
+              <w:bottom w:val="single" w:color="000000" w:sz="4"/>
+              <w:right w:val="single" w:color="000000" w:sz="4"/>
+            </w:tcBorders>
+            <w:tcMar>
+              <w:top w:type="dxa" w:w="40"/>
+              <w:left w:type="dxa" w:w="80"/>
+              <w:bottom w:type="dxa" w:w="40"/>
+              <w:right w:type="dxa" w:w="80"/>
+            </w:tcMar>
+            <w:vAlign w:val="center"/>
+          </w:tcPr>
+          <w:p>
+            <w:pPr>
+              <w:jc w:val="left"/>
+            </w:pPr>
+            <w:r>
+              <w:rPr>
+                <w:rFonts w:ascii="Times New Roman" w:cs="Times New Roman" w:eastAsia="Times New Roman" w:hAnsi="Times New Roman"/>
+                <w:b w:val="false"/>
+                <w:bCs w:val="false"/>
+                <w:sz w:val="22"/>
+                <w:szCs w:val="22"/>
+              </w:rPr>
+              <w:t xml:space="preserve">RQ2 Learning</w:t>
+            </w:r>
+          </w:p>
+        </w:tc>
+        <w:tc>
+          <w:tcPr>
+            <w:tcW w:type="dxa" w:w="3600"/>
+            <w:tcBorders>
+              <w:top w:val="single" w:color="000000" w:sz="4"/>
+              <w:left w:val="single" w:color="000000" w:sz="4"/>
+              <w:bottom w:val="single" w:color="000000" w:sz="4"/>
+              <w:right w:val="single" w:color="000000" w:sz="4"/>
+            </w:tcBorders>
+            <w:tcMar>
+              <w:top w:type="dxa" w:w="40"/>
+              <w:left w:type="dxa" w:w="80"/>
+              <w:bottom w:type="dxa" w:w="40"/>
+              <w:right w:type="dxa" w:w="80"/>
+            </w:tcMar>
+            <w:vAlign w:val="center"/>
+          </w:tcPr>
+          <w:p>
+            <w:pPr>
+              <w:jc w:val="left"/>
+            </w:pPr>
+            <w:r>
+              <w:rPr>
+                <w:rFonts w:ascii="Times New Roman" w:cs="Times New Roman" w:eastAsia="Times New Roman" w:hAnsi="Times New Roman"/>
+                <w:b w:val="false"/>
+                <w:bCs w:val="false"/>
+                <w:sz w:val="22"/>
+                <w:szCs w:val="22"/>
+              </w:rPr>
+              <w:t xml:space="preserve">Plant models, MDP, DDPG and TD3, Sections 3.5, 3.7, 3.8</w:t>
+            </w:r>
+          </w:p>
+        </w:tc>
+        <w:tc>
+          <w:tcPr>
+            <w:tcW w:type="dxa" w:w="3006"/>
+            <w:tcBorders>
+              <w:top w:val="single" w:color="000000" w:sz="4"/>
+              <w:left w:val="single" w:color="000000" w:sz="4"/>
+              <w:bottom w:val="single" w:color="000000" w:sz="4"/>
+              <w:right w:val="single" w:color="000000" w:sz="4"/>
+            </w:tcBorders>
+            <w:tcMar>
+              <w:top w:type="dxa" w:w="40"/>
+              <w:left w:type="dxa" w:w="80"/>
+              <w:bottom w:type="dxa" w:w="40"/>
+              <w:right w:type="dxa" w:w="80"/>
+            </w:tcMar>
+            <w:vAlign w:val="center"/>
+          </w:tcPr>
+          <w:p>
+            <w:pPr>
+              <w:jc w:val="left"/>
+            </w:pPr>
+            <w:r>
+              <w:rPr>
+                <w:rFonts w:ascii="Times New Roman" w:cs="Times New Roman" w:eastAsia="Times New Roman" w:hAnsi="Times New Roman"/>
+                <w:b w:val="false"/>
+                <w:bCs w:val="false"/>
+                <w:sz w:val="22"/>
+                <w:szCs w:val="22"/>
+              </w:rPr>
+              <w:t xml:space="preserve">Sections 4.2.2 and 4.3.4; Table 4.4</w:t>
+            </w:r>
+          </w:p>
+        </w:tc>
+      </w:tr>
+      <w:tr>
+        <w:trPr>
+          <w:cantSplit/>
+          <w:tblHeader w:val="false"/>
+        </w:trPr>
+        <w:tc>
+          <w:tcPr>
+            <w:tcW w:type="dxa" w:w="1700"/>
+            <w:tcBorders>
+              <w:top w:val="single" w:color="000000" w:sz="4"/>
+              <w:left w:val="single" w:color="000000" w:sz="4"/>
+              <w:bottom w:val="single" w:color="000000" w:sz="4"/>
+              <w:right w:val="single" w:color="000000" w:sz="4"/>
+            </w:tcBorders>
+            <w:tcMar>
+              <w:top w:type="dxa" w:w="40"/>
+              <w:left w:type="dxa" w:w="80"/>
+              <w:bottom w:type="dxa" w:w="40"/>
+              <w:right w:type="dxa" w:w="80"/>
+            </w:tcMar>
+            <w:vAlign w:val="center"/>
+          </w:tcPr>
+          <w:p>
+            <w:pPr>
+              <w:jc w:val="left"/>
+            </w:pPr>
+            <w:r>
+              <w:rPr>
+                <w:rFonts w:ascii="Times New Roman" w:cs="Times New Roman" w:eastAsia="Times New Roman" w:hAnsi="Times New Roman"/>
+                <w:b w:val="false"/>
+                <w:bCs w:val="false"/>
+                <w:sz w:val="22"/>
+                <w:szCs w:val="22"/>
+              </w:rPr>
+              <w:t xml:space="preserve">RQ3 Benefit</w:t>
+            </w:r>
+          </w:p>
+        </w:tc>
+        <w:tc>
+          <w:tcPr>
+            <w:tcW w:type="dxa" w:w="3600"/>
+            <w:tcBorders>
+              <w:top w:val="single" w:color="000000" w:sz="4"/>
+              <w:left w:val="single" w:color="000000" w:sz="4"/>
+              <w:bottom w:val="single" w:color="000000" w:sz="4"/>
+              <w:right w:val="single" w:color="000000" w:sz="4"/>
+            </w:tcBorders>
+            <w:tcMar>
+              <w:top w:type="dxa" w:w="40"/>
+              <w:left w:type="dxa" w:w="80"/>
+              <w:bottom w:type="dxa" w:w="40"/>
+              <w:right w:type="dxa" w:w="80"/>
+            </w:tcMar>
+            <w:vAlign w:val="center"/>
+          </w:tcPr>
+          <w:p>
+            <w:pPr>
+              <w:jc w:val="left"/>
+            </w:pPr>
+            <w:r>
+              <w:rPr>
+                <w:rFonts w:ascii="Times New Roman" w:cs="Times New Roman" w:eastAsia="Times New Roman" w:hAnsi="Times New Roman"/>
+                <w:b w:val="false"/>
+                <w:bCs w:val="false"/>
+                <w:sz w:val="22"/>
+                <w:szCs w:val="22"/>
+              </w:rPr>
+              <w:t xml:space="preserve">Tuned baselines, statistics and oracle bound, Section 3.9, Eq. (3.26)</w:t>
+            </w:r>
+          </w:p>
+        </w:tc>
+        <w:tc>
+          <w:tcPr>
+            <w:tcW w:type="dxa" w:w="3006"/>
+            <w:tcBorders>
+              <w:top w:val="single" w:color="000000" w:sz="4"/>
+              <w:left w:val="single" w:color="000000" w:sz="4"/>
+              <w:bottom w:val="single" w:color="000000" w:sz="4"/>
+              <w:right w:val="single" w:color="000000" w:sz="4"/>
+            </w:tcBorders>
+            <w:tcMar>
+              <w:top w:type="dxa" w:w="40"/>
+              <w:left w:type="dxa" w:w="80"/>
+              <w:bottom w:type="dxa" w:w="40"/>
+              <w:right w:type="dxa" w:w="80"/>
+            </w:tcMar>
+            <w:vAlign w:val="center"/>
+          </w:tcPr>
+          <w:p>
+            <w:pPr>
+              <w:jc w:val="left"/>
+            </w:pPr>
+            <w:r>
+              <w:rPr>
+                <w:rFonts w:ascii="Times New Roman" w:cs="Times New Roman" w:eastAsia="Times New Roman" w:hAnsi="Times New Roman"/>
+                <w:b w:val="false"/>
+                <w:bCs w:val="false"/>
+                <w:sz w:val="22"/>
+                <w:szCs w:val="22"/>
+              </w:rPr>
+              <w:t xml:space="preserve">Sections 4.2.3, 4.3.2 and 4.3.4; Tables 4.1 and 4.4</w:t>
+            </w:r>
+          </w:p>
+        </w:tc>
+      </w:tr>
+      <w:tr>
+        <w:trPr>
+          <w:cantSplit/>
+          <w:tblHeader w:val="false"/>
+        </w:trPr>
+        <w:tc>
+          <w:tcPr>
+            <w:tcW w:type="dxa" w:w="1700"/>
+            <w:tcBorders>
+              <w:top w:val="single" w:color="000000" w:sz="4"/>
+              <w:left w:val="single" w:color="000000" w:sz="4"/>
+              <w:bottom w:val="single" w:color="000000" w:sz="4"/>
+              <w:right w:val="single" w:color="000000" w:sz="4"/>
+            </w:tcBorders>
+            <w:tcMar>
+              <w:top w:type="dxa" w:w="40"/>
+              <w:left w:type="dxa" w:w="80"/>
+              <w:bottom w:type="dxa" w:w="40"/>
+              <w:right w:type="dxa" w:w="80"/>
+            </w:tcMar>
+            <w:vAlign w:val="center"/>
+          </w:tcPr>
+          <w:p>
+            <w:pPr>
+              <w:jc w:val="left"/>
+            </w:pPr>
+            <w:r>
+              <w:rPr>
+                <w:rFonts w:ascii="Times New Roman" w:cs="Times New Roman" w:eastAsia="Times New Roman" w:hAnsi="Times New Roman"/>
+                <w:b w:val="false"/>
+                <w:bCs w:val="false"/>
+                <w:sz w:val="22"/>
+                <w:szCs w:val="22"/>
+              </w:rPr>
+              <w:t xml:space="preserve">RQ4 Fidelity</w:t>
+            </w:r>
+          </w:p>
+        </w:tc>
+        <w:tc>
+          <w:tcPr>
+            <w:tcW w:type="dxa" w:w="3600"/>
+            <w:tcBorders>
+              <w:top w:val="single" w:color="000000" w:sz="4"/>
+              <w:left w:val="single" w:color="000000" w:sz="4"/>
+              <w:bottom w:val="single" w:color="000000" w:sz="4"/>
+              <w:right w:val="single" w:color="000000" w:sz="4"/>
+            </w:tcBorders>
+            <w:tcMar>
+              <w:top w:type="dxa" w:w="40"/>
+              <w:left w:type="dxa" w:w="80"/>
+              <w:bottom w:type="dxa" w:w="40"/>
+              <w:right w:type="dxa" w:w="80"/>
+            </w:tcMar>
+            <w:vAlign w:val="center"/>
+          </w:tcPr>
+          <w:p>
+            <w:pPr>
+              <w:jc w:val="left"/>
+            </w:pPr>
+            <w:r>
+              <w:rPr>
+                <w:rFonts w:ascii="Times New Roman" w:cs="Times New Roman" w:eastAsia="Times New Roman" w:hAnsi="Times New Roman"/>
+                <w:b w:val="false"/>
+                <w:bCs w:val="false"/>
+                <w:sz w:val="22"/>
+                <w:szCs w:val="22"/>
+              </w:rPr>
+              <w:t xml:space="preserve">MATLAB re-implementation and EMT model, Section 3.10</w:t>
+            </w:r>
+          </w:p>
+        </w:tc>
+        <w:tc>
+          <w:tcPr>
+            <w:tcW w:type="dxa" w:w="3006"/>
+            <w:tcBorders>
+              <w:top w:val="single" w:color="000000" w:sz="4"/>
+              <w:left w:val="single" w:color="000000" w:sz="4"/>
+              <w:bottom w:val="single" w:color="000000" w:sz="4"/>
+              <w:right w:val="single" w:color="000000" w:sz="4"/>
+            </w:tcBorders>
+            <w:tcMar>
+              <w:top w:type="dxa" w:w="40"/>
+              <w:left w:type="dxa" w:w="80"/>
+              <w:bottom w:type="dxa" w:w="40"/>
+              <w:right w:type="dxa" w:w="80"/>
+            </w:tcMar>
+            <w:vAlign w:val="center"/>
+          </w:tcPr>
+          <w:p>
+            <w:pPr>
+              <w:jc w:val="left"/>
+            </w:pPr>
+            <w:r>
+              <w:rPr>
+                <w:rFonts w:ascii="Times New Roman" w:cs="Times New Roman" w:eastAsia="Times New Roman" w:hAnsi="Times New Roman"/>
+                <w:b w:val="false"/>
+                <w:bCs w:val="false"/>
+                <w:sz w:val="22"/>
+                <w:szCs w:val="22"/>
+              </w:rPr>
+              <w:t xml:space="preserve">Section 4.3.5; Table 4.5</w:t>
+            </w:r>
+          </w:p>
+        </w:tc>
+      </w:tr>
+    </w:tbl>
+    <w:p>
+      <w:pPr>
+        <w:spacing w:after="160"/>
+      </w:pPr>
+    </w:p>
+    <w:p>
+      <w:pPr>
+        <w:pStyle w:val="Heading2"/>
+        <w:keepNext/>
+        <w:tabs>
+          <w:tab w:val="left" w:pos="900"/>
+        </w:tabs>
+        <w:spacing w:after="120" w:before="240" w:line="360"/>
+      </w:pPr>
+      <w:r>
+        <w:rPr>
+          <w:rFonts w:ascii="Times New Roman" w:cs="Times New Roman" w:eastAsia="Times New Roman" w:hAnsi="Times New Roman"/>
+          <w:b/>
+          <w:bCs/>
+          <w:sz w:val="28"/>
+          <w:szCs w:val="28"/>
+        </w:rPr>
+        <w:t xml:space="preserve">1.5	Scope and Limitations</w:t>
       </w:r>
     </w:p>
     <w:p>
@@ -763,7 +1523,7 @@
         <w:pStyle w:val="ListParagraph"/>
         <w:numPr>
           <w:ilvl w:val="0"/>
-          <w:numId w:val="3"/>
+          <w:numId w:val="4"/>
         </w:numPr>
         <w:spacing w:after="60" w:line="360"/>
         <w:jc w:val="both"/>
@@ -782,7 +1542,7 @@
         <w:pStyle w:val="ListParagraph"/>
         <w:numPr>
           <w:ilvl w:val="0"/>
-          <w:numId w:val="3"/>
+          <w:numId w:val="4"/>
         </w:numPr>
         <w:spacing w:after="60" w:line="360"/>
         <w:jc w:val="both"/>
@@ -801,7 +1561,7 @@
         <w:pStyle w:val="ListParagraph"/>
         <w:numPr>
           <w:ilvl w:val="0"/>
-          <w:numId w:val="3"/>
+          <w:numId w:val="4"/>
         </w:numPr>
         <w:spacing w:after="60" w:line="360"/>
         <w:jc w:val="both"/>
@@ -820,7 +1580,7 @@
         <w:pStyle w:val="ListParagraph"/>
         <w:numPr>
           <w:ilvl w:val="0"/>
-          <w:numId w:val="3"/>
+          <w:numId w:val="4"/>
         </w:numPr>
         <w:spacing w:after="60" w:line="360"/>
         <w:jc w:val="both"/>
@@ -839,7 +1599,7 @@
         <w:pStyle w:val="ListParagraph"/>
         <w:numPr>
           <w:ilvl w:val="0"/>
-          <w:numId w:val="3"/>
+          <w:numId w:val="4"/>
         </w:numPr>
         <w:spacing w:after="60" w:line="360"/>
         <w:jc w:val="both"/>
@@ -858,7 +1618,7 @@
         <w:pStyle w:val="ListParagraph"/>
         <w:numPr>
           <w:ilvl w:val="0"/>
-          <w:numId w:val="3"/>
+          <w:numId w:val="4"/>
         </w:numPr>
         <w:spacing w:after="60" w:line="360"/>
         <w:jc w:val="both"/>
@@ -889,7 +1649,7 @@
           <w:sz w:val="28"/>
           <w:szCs w:val="28"/>
         </w:rPr>
-        <w:t xml:space="preserve">1.5	Conception</w:t>
+        <w:t xml:space="preserve">1.6	Conception</w:t>
       </w:r>
     </w:p>
     <w:p>
@@ -985,7 +1745,7 @@
           <w:sz w:val="28"/>
           <w:szCs w:val="28"/>
         </w:rPr>
-        <w:t xml:space="preserve">1.6	Research Benefits</w:t>
+        <w:t xml:space="preserve">1.7	Research Benefits</w:t>
       </w:r>
     </w:p>
     <w:p>
@@ -1008,7 +1768,7 @@
         <w:pStyle w:val="ListParagraph"/>
         <w:numPr>
           <w:ilvl w:val="0"/>
-          <w:numId w:val="4"/>
+          <w:numId w:val="5"/>
         </w:numPr>
         <w:spacing w:after="60" w:line="360"/>
         <w:jc w:val="both"/>
@@ -1027,7 +1787,7 @@
         <w:pStyle w:val="ListParagraph"/>
         <w:numPr>
           <w:ilvl w:val="0"/>
-          <w:numId w:val="4"/>
+          <w:numId w:val="5"/>
         </w:numPr>
         <w:spacing w:after="60" w:line="360"/>
         <w:jc w:val="both"/>
@@ -1046,7 +1806,7 @@
         <w:pStyle w:val="ListParagraph"/>
         <w:numPr>
           <w:ilvl w:val="0"/>
-          <w:numId w:val="4"/>
+          <w:numId w:val="5"/>
         </w:numPr>
         <w:spacing w:after="60" w:line="360"/>
         <w:jc w:val="both"/>
@@ -1065,7 +1825,7 @@
         <w:pStyle w:val="ListParagraph"/>
         <w:numPr>
           <w:ilvl w:val="0"/>
-          <w:numId w:val="4"/>
+          <w:numId w:val="5"/>
         </w:numPr>
         <w:spacing w:after="60" w:line="360"/>
         <w:jc w:val="both"/>
@@ -8320,6 +9080,21 @@
     </w:p>
     <w:p>
       <w:pPr>
+        <w:spacing w:after="120" w:line="360"/>
+        <w:ind w:firstLine="720"/>
+        <w:jc w:val="both"/>
+      </w:pPr>
+      <w:r>
+        <w:rPr>
+          <w:rFonts w:ascii="Times New Roman" w:cs="Times New Roman" w:eastAsia="Times New Roman" w:hAnsi="Times New Roman"/>
+          <w:sz w:val="28"/>
+          <w:szCs w:val="28"/>
+        </w:rPr>
+        <w:t xml:space="preserve">The two studies are deliberately not identical, and their numbers should not be compared directly. Study 1 follows the limits of the authors' earlier work (RoCoF limit 2 Hz/s, operational band ±0.5 Hz, decisions every 20 ms) and measures regulation by IAE, ISE, ITAE and the reserved headroom, whereas Study 2 uses tighter limits suited to a small diesel-based system (RoCoF limit 1 Hz/s, frequency band ±0.2 Hz, decisions every 50 ms) and measures controllers by an objective return, BESS energy, saturation and infeasible-commitment time. Comparisons across the studies are therefore qualitative. The two are linked quantitatively in one place: the feasibility-rule comparison of Study 2 also applies the Study 1 limits to the Study 2 plant (Section 4.3.3).</w:t>
+      </w:r>
+    </w:p>
+    <w:p>
+      <w:pPr>
         <w:pStyle w:val="Heading2"/>
         <w:keepNext/>
         <w:tabs>
@@ -8471,7 +9246,7 @@
           <w:sz w:val="28"/>
           <w:szCs w:val="28"/>
         </w:rPr>
-        <w:t xml:space="preserve">with G_ref = 1000 W/m², C_T = 0.0045 °C⁻¹, T_ref = 25 °C, k_NOCT = 0.030 °C·m²/W and η_deg = 0.995 in Study 1. In Study 2 the plant is operated 15 % below its maximum power point (de-loaded MPPT), so that it delivers P_pv,0 = (1 − d)·P_MPP and holds a reserve d·P_MPP that can be released within 80 ms as fast frequency support.</w:t>
+        <w:t xml:space="preserve">with G_ref = 1000 W/m², C_T = 0.0045 °C⁻¹, T_ref = 25 °C, k_NOCT = 0.030 °C·m²/W and η_deg = 0.995 in Study 1. In Study 2 the plant is operated 15 % below its maximum power point (de-loaded MPPT), so that it delivers P_pv,0 = (1 − d)·P_MPP and holds a reserve d·P_MPP that can be released within 80 ms as fast frequency support. The same equations are used with the hourly NASA POWER irradiance and temperature, but with parameters typical of crystalline-silicon modules: k_NOCT = (NOCT − 20)/800 = 0.031 °C·m²/W for NOCT = 45 °C, C_T = 0.004 °C⁻¹ and a system derating of 0.90 in place of η_deg.</w:t>
       </w:r>
     </w:p>
     <w:p>
@@ -8577,7 +9352,7 @@
           <w:sz w:val="28"/>
           <w:szCs w:val="28"/>
         </w:rPr>
-        <w:t xml:space="preserve">with ρ = 1.225 kg/m³ and R = 18.9 m, which gives 500 kW at the rated speed of 11.5 m/s, an optimal tip-speed ratio of 8.10 and cut-in and cut-out speeds of 3 and 25 m/s. In Study 2, where the wind is hourly, a pitch-regulated IEC class III power curve with density correction is used (IEC 61400-12-1),</w:t>
+        <w:t xml:space="preserve">with ρ = 1.225 kg/m³ and R = 18.9 m, which gives 500 kW at the rated speed of 11.5 m/s, an optimal tip-speed ratio of 8.10 and cut-in and cut-out speeds of 3 and 25 m/s. The turbine also includes rotor inertia, an optimal-torque controller, a pitch controller that limits rotor over-speed and a converter lag, so that the measured 1-s wind is smoothed as in a real machine. In Study 2, where the wind is hourly, a pitch-regulated IEC class III power curve with density correction is used (IEC 61400-12-1),</w:t>
       </w:r>
     </w:p>
     <w:p>
@@ -9099,7 +9874,50 @@
           <w:sz w:val="28"/>
           <w:szCs w:val="28"/>
         </w:rPr>
-        <w:t xml:space="preserve">where P_b0 is the BESS power dispatched by a rule-based energy management system (EMS) that keeps the diesel near 60 % of its rating, the SoC-dependent limits taper linearly near the SoC bounds (0.10–0.95), and P_pv,s = α P_v is the PV share of the support. The model is integrated at 2 ms and frequency is measured through a 20 ms filter.</w:t>
+        <w:t xml:space="preserve">where P_b0 is the BESS power dispatched by a rule-based energy management system (EMS) that keeps the diesel near 60 % of its rating, the SoC-dependent limits taper linearly near the SoC bounds (0.10–0.95), and P_pv,s is the PV share of the support. The PV share follows the VSG power request through a first-order lag and is bounded by the de-loaded reserve and by the PV base output,</w:t>
+      </w:r>
+    </w:p>
+    <w:p>
+      <w:pPr>
+        <w:tabs>
+          <w:tab w:val="right" w:pos="8306"/>
+        </w:tabs>
+        <w:spacing w:after="80" w:before="80" w:line="300"/>
+        <w:ind w:left="720"/>
+        <w:jc w:val="left"/>
+      </w:pPr>
+      <w:r>
+        <w:rPr>
+          <w:rFonts w:ascii="Times New Roman" w:cs="Times New Roman" w:eastAsia="Times New Roman" w:hAnsi="Times New Roman"/>
+          <w:i/>
+          <w:iCs/>
+          <w:sz w:val="26"/>
+          <w:szCs w:val="26"/>
+        </w:rPr>
+        <w:t xml:space="preserve">T_pv dP_pv,s/dt = clip(α · P_v,req, −P_pv,0, d·P_MPP) − P_pv,s,     T_pv = 80 ms</w:t>
+      </w:r>
+      <w:r>
+        <w:rPr>
+          <w:rFonts w:ascii="Times New Roman" w:cs="Times New Roman" w:eastAsia="Times New Roman" w:hAnsi="Times New Roman"/>
+          <w:sz w:val="26"/>
+          <w:szCs w:val="26"/>
+        </w:rPr>
+        <w:t xml:space="preserve">	(3.16a)</w:t>
+      </w:r>
+    </w:p>
+    <w:p>
+      <w:pPr>
+        <w:spacing w:after="120" w:line="360"/>
+        <w:ind w:firstLine="720"/>
+        <w:jc w:val="both"/>
+      </w:pPr>
+      <w:r>
+        <w:rPr>
+          <w:rFonts w:ascii="Times New Roman" w:cs="Times New Roman" w:eastAsia="Times New Roman" w:hAnsi="Times New Roman"/>
+          <w:sz w:val="28"/>
+          <w:szCs w:val="28"/>
+        </w:rPr>
+        <w:t xml:space="preserve">so that the BESS supplies the remainder, P_b = P_b0 + P_v − P_pv,s. The model is integrated at 2 ms and frequency is measured through a 20 ms filter.</w:t>
       </w:r>
     </w:p>
     <w:p>
@@ -10800,6 +11618,1342 @@
     </w:p>
     <w:p>
       <w:pPr>
+        <w:pStyle w:val="Heading2"/>
+        <w:keepNext/>
+        <w:tabs>
+          <w:tab w:val="left" w:pos="900"/>
+        </w:tabs>
+        <w:spacing w:after="120" w:before="240" w:line="360"/>
+      </w:pPr>
+      <w:r>
+        <w:rPr>
+          <w:rFonts w:ascii="Times New Roman" w:cs="Times New Roman" w:eastAsia="Times New Roman" w:hAnsi="Times New Roman"/>
+          <w:b/>
+          <w:bCs/>
+          <w:sz w:val="28"/>
+          <w:szCs w:val="28"/>
+        </w:rPr>
+        <w:t xml:space="preserve">3.11	Implementation and Reproducibility</w:t>
+      </w:r>
+    </w:p>
+    <w:p>
+      <w:pPr>
+        <w:spacing w:after="120" w:line="360"/>
+        <w:ind w:firstLine="720"/>
+        <w:jc w:val="both"/>
+      </w:pPr>
+      <w:r>
+        <w:rPr>
+          <w:rFonts w:ascii="Times New Roman" w:cs="Times New Roman" w:eastAsia="Times New Roman" w:hAnsi="Times New Roman"/>
+          <w:sz w:val="28"/>
+          <w:szCs w:val="28"/>
+        </w:rPr>
+        <w:t xml:space="preserve">Both studies are implemented in Python with PyTorch and are version-controlled in the repository github.com/MuhammadBinyameenkhan/solar-wind-rl-estimation: Study 1 in the package vsg_rl (branch claude/funny-wright-4vhwhz) and Study 2, with the MATLAB and EMT validation, in the package vsgrl and the folder matlab (branch claude/determined-ptolemy-8ggnob). Table 3.2 maps each equation of this chapter to the code that implements it, so that every reported number can be traced and reproduced; both packages include unit tests of the models, the feasibility constraint and the agents.</w:t>
+      </w:r>
+    </w:p>
+    <w:p>
+      <w:pPr>
+        <w:keepNext/>
+        <w:spacing w:after="80" w:before="200"/>
+        <w:jc w:val="left"/>
+      </w:pPr>
+      <w:r>
+        <w:rPr>
+          <w:rFonts w:ascii="Times New Roman" w:cs="Times New Roman" w:eastAsia="Times New Roman" w:hAnsi="Times New Roman"/>
+          <w:sz w:val="26"/>
+          <w:szCs w:val="26"/>
+        </w:rPr>
+        <w:t xml:space="preserve">Table 3.2 Equations and their implementation</w:t>
+      </w:r>
+    </w:p>
+    <w:tbl>
+      <w:tblPr>
+        <w:tblW w:type="dxa" w:w="8306"/>
+        <w:tblBorders>
+          <w:top w:val="single" w:color="auto" w:sz="4"/>
+          <w:left w:val="single" w:color="auto" w:sz="4"/>
+          <w:bottom w:val="single" w:color="auto" w:sz="4"/>
+          <w:right w:val="single" w:color="auto" w:sz="4"/>
+          <w:insideH w:val="single" w:color="auto" w:sz="4"/>
+          <w:insideV w:val="single" w:color="auto" w:sz="4"/>
+        </w:tblBorders>
+      </w:tblPr>
+      <w:tblGrid>
+        <w:gridCol w:w="3000"/>
+        <w:gridCol w:w="800"/>
+        <w:gridCol w:w="4506"/>
+      </w:tblGrid>
+      <w:tr>
+        <w:trPr>
+          <w:cantSplit/>
+          <w:tblHeader/>
+        </w:trPr>
+        <w:tc>
+          <w:tcPr>
+            <w:tcW w:type="dxa" w:w="3000"/>
+            <w:tcBorders>
+              <w:top w:val="single" w:color="000000" w:sz="4"/>
+              <w:left w:val="single" w:color="000000" w:sz="4"/>
+              <w:bottom w:val="single" w:color="000000" w:sz="4"/>
+              <w:right w:val="single" w:color="000000" w:sz="4"/>
+            </w:tcBorders>
+            <w:shd w:fill="E8E8E8" w:color="auto" w:val="clear"/>
+            <w:tcMar>
+              <w:top w:type="dxa" w:w="40"/>
+              <w:left w:type="dxa" w:w="80"/>
+              <w:bottom w:type="dxa" w:w="40"/>
+              <w:right w:type="dxa" w:w="80"/>
+            </w:tcMar>
+            <w:vAlign w:val="center"/>
+          </w:tcPr>
+          <w:p>
+            <w:pPr>
+              <w:jc w:val="center"/>
+            </w:pPr>
+            <w:r>
+              <w:rPr>
+                <w:rFonts w:ascii="Times New Roman" w:cs="Times New Roman" w:eastAsia="Times New Roman" w:hAnsi="Times New Roman"/>
+                <w:b/>
+                <w:bCs/>
+                <w:sz w:val="20"/>
+                <w:szCs w:val="20"/>
+              </w:rPr>
+              <w:t xml:space="preserve">Equations</w:t>
+            </w:r>
+          </w:p>
+        </w:tc>
+        <w:tc>
+          <w:tcPr>
+            <w:tcW w:type="dxa" w:w="800"/>
+            <w:tcBorders>
+              <w:top w:val="single" w:color="000000" w:sz="4"/>
+              <w:left w:val="single" w:color="000000" w:sz="4"/>
+              <w:bottom w:val="single" w:color="000000" w:sz="4"/>
+              <w:right w:val="single" w:color="000000" w:sz="4"/>
+            </w:tcBorders>
+            <w:shd w:fill="E8E8E8" w:color="auto" w:val="clear"/>
+            <w:tcMar>
+              <w:top w:type="dxa" w:w="40"/>
+              <w:left w:type="dxa" w:w="80"/>
+              <w:bottom w:type="dxa" w:w="40"/>
+              <w:right w:type="dxa" w:w="80"/>
+            </w:tcMar>
+            <w:vAlign w:val="center"/>
+          </w:tcPr>
+          <w:p>
+            <w:pPr>
+              <w:jc w:val="center"/>
+            </w:pPr>
+            <w:r>
+              <w:rPr>
+                <w:rFonts w:ascii="Times New Roman" w:cs="Times New Roman" w:eastAsia="Times New Roman" w:hAnsi="Times New Roman"/>
+                <w:b/>
+                <w:bCs/>
+                <w:sz w:val="20"/>
+                <w:szCs w:val="20"/>
+              </w:rPr>
+              <w:t xml:space="preserve">Study</w:t>
+            </w:r>
+          </w:p>
+        </w:tc>
+        <w:tc>
+          <w:tcPr>
+            <w:tcW w:type="dxa" w:w="4506"/>
+            <w:tcBorders>
+              <w:top w:val="single" w:color="000000" w:sz="4"/>
+              <w:left w:val="single" w:color="000000" w:sz="4"/>
+              <w:bottom w:val="single" w:color="000000" w:sz="4"/>
+              <w:right w:val="single" w:color="000000" w:sz="4"/>
+            </w:tcBorders>
+            <w:shd w:fill="E8E8E8" w:color="auto" w:val="clear"/>
+            <w:tcMar>
+              <w:top w:type="dxa" w:w="40"/>
+              <w:left w:type="dxa" w:w="80"/>
+              <w:bottom w:type="dxa" w:w="40"/>
+              <w:right w:type="dxa" w:w="80"/>
+            </w:tcMar>
+            <w:vAlign w:val="center"/>
+          </w:tcPr>
+          <w:p>
+            <w:pPr>
+              <w:jc w:val="center"/>
+            </w:pPr>
+            <w:r>
+              <w:rPr>
+                <w:rFonts w:ascii="Times New Roman" w:cs="Times New Roman" w:eastAsia="Times New Roman" w:hAnsi="Times New Roman"/>
+                <w:b/>
+                <w:bCs/>
+                <w:sz w:val="20"/>
+                <w:szCs w:val="20"/>
+              </w:rPr>
+              <w:t xml:space="preserve">Implementation</w:t>
+            </w:r>
+          </w:p>
+        </w:tc>
+      </w:tr>
+      <w:tr>
+        <w:trPr>
+          <w:cantSplit/>
+          <w:tblHeader w:val="false"/>
+        </w:trPr>
+        <w:tc>
+          <w:tcPr>
+            <w:tcW w:type="dxa" w:w="3000"/>
+            <w:tcBorders>
+              <w:top w:val="single" w:color="000000" w:sz="4"/>
+              <w:left w:val="single" w:color="000000" w:sz="4"/>
+              <w:bottom w:val="single" w:color="000000" w:sz="4"/>
+              <w:right w:val="single" w:color="000000" w:sz="4"/>
+            </w:tcBorders>
+            <w:tcMar>
+              <w:top w:type="dxa" w:w="40"/>
+              <w:left w:type="dxa" w:w="80"/>
+              <w:bottom w:type="dxa" w:w="40"/>
+              <w:right w:type="dxa" w:w="80"/>
+            </w:tcMar>
+            <w:vAlign w:val="center"/>
+          </w:tcPr>
+          <w:p>
+            <w:pPr>
+              <w:jc w:val="left"/>
+            </w:pPr>
+            <w:r>
+              <w:rPr>
+                <w:rFonts w:ascii="Times New Roman" w:cs="Times New Roman" w:eastAsia="Times New Roman" w:hAnsi="Times New Roman"/>
+                <w:b w:val="false"/>
+                <w:bCs w:val="false"/>
+                <w:sz w:val="20"/>
+                <w:szCs w:val="20"/>
+              </w:rPr>
+              <w:t xml:space="preserve">(3.1)–(3.2) PV</w:t>
+            </w:r>
+          </w:p>
+        </w:tc>
+        <w:tc>
+          <w:tcPr>
+            <w:tcW w:type="dxa" w:w="800"/>
+            <w:tcBorders>
+              <w:top w:val="single" w:color="000000" w:sz="4"/>
+              <w:left w:val="single" w:color="000000" w:sz="4"/>
+              <w:bottom w:val="single" w:color="000000" w:sz="4"/>
+              <w:right w:val="single" w:color="000000" w:sz="4"/>
+            </w:tcBorders>
+            <w:tcMar>
+              <w:top w:type="dxa" w:w="40"/>
+              <w:left w:type="dxa" w:w="80"/>
+              <w:bottom w:type="dxa" w:w="40"/>
+              <w:right w:type="dxa" w:w="80"/>
+            </w:tcMar>
+            <w:vAlign w:val="center"/>
+          </w:tcPr>
+          <w:p>
+            <w:pPr>
+              <w:jc w:val="left"/>
+            </w:pPr>
+            <w:r>
+              <w:rPr>
+                <w:rFonts w:ascii="Times New Roman" w:cs="Times New Roman" w:eastAsia="Times New Roman" w:hAnsi="Times New Roman"/>
+                <w:b w:val="false"/>
+                <w:bCs w:val="false"/>
+                <w:sz w:val="20"/>
+                <w:szCs w:val="20"/>
+              </w:rPr>
+              <w:t xml:space="preserve">1 / 2</w:t>
+            </w:r>
+          </w:p>
+        </w:tc>
+        <w:tc>
+          <w:tcPr>
+            <w:tcW w:type="dxa" w:w="4506"/>
+            <w:tcBorders>
+              <w:top w:val="single" w:color="000000" w:sz="4"/>
+              <w:left w:val="single" w:color="000000" w:sz="4"/>
+              <w:bottom w:val="single" w:color="000000" w:sz="4"/>
+              <w:right w:val="single" w:color="000000" w:sz="4"/>
+            </w:tcBorders>
+            <w:tcMar>
+              <w:top w:type="dxa" w:w="40"/>
+              <w:left w:type="dxa" w:w="80"/>
+              <w:bottom w:type="dxa" w:w="40"/>
+              <w:right w:type="dxa" w:w="80"/>
+            </w:tcMar>
+            <w:vAlign w:val="center"/>
+          </w:tcPr>
+          <w:p>
+            <w:pPr>
+              <w:jc w:val="left"/>
+            </w:pPr>
+            <w:r>
+              <w:rPr>
+                <w:rFonts w:ascii="Times New Roman" w:cs="Times New Roman" w:eastAsia="Times New Roman" w:hAnsi="Times New Roman"/>
+                <w:b w:val="false"/>
+                <w:bCs w:val="false"/>
+                <w:sz w:val="20"/>
+                <w:szCs w:val="20"/>
+              </w:rPr>
+              <w:t xml:space="preserve">vsg_rl/models.py (SolarPV) / vsgrl/components/resources.py (pv_power_mw)</w:t>
+            </w:r>
+          </w:p>
+        </w:tc>
+      </w:tr>
+      <w:tr>
+        <w:trPr>
+          <w:cantSplit/>
+          <w:tblHeader w:val="false"/>
+        </w:trPr>
+        <w:tc>
+          <w:tcPr>
+            <w:tcW w:type="dxa" w:w="3000"/>
+            <w:tcBorders>
+              <w:top w:val="single" w:color="000000" w:sz="4"/>
+              <w:left w:val="single" w:color="000000" w:sz="4"/>
+              <w:bottom w:val="single" w:color="000000" w:sz="4"/>
+              <w:right w:val="single" w:color="000000" w:sz="4"/>
+            </w:tcBorders>
+            <w:tcMar>
+              <w:top w:type="dxa" w:w="40"/>
+              <w:left w:type="dxa" w:w="80"/>
+              <w:bottom w:type="dxa" w:w="40"/>
+              <w:right w:type="dxa" w:w="80"/>
+            </w:tcMar>
+            <w:vAlign w:val="center"/>
+          </w:tcPr>
+          <w:p>
+            <w:pPr>
+              <w:jc w:val="left"/>
+            </w:pPr>
+            <w:r>
+              <w:rPr>
+                <w:rFonts w:ascii="Times New Roman" w:cs="Times New Roman" w:eastAsia="Times New Roman" w:hAnsi="Times New Roman"/>
+                <w:b w:val="false"/>
+                <w:bCs w:val="false"/>
+                <w:sz w:val="20"/>
+                <w:szCs w:val="20"/>
+              </w:rPr>
+              <w:t xml:space="preserve">(3.3)–(3.4) wind turbine with rotor and pitch dynamics</w:t>
+            </w:r>
+          </w:p>
+        </w:tc>
+        <w:tc>
+          <w:tcPr>
+            <w:tcW w:type="dxa" w:w="800"/>
+            <w:tcBorders>
+              <w:top w:val="single" w:color="000000" w:sz="4"/>
+              <w:left w:val="single" w:color="000000" w:sz="4"/>
+              <w:bottom w:val="single" w:color="000000" w:sz="4"/>
+              <w:right w:val="single" w:color="000000" w:sz="4"/>
+            </w:tcBorders>
+            <w:tcMar>
+              <w:top w:type="dxa" w:w="40"/>
+              <w:left w:type="dxa" w:w="80"/>
+              <w:bottom w:type="dxa" w:w="40"/>
+              <w:right w:type="dxa" w:w="80"/>
+            </w:tcMar>
+            <w:vAlign w:val="center"/>
+          </w:tcPr>
+          <w:p>
+            <w:pPr>
+              <w:jc w:val="left"/>
+            </w:pPr>
+            <w:r>
+              <w:rPr>
+                <w:rFonts w:ascii="Times New Roman" w:cs="Times New Roman" w:eastAsia="Times New Roman" w:hAnsi="Times New Roman"/>
+                <w:b w:val="false"/>
+                <w:bCs w:val="false"/>
+                <w:sz w:val="20"/>
+                <w:szCs w:val="20"/>
+              </w:rPr>
+              <w:t xml:space="preserve">1</w:t>
+            </w:r>
+          </w:p>
+        </w:tc>
+        <w:tc>
+          <w:tcPr>
+            <w:tcW w:type="dxa" w:w="4506"/>
+            <w:tcBorders>
+              <w:top w:val="single" w:color="000000" w:sz="4"/>
+              <w:left w:val="single" w:color="000000" w:sz="4"/>
+              <w:bottom w:val="single" w:color="000000" w:sz="4"/>
+              <w:right w:val="single" w:color="000000" w:sz="4"/>
+            </w:tcBorders>
+            <w:tcMar>
+              <w:top w:type="dxa" w:w="40"/>
+              <w:left w:type="dxa" w:w="80"/>
+              <w:bottom w:type="dxa" w:w="40"/>
+              <w:right w:type="dxa" w:w="80"/>
+            </w:tcMar>
+            <w:vAlign w:val="center"/>
+          </w:tcPr>
+          <w:p>
+            <w:pPr>
+              <w:jc w:val="left"/>
+            </w:pPr>
+            <w:r>
+              <w:rPr>
+                <w:rFonts w:ascii="Times New Roman" w:cs="Times New Roman" w:eastAsia="Times New Roman" w:hAnsi="Times New Roman"/>
+                <w:b w:val="false"/>
+                <w:bCs w:val="false"/>
+                <w:sz w:val="20"/>
+                <w:szCs w:val="20"/>
+              </w:rPr>
+              <w:t xml:space="preserve">vsg_rl/models.py (WindTurbine)</w:t>
+            </w:r>
+          </w:p>
+        </w:tc>
+      </w:tr>
+      <w:tr>
+        <w:trPr>
+          <w:cantSplit/>
+          <w:tblHeader w:val="false"/>
+        </w:trPr>
+        <w:tc>
+          <w:tcPr>
+            <w:tcW w:type="dxa" w:w="3000"/>
+            <w:tcBorders>
+              <w:top w:val="single" w:color="000000" w:sz="4"/>
+              <w:left w:val="single" w:color="000000" w:sz="4"/>
+              <w:bottom w:val="single" w:color="000000" w:sz="4"/>
+              <w:right w:val="single" w:color="000000" w:sz="4"/>
+            </w:tcBorders>
+            <w:tcMar>
+              <w:top w:type="dxa" w:w="40"/>
+              <w:left w:type="dxa" w:w="80"/>
+              <w:bottom w:type="dxa" w:w="40"/>
+              <w:right w:type="dxa" w:w="80"/>
+            </w:tcMar>
+            <w:vAlign w:val="center"/>
+          </w:tcPr>
+          <w:p>
+            <w:pPr>
+              <w:jc w:val="left"/>
+            </w:pPr>
+            <w:r>
+              <w:rPr>
+                <w:rFonts w:ascii="Times New Roman" w:cs="Times New Roman" w:eastAsia="Times New Roman" w:hAnsi="Times New Roman"/>
+                <w:b w:val="false"/>
+                <w:bCs w:val="false"/>
+                <w:sz w:val="20"/>
+                <w:szCs w:val="20"/>
+              </w:rPr>
+              <w:t xml:space="preserve">(3.5) wind power curve</w:t>
+            </w:r>
+          </w:p>
+        </w:tc>
+        <w:tc>
+          <w:tcPr>
+            <w:tcW w:type="dxa" w:w="800"/>
+            <w:tcBorders>
+              <w:top w:val="single" w:color="000000" w:sz="4"/>
+              <w:left w:val="single" w:color="000000" w:sz="4"/>
+              <w:bottom w:val="single" w:color="000000" w:sz="4"/>
+              <w:right w:val="single" w:color="000000" w:sz="4"/>
+            </w:tcBorders>
+            <w:tcMar>
+              <w:top w:type="dxa" w:w="40"/>
+              <w:left w:type="dxa" w:w="80"/>
+              <w:bottom w:type="dxa" w:w="40"/>
+              <w:right w:type="dxa" w:w="80"/>
+            </w:tcMar>
+            <w:vAlign w:val="center"/>
+          </w:tcPr>
+          <w:p>
+            <w:pPr>
+              <w:jc w:val="left"/>
+            </w:pPr>
+            <w:r>
+              <w:rPr>
+                <w:rFonts w:ascii="Times New Roman" w:cs="Times New Roman" w:eastAsia="Times New Roman" w:hAnsi="Times New Roman"/>
+                <w:b w:val="false"/>
+                <w:bCs w:val="false"/>
+                <w:sz w:val="20"/>
+                <w:szCs w:val="20"/>
+              </w:rPr>
+              <w:t xml:space="preserve">2</w:t>
+            </w:r>
+          </w:p>
+        </w:tc>
+        <w:tc>
+          <w:tcPr>
+            <w:tcW w:type="dxa" w:w="4506"/>
+            <w:tcBorders>
+              <w:top w:val="single" w:color="000000" w:sz="4"/>
+              <w:left w:val="single" w:color="000000" w:sz="4"/>
+              <w:bottom w:val="single" w:color="000000" w:sz="4"/>
+              <w:right w:val="single" w:color="000000" w:sz="4"/>
+            </w:tcBorders>
+            <w:tcMar>
+              <w:top w:type="dxa" w:w="40"/>
+              <w:left w:type="dxa" w:w="80"/>
+              <w:bottom w:type="dxa" w:w="40"/>
+              <w:right w:type="dxa" w:w="80"/>
+            </w:tcMar>
+            <w:vAlign w:val="center"/>
+          </w:tcPr>
+          <w:p>
+            <w:pPr>
+              <w:jc w:val="left"/>
+            </w:pPr>
+            <w:r>
+              <w:rPr>
+                <w:rFonts w:ascii="Times New Roman" w:cs="Times New Roman" w:eastAsia="Times New Roman" w:hAnsi="Times New Roman"/>
+                <w:b w:val="false"/>
+                <w:bCs w:val="false"/>
+                <w:sz w:val="20"/>
+                <w:szCs w:val="20"/>
+              </w:rPr>
+              <w:t xml:space="preserve">vsgrl/components/resources.py (WindPowerCurve)</w:t>
+            </w:r>
+          </w:p>
+        </w:tc>
+      </w:tr>
+      <w:tr>
+        <w:trPr>
+          <w:cantSplit/>
+          <w:tblHeader w:val="false"/>
+        </w:trPr>
+        <w:tc>
+          <w:tcPr>
+            <w:tcW w:type="dxa" w:w="3000"/>
+            <w:tcBorders>
+              <w:top w:val="single" w:color="000000" w:sz="4"/>
+              <w:left w:val="single" w:color="000000" w:sz="4"/>
+              <w:bottom w:val="single" w:color="000000" w:sz="4"/>
+              <w:right w:val="single" w:color="000000" w:sz="4"/>
+            </w:tcBorders>
+            <w:tcMar>
+              <w:top w:type="dxa" w:w="40"/>
+              <w:left w:type="dxa" w:w="80"/>
+              <w:bottom w:type="dxa" w:w="40"/>
+              <w:right w:type="dxa" w:w="80"/>
+            </w:tcMar>
+            <w:vAlign w:val="center"/>
+          </w:tcPr>
+          <w:p>
+            <w:pPr>
+              <w:jc w:val="left"/>
+            </w:pPr>
+            <w:r>
+              <w:rPr>
+                <w:rFonts w:ascii="Times New Roman" w:cs="Times New Roman" w:eastAsia="Times New Roman" w:hAnsi="Times New Roman"/>
+                <w:b w:val="false"/>
+                <w:bCs w:val="false"/>
+                <w:sz w:val="20"/>
+                <w:szCs w:val="20"/>
+              </w:rPr>
+              <w:t xml:space="preserve">(3.6)–(3.11) VSG, droop, scheduling, voltage, PLL</w:t>
+            </w:r>
+          </w:p>
+        </w:tc>
+        <w:tc>
+          <w:tcPr>
+            <w:tcW w:type="dxa" w:w="800"/>
+            <w:tcBorders>
+              <w:top w:val="single" w:color="000000" w:sz="4"/>
+              <w:left w:val="single" w:color="000000" w:sz="4"/>
+              <w:bottom w:val="single" w:color="000000" w:sz="4"/>
+              <w:right w:val="single" w:color="000000" w:sz="4"/>
+            </w:tcBorders>
+            <w:tcMar>
+              <w:top w:type="dxa" w:w="40"/>
+              <w:left w:type="dxa" w:w="80"/>
+              <w:bottom w:type="dxa" w:w="40"/>
+              <w:right w:type="dxa" w:w="80"/>
+            </w:tcMar>
+            <w:vAlign w:val="center"/>
+          </w:tcPr>
+          <w:p>
+            <w:pPr>
+              <w:jc w:val="left"/>
+            </w:pPr>
+            <w:r>
+              <w:rPr>
+                <w:rFonts w:ascii="Times New Roman" w:cs="Times New Roman" w:eastAsia="Times New Roman" w:hAnsi="Times New Roman"/>
+                <w:b w:val="false"/>
+                <w:bCs w:val="false"/>
+                <w:sz w:val="20"/>
+                <w:szCs w:val="20"/>
+              </w:rPr>
+              <w:t xml:space="preserve">1</w:t>
+            </w:r>
+          </w:p>
+        </w:tc>
+        <w:tc>
+          <w:tcPr>
+            <w:tcW w:type="dxa" w:w="4506"/>
+            <w:tcBorders>
+              <w:top w:val="single" w:color="000000" w:sz="4"/>
+              <w:left w:val="single" w:color="000000" w:sz="4"/>
+              <w:bottom w:val="single" w:color="000000" w:sz="4"/>
+              <w:right w:val="single" w:color="000000" w:sz="4"/>
+            </w:tcBorders>
+            <w:tcMar>
+              <w:top w:type="dxa" w:w="40"/>
+              <w:left w:type="dxa" w:w="80"/>
+              <w:bottom w:type="dxa" w:w="40"/>
+              <w:right w:type="dxa" w:w="80"/>
+            </w:tcMar>
+            <w:vAlign w:val="center"/>
+          </w:tcPr>
+          <w:p>
+            <w:pPr>
+              <w:jc w:val="left"/>
+            </w:pPr>
+            <w:r>
+              <w:rPr>
+                <w:rFonts w:ascii="Times New Roman" w:cs="Times New Roman" w:eastAsia="Times New Roman" w:hAnsi="Times New Roman"/>
+                <w:b w:val="false"/>
+                <w:bCs w:val="false"/>
+                <w:sz w:val="20"/>
+                <w:szCs w:val="20"/>
+              </w:rPr>
+              <w:t xml:space="preserve">vsg_rl/env.py (step, _substep)</w:t>
+            </w:r>
+          </w:p>
+        </w:tc>
+      </w:tr>
+      <w:tr>
+        <w:trPr>
+          <w:cantSplit/>
+          <w:tblHeader w:val="false"/>
+        </w:trPr>
+        <w:tc>
+          <w:tcPr>
+            <w:tcW w:type="dxa" w:w="3000"/>
+            <w:tcBorders>
+              <w:top w:val="single" w:color="000000" w:sz="4"/>
+              <w:left w:val="single" w:color="000000" w:sz="4"/>
+              <w:bottom w:val="single" w:color="000000" w:sz="4"/>
+              <w:right w:val="single" w:color="000000" w:sz="4"/>
+            </w:tcBorders>
+            <w:tcMar>
+              <w:top w:type="dxa" w:w="40"/>
+              <w:left w:type="dxa" w:w="80"/>
+              <w:bottom w:type="dxa" w:w="40"/>
+              <w:right w:type="dxa" w:w="80"/>
+            </w:tcMar>
+            <w:vAlign w:val="center"/>
+          </w:tcPr>
+          <w:p>
+            <w:pPr>
+              <w:jc w:val="left"/>
+            </w:pPr>
+            <w:r>
+              <w:rPr>
+                <w:rFonts w:ascii="Times New Roman" w:cs="Times New Roman" w:eastAsia="Times New Roman" w:hAnsi="Times New Roman"/>
+                <w:b w:val="false"/>
+                <w:bCs w:val="false"/>
+                <w:sz w:val="20"/>
+                <w:szCs w:val="20"/>
+              </w:rPr>
+              <w:t xml:space="preserve">(3.12)–(3.16a) two-machine model, limits, PV share</w:t>
+            </w:r>
+          </w:p>
+        </w:tc>
+        <w:tc>
+          <w:tcPr>
+            <w:tcW w:type="dxa" w:w="800"/>
+            <w:tcBorders>
+              <w:top w:val="single" w:color="000000" w:sz="4"/>
+              <w:left w:val="single" w:color="000000" w:sz="4"/>
+              <w:bottom w:val="single" w:color="000000" w:sz="4"/>
+              <w:right w:val="single" w:color="000000" w:sz="4"/>
+            </w:tcBorders>
+            <w:tcMar>
+              <w:top w:type="dxa" w:w="40"/>
+              <w:left w:type="dxa" w:w="80"/>
+              <w:bottom w:type="dxa" w:w="40"/>
+              <w:right w:type="dxa" w:w="80"/>
+            </w:tcMar>
+            <w:vAlign w:val="center"/>
+          </w:tcPr>
+          <w:p>
+            <w:pPr>
+              <w:jc w:val="left"/>
+            </w:pPr>
+            <w:r>
+              <w:rPr>
+                <w:rFonts w:ascii="Times New Roman" w:cs="Times New Roman" w:eastAsia="Times New Roman" w:hAnsi="Times New Roman"/>
+                <w:b w:val="false"/>
+                <w:bCs w:val="false"/>
+                <w:sz w:val="20"/>
+                <w:szCs w:val="20"/>
+              </w:rPr>
+              <w:t xml:space="preserve">2</w:t>
+            </w:r>
+          </w:p>
+        </w:tc>
+        <w:tc>
+          <w:tcPr>
+            <w:tcW w:type="dxa" w:w="4506"/>
+            <w:tcBorders>
+              <w:top w:val="single" w:color="000000" w:sz="4"/>
+              <w:left w:val="single" w:color="000000" w:sz="4"/>
+              <w:bottom w:val="single" w:color="000000" w:sz="4"/>
+              <w:right w:val="single" w:color="000000" w:sz="4"/>
+            </w:tcBorders>
+            <w:tcMar>
+              <w:top w:type="dxa" w:w="40"/>
+              <w:left w:type="dxa" w:w="80"/>
+              <w:bottom w:type="dxa" w:w="40"/>
+              <w:right w:type="dxa" w:w="80"/>
+            </w:tcMar>
+            <w:vAlign w:val="center"/>
+          </w:tcPr>
+          <w:p>
+            <w:pPr>
+              <w:jc w:val="left"/>
+            </w:pPr>
+            <w:r>
+              <w:rPr>
+                <w:rFonts w:ascii="Times New Roman" w:cs="Times New Roman" w:eastAsia="Times New Roman" w:hAnsi="Times New Roman"/>
+                <w:b w:val="false"/>
+                <w:bCs w:val="false"/>
+                <w:sz w:val="20"/>
+                <w:szCs w:val="20"/>
+              </w:rPr>
+              <w:t xml:space="preserve">vsgrl/microgrid.py (reset, advance)</w:t>
+            </w:r>
+          </w:p>
+        </w:tc>
+      </w:tr>
+      <w:tr>
+        <w:trPr>
+          <w:cantSplit/>
+          <w:tblHeader w:val="false"/>
+        </w:trPr>
+        <w:tc>
+          <w:tcPr>
+            <w:tcW w:type="dxa" w:w="3000"/>
+            <w:tcBorders>
+              <w:top w:val="single" w:color="000000" w:sz="4"/>
+              <w:left w:val="single" w:color="000000" w:sz="4"/>
+              <w:bottom w:val="single" w:color="000000" w:sz="4"/>
+              <w:right w:val="single" w:color="000000" w:sz="4"/>
+            </w:tcBorders>
+            <w:tcMar>
+              <w:top w:type="dxa" w:w="40"/>
+              <w:left w:type="dxa" w:w="80"/>
+              <w:bottom w:type="dxa" w:w="40"/>
+              <w:right w:type="dxa" w:w="80"/>
+            </w:tcMar>
+            <w:vAlign w:val="center"/>
+          </w:tcPr>
+          <w:p>
+            <w:pPr>
+              <w:jc w:val="left"/>
+            </w:pPr>
+            <w:r>
+              <w:rPr>
+                <w:rFonts w:ascii="Times New Roman" w:cs="Times New Roman" w:eastAsia="Times New Roman" w:hAnsi="Times New Roman"/>
+                <w:b w:val="false"/>
+                <w:bCs w:val="false"/>
+                <w:sz w:val="20"/>
+                <w:szCs w:val="20"/>
+              </w:rPr>
+              <w:t xml:space="preserve">(3.17)–(3.19) headroom and proportional derating</w:t>
+            </w:r>
+          </w:p>
+        </w:tc>
+        <w:tc>
+          <w:tcPr>
+            <w:tcW w:type="dxa" w:w="800"/>
+            <w:tcBorders>
+              <w:top w:val="single" w:color="000000" w:sz="4"/>
+              <w:left w:val="single" w:color="000000" w:sz="4"/>
+              <w:bottom w:val="single" w:color="000000" w:sz="4"/>
+              <w:right w:val="single" w:color="000000" w:sz="4"/>
+            </w:tcBorders>
+            <w:tcMar>
+              <w:top w:type="dxa" w:w="40"/>
+              <w:left w:type="dxa" w:w="80"/>
+              <w:bottom w:type="dxa" w:w="40"/>
+              <w:right w:type="dxa" w:w="80"/>
+            </w:tcMar>
+            <w:vAlign w:val="center"/>
+          </w:tcPr>
+          <w:p>
+            <w:pPr>
+              <w:jc w:val="left"/>
+            </w:pPr>
+            <w:r>
+              <w:rPr>
+                <w:rFonts w:ascii="Times New Roman" w:cs="Times New Roman" w:eastAsia="Times New Roman" w:hAnsi="Times New Roman"/>
+                <w:b w:val="false"/>
+                <w:bCs w:val="false"/>
+                <w:sz w:val="20"/>
+                <w:szCs w:val="20"/>
+              </w:rPr>
+              <w:t xml:space="preserve">1</w:t>
+            </w:r>
+          </w:p>
+        </w:tc>
+        <w:tc>
+          <w:tcPr>
+            <w:tcW w:type="dxa" w:w="4506"/>
+            <w:tcBorders>
+              <w:top w:val="single" w:color="000000" w:sz="4"/>
+              <w:left w:val="single" w:color="000000" w:sz="4"/>
+              <w:bottom w:val="single" w:color="000000" w:sz="4"/>
+              <w:right w:val="single" w:color="000000" w:sz="4"/>
+            </w:tcBorders>
+            <w:tcMar>
+              <w:top w:type="dxa" w:w="40"/>
+              <w:left w:type="dxa" w:w="80"/>
+              <w:bottom w:type="dxa" w:w="40"/>
+              <w:right w:type="dxa" w:w="80"/>
+            </w:tcMar>
+            <w:vAlign w:val="center"/>
+          </w:tcPr>
+          <w:p>
+            <w:pPr>
+              <w:jc w:val="left"/>
+            </w:pPr>
+            <w:r>
+              <w:rPr>
+                <w:rFonts w:ascii="Times New Roman" w:cs="Times New Roman" w:eastAsia="Times New Roman" w:hAnsi="Times New Roman"/>
+                <w:b w:val="false"/>
+                <w:bCs w:val="false"/>
+                <w:sz w:val="20"/>
+                <w:szCs w:val="20"/>
+              </w:rPr>
+              <w:t xml:space="preserve">vsg_rl/env.py (_substep)</w:t>
+            </w:r>
+          </w:p>
+        </w:tc>
+      </w:tr>
+      <w:tr>
+        <w:trPr>
+          <w:cantSplit/>
+          <w:tblHeader w:val="false"/>
+        </w:trPr>
+        <w:tc>
+          <w:tcPr>
+            <w:tcW w:type="dxa" w:w="3000"/>
+            <w:tcBorders>
+              <w:top w:val="single" w:color="000000" w:sz="4"/>
+              <w:left w:val="single" w:color="000000" w:sz="4"/>
+              <w:bottom w:val="single" w:color="000000" w:sz="4"/>
+              <w:right w:val="single" w:color="000000" w:sz="4"/>
+            </w:tcBorders>
+            <w:tcMar>
+              <w:top w:type="dxa" w:w="40"/>
+              <w:left w:type="dxa" w:w="80"/>
+              <w:bottom w:type="dxa" w:w="40"/>
+              <w:right w:type="dxa" w:w="80"/>
+            </w:tcMar>
+            <w:vAlign w:val="center"/>
+          </w:tcPr>
+          <w:p>
+            <w:pPr>
+              <w:jc w:val="left"/>
+            </w:pPr>
+            <w:r>
+              <w:rPr>
+                <w:rFonts w:ascii="Times New Roman" w:cs="Times New Roman" w:eastAsia="Times New Roman" w:hAnsi="Times New Roman"/>
+                <w:b w:val="false"/>
+                <w:bCs w:val="false"/>
+                <w:sz w:val="20"/>
+                <w:szCs w:val="20"/>
+              </w:rPr>
+              <w:t xml:space="preserve">(3.20)–(3.21) direction-aware headroom, max rule, clip / scale</w:t>
+            </w:r>
+          </w:p>
+        </w:tc>
+        <w:tc>
+          <w:tcPr>
+            <w:tcW w:type="dxa" w:w="800"/>
+            <w:tcBorders>
+              <w:top w:val="single" w:color="000000" w:sz="4"/>
+              <w:left w:val="single" w:color="000000" w:sz="4"/>
+              <w:bottom w:val="single" w:color="000000" w:sz="4"/>
+              <w:right w:val="single" w:color="000000" w:sz="4"/>
+            </w:tcBorders>
+            <w:tcMar>
+              <w:top w:type="dxa" w:w="40"/>
+              <w:left w:type="dxa" w:w="80"/>
+              <w:bottom w:type="dxa" w:w="40"/>
+              <w:right w:type="dxa" w:w="80"/>
+            </w:tcMar>
+            <w:vAlign w:val="center"/>
+          </w:tcPr>
+          <w:p>
+            <w:pPr>
+              <w:jc w:val="left"/>
+            </w:pPr>
+            <w:r>
+              <w:rPr>
+                <w:rFonts w:ascii="Times New Roman" w:cs="Times New Roman" w:eastAsia="Times New Roman" w:hAnsi="Times New Roman"/>
+                <w:b w:val="false"/>
+                <w:bCs w:val="false"/>
+                <w:sz w:val="20"/>
+                <w:szCs w:val="20"/>
+              </w:rPr>
+              <w:t xml:space="preserve">2</w:t>
+            </w:r>
+          </w:p>
+        </w:tc>
+        <w:tc>
+          <w:tcPr>
+            <w:tcW w:type="dxa" w:w="4506"/>
+            <w:tcBorders>
+              <w:top w:val="single" w:color="000000" w:sz="4"/>
+              <w:left w:val="single" w:color="000000" w:sz="4"/>
+              <w:bottom w:val="single" w:color="000000" w:sz="4"/>
+              <w:right w:val="single" w:color="000000" w:sz="4"/>
+            </w:tcBorders>
+            <w:tcMar>
+              <w:top w:type="dxa" w:w="40"/>
+              <w:left w:type="dxa" w:w="80"/>
+              <w:bottom w:type="dxa" w:w="40"/>
+              <w:right w:type="dxa" w:w="80"/>
+            </w:tcMar>
+            <w:vAlign w:val="center"/>
+          </w:tcPr>
+          <w:p>
+            <w:pPr>
+              <w:jc w:val="left"/>
+            </w:pPr>
+            <w:r>
+              <w:rPr>
+                <w:rFonts w:ascii="Times New Roman" w:cs="Times New Roman" w:eastAsia="Times New Roman" w:hAnsi="Times New Roman"/>
+                <w:b w:val="false"/>
+                <w:bCs w:val="false"/>
+                <w:sz w:val="20"/>
+                <w:szCs w:val="20"/>
+              </w:rPr>
+              <w:t xml:space="preserve">vsgrl/microgrid.py (headroom_up/down); vsgrl/envs/vsg_env.py (param_bounds, project_params)</w:t>
+            </w:r>
+          </w:p>
+        </w:tc>
+      </w:tr>
+      <w:tr>
+        <w:trPr>
+          <w:cantSplit/>
+          <w:tblHeader w:val="false"/>
+        </w:trPr>
+        <w:tc>
+          <w:tcPr>
+            <w:tcW w:type="dxa" w:w="3000"/>
+            <w:tcBorders>
+              <w:top w:val="single" w:color="000000" w:sz="4"/>
+              <w:left w:val="single" w:color="000000" w:sz="4"/>
+              <w:bottom w:val="single" w:color="000000" w:sz="4"/>
+              <w:right w:val="single" w:color="000000" w:sz="4"/>
+            </w:tcBorders>
+            <w:tcMar>
+              <w:top w:type="dxa" w:w="40"/>
+              <w:left w:type="dxa" w:w="80"/>
+              <w:bottom w:type="dxa" w:w="40"/>
+              <w:right w:type="dxa" w:w="80"/>
+            </w:tcMar>
+            <w:vAlign w:val="center"/>
+          </w:tcPr>
+          <w:p>
+            <w:pPr>
+              <w:jc w:val="left"/>
+            </w:pPr>
+            <w:r>
+              <w:rPr>
+                <w:rFonts w:ascii="Times New Roman" w:cs="Times New Roman" w:eastAsia="Times New Roman" w:hAnsi="Times New Roman"/>
+                <w:b w:val="false"/>
+                <w:bCs w:val="false"/>
+                <w:sz w:val="20"/>
+                <w:szCs w:val="20"/>
+              </w:rPr>
+              <w:t xml:space="preserve">(3.22)–(3.23) residual action and cost</w:t>
+            </w:r>
+          </w:p>
+        </w:tc>
+        <w:tc>
+          <w:tcPr>
+            <w:tcW w:type="dxa" w:w="800"/>
+            <w:tcBorders>
+              <w:top w:val="single" w:color="000000" w:sz="4"/>
+              <w:left w:val="single" w:color="000000" w:sz="4"/>
+              <w:bottom w:val="single" w:color="000000" w:sz="4"/>
+              <w:right w:val="single" w:color="000000" w:sz="4"/>
+            </w:tcBorders>
+            <w:tcMar>
+              <w:top w:type="dxa" w:w="40"/>
+              <w:left w:type="dxa" w:w="80"/>
+              <w:bottom w:type="dxa" w:w="40"/>
+              <w:right w:type="dxa" w:w="80"/>
+            </w:tcMar>
+            <w:vAlign w:val="center"/>
+          </w:tcPr>
+          <w:p>
+            <w:pPr>
+              <w:jc w:val="left"/>
+            </w:pPr>
+            <w:r>
+              <w:rPr>
+                <w:rFonts w:ascii="Times New Roman" w:cs="Times New Roman" w:eastAsia="Times New Roman" w:hAnsi="Times New Roman"/>
+                <w:b w:val="false"/>
+                <w:bCs w:val="false"/>
+                <w:sz w:val="20"/>
+                <w:szCs w:val="20"/>
+              </w:rPr>
+              <w:t xml:space="preserve">2</w:t>
+            </w:r>
+          </w:p>
+        </w:tc>
+        <w:tc>
+          <w:tcPr>
+            <w:tcW w:type="dxa" w:w="4506"/>
+            <w:tcBorders>
+              <w:top w:val="single" w:color="000000" w:sz="4"/>
+              <w:left w:val="single" w:color="000000" w:sz="4"/>
+              <w:bottom w:val="single" w:color="000000" w:sz="4"/>
+              <w:right w:val="single" w:color="000000" w:sz="4"/>
+            </w:tcBorders>
+            <w:tcMar>
+              <w:top w:type="dxa" w:w="40"/>
+              <w:left w:type="dxa" w:w="80"/>
+              <w:bottom w:type="dxa" w:w="40"/>
+              <w:right w:type="dxa" w:w="80"/>
+            </w:tcMar>
+            <w:vAlign w:val="center"/>
+          </w:tcPr>
+          <w:p>
+            <w:pPr>
+              <w:jc w:val="left"/>
+            </w:pPr>
+            <w:r>
+              <w:rPr>
+                <w:rFonts w:ascii="Times New Roman" w:cs="Times New Roman" w:eastAsia="Times New Roman" w:hAnsi="Times New Roman"/>
+                <w:b w:val="false"/>
+                <w:bCs w:val="false"/>
+                <w:sz w:val="20"/>
+                <w:szCs w:val="20"/>
+              </w:rPr>
+              <w:t xml:space="preserve">vsgrl/envs/vsg_env.py (action_to_params, step_params)</w:t>
+            </w:r>
+          </w:p>
+        </w:tc>
+      </w:tr>
+      <w:tr>
+        <w:trPr>
+          <w:cantSplit/>
+          <w:tblHeader w:val="false"/>
+        </w:trPr>
+        <w:tc>
+          <w:tcPr>
+            <w:tcW w:type="dxa" w:w="3000"/>
+            <w:tcBorders>
+              <w:top w:val="single" w:color="000000" w:sz="4"/>
+              <w:left w:val="single" w:color="000000" w:sz="4"/>
+              <w:bottom w:val="single" w:color="000000" w:sz="4"/>
+              <w:right w:val="single" w:color="000000" w:sz="4"/>
+            </w:tcBorders>
+            <w:tcMar>
+              <w:top w:type="dxa" w:w="40"/>
+              <w:left w:type="dxa" w:w="80"/>
+              <w:bottom w:type="dxa" w:w="40"/>
+              <w:right w:type="dxa" w:w="80"/>
+            </w:tcMar>
+            <w:vAlign w:val="center"/>
+          </w:tcPr>
+          <w:p>
+            <w:pPr>
+              <w:jc w:val="left"/>
+            </w:pPr>
+            <w:r>
+              <w:rPr>
+                <w:rFonts w:ascii="Times New Roman" w:cs="Times New Roman" w:eastAsia="Times New Roman" w:hAnsi="Times New Roman"/>
+                <w:b w:val="false"/>
+                <w:bCs w:val="false"/>
+                <w:sz w:val="20"/>
+                <w:szCs w:val="20"/>
+              </w:rPr>
+              <w:t xml:space="preserve">(3.24) DDPG and TD3</w:t>
+            </w:r>
+          </w:p>
+        </w:tc>
+        <w:tc>
+          <w:tcPr>
+            <w:tcW w:type="dxa" w:w="800"/>
+            <w:tcBorders>
+              <w:top w:val="single" w:color="000000" w:sz="4"/>
+              <w:left w:val="single" w:color="000000" w:sz="4"/>
+              <w:bottom w:val="single" w:color="000000" w:sz="4"/>
+              <w:right w:val="single" w:color="000000" w:sz="4"/>
+            </w:tcBorders>
+            <w:tcMar>
+              <w:top w:type="dxa" w:w="40"/>
+              <w:left w:type="dxa" w:w="80"/>
+              <w:bottom w:type="dxa" w:w="40"/>
+              <w:right w:type="dxa" w:w="80"/>
+            </w:tcMar>
+            <w:vAlign w:val="center"/>
+          </w:tcPr>
+          <w:p>
+            <w:pPr>
+              <w:jc w:val="left"/>
+            </w:pPr>
+            <w:r>
+              <w:rPr>
+                <w:rFonts w:ascii="Times New Roman" w:cs="Times New Roman" w:eastAsia="Times New Roman" w:hAnsi="Times New Roman"/>
+                <w:b w:val="false"/>
+                <w:bCs w:val="false"/>
+                <w:sz w:val="20"/>
+                <w:szCs w:val="20"/>
+              </w:rPr>
+              <w:t xml:space="preserve">1 / 2</w:t>
+            </w:r>
+          </w:p>
+        </w:tc>
+        <w:tc>
+          <w:tcPr>
+            <w:tcW w:type="dxa" w:w="4506"/>
+            <w:tcBorders>
+              <w:top w:val="single" w:color="000000" w:sz="4"/>
+              <w:left w:val="single" w:color="000000" w:sz="4"/>
+              <w:bottom w:val="single" w:color="000000" w:sz="4"/>
+              <w:right w:val="single" w:color="000000" w:sz="4"/>
+            </w:tcBorders>
+            <w:tcMar>
+              <w:top w:type="dxa" w:w="40"/>
+              <w:left w:type="dxa" w:w="80"/>
+              <w:bottom w:type="dxa" w:w="40"/>
+              <w:right w:type="dxa" w:w="80"/>
+            </w:tcMar>
+            <w:vAlign w:val="center"/>
+          </w:tcPr>
+          <w:p>
+            <w:pPr>
+              <w:jc w:val="left"/>
+            </w:pPr>
+            <w:r>
+              <w:rPr>
+                <w:rFonts w:ascii="Times New Roman" w:cs="Times New Roman" w:eastAsia="Times New Roman" w:hAnsi="Times New Roman"/>
+                <w:b w:val="false"/>
+                <w:bCs w:val="false"/>
+                <w:sz w:val="20"/>
+                <w:szCs w:val="20"/>
+              </w:rPr>
+              <w:t xml:space="preserve">vsg_rl/agents.py / vsgrl/agents/td3.py</w:t>
+            </w:r>
+          </w:p>
+        </w:tc>
+      </w:tr>
+      <w:tr>
+        <w:trPr>
+          <w:cantSplit/>
+          <w:tblHeader w:val="false"/>
+        </w:trPr>
+        <w:tc>
+          <w:tcPr>
+            <w:tcW w:type="dxa" w:w="3000"/>
+            <w:tcBorders>
+              <w:top w:val="single" w:color="000000" w:sz="4"/>
+              <w:left w:val="single" w:color="000000" w:sz="4"/>
+              <w:bottom w:val="single" w:color="000000" w:sz="4"/>
+              <w:right w:val="single" w:color="000000" w:sz="4"/>
+            </w:tcBorders>
+            <w:tcMar>
+              <w:top w:type="dxa" w:w="40"/>
+              <w:left w:type="dxa" w:w="80"/>
+              <w:bottom w:type="dxa" w:w="40"/>
+              <w:right w:type="dxa" w:w="80"/>
+            </w:tcMar>
+            <w:vAlign w:val="center"/>
+          </w:tcPr>
+          <w:p>
+            <w:pPr>
+              <w:jc w:val="left"/>
+            </w:pPr>
+            <w:r>
+              <w:rPr>
+                <w:rFonts w:ascii="Times New Roman" w:cs="Times New Roman" w:eastAsia="Times New Roman" w:hAnsi="Times New Roman"/>
+                <w:b w:val="false"/>
+                <w:bCs w:val="false"/>
+                <w:sz w:val="20"/>
+                <w:szCs w:val="20"/>
+              </w:rPr>
+              <w:t xml:space="preserve">(3.25)–(3.26) metrics, statistics, oracle</w:t>
+            </w:r>
+          </w:p>
+        </w:tc>
+        <w:tc>
+          <w:tcPr>
+            <w:tcW w:type="dxa" w:w="800"/>
+            <w:tcBorders>
+              <w:top w:val="single" w:color="000000" w:sz="4"/>
+              <w:left w:val="single" w:color="000000" w:sz="4"/>
+              <w:bottom w:val="single" w:color="000000" w:sz="4"/>
+              <w:right w:val="single" w:color="000000" w:sz="4"/>
+            </w:tcBorders>
+            <w:tcMar>
+              <w:top w:type="dxa" w:w="40"/>
+              <w:left w:type="dxa" w:w="80"/>
+              <w:bottom w:type="dxa" w:w="40"/>
+              <w:right w:type="dxa" w:w="80"/>
+            </w:tcMar>
+            <w:vAlign w:val="center"/>
+          </w:tcPr>
+          <w:p>
+            <w:pPr>
+              <w:jc w:val="left"/>
+            </w:pPr>
+            <w:r>
+              <w:rPr>
+                <w:rFonts w:ascii="Times New Roman" w:cs="Times New Roman" w:eastAsia="Times New Roman" w:hAnsi="Times New Roman"/>
+                <w:b w:val="false"/>
+                <w:bCs w:val="false"/>
+                <w:sz w:val="20"/>
+                <w:szCs w:val="20"/>
+              </w:rPr>
+              <w:t xml:space="preserve">1 / 2</w:t>
+            </w:r>
+          </w:p>
+        </w:tc>
+        <w:tc>
+          <w:tcPr>
+            <w:tcW w:type="dxa" w:w="4506"/>
+            <w:tcBorders>
+              <w:top w:val="single" w:color="000000" w:sz="4"/>
+              <w:left w:val="single" w:color="000000" w:sz="4"/>
+              <w:bottom w:val="single" w:color="000000" w:sz="4"/>
+              <w:right w:val="single" w:color="000000" w:sz="4"/>
+            </w:tcBorders>
+            <w:tcMar>
+              <w:top w:type="dxa" w:w="40"/>
+              <w:left w:type="dxa" w:w="80"/>
+              <w:bottom w:type="dxa" w:w="40"/>
+              <w:right w:type="dxa" w:w="80"/>
+            </w:tcMar>
+            <w:vAlign w:val="center"/>
+          </w:tcPr>
+          <w:p>
+            <w:pPr>
+              <w:jc w:val="left"/>
+            </w:pPr>
+            <w:r>
+              <w:rPr>
+                <w:rFonts w:ascii="Times New Roman" w:cs="Times New Roman" w:eastAsia="Times New Roman" w:hAnsi="Times New Roman"/>
+                <w:b w:val="false"/>
+                <w:bCs w:val="false"/>
+                <w:sz w:val="20"/>
+                <w:szCs w:val="20"/>
+              </w:rPr>
+              <w:t xml:space="preserve">vsg_rl/evaluate.py / vsgrl/metrics.py, scripts/analyze.py, scripts/oracle_test.py</w:t>
+            </w:r>
+          </w:p>
+        </w:tc>
+      </w:tr>
+      <w:tr>
+        <w:trPr>
+          <w:cantSplit/>
+          <w:tblHeader w:val="false"/>
+        </w:trPr>
+        <w:tc>
+          <w:tcPr>
+            <w:tcW w:type="dxa" w:w="3000"/>
+            <w:tcBorders>
+              <w:top w:val="single" w:color="000000" w:sz="4"/>
+              <w:left w:val="single" w:color="000000" w:sz="4"/>
+              <w:bottom w:val="single" w:color="000000" w:sz="4"/>
+              <w:right w:val="single" w:color="000000" w:sz="4"/>
+            </w:tcBorders>
+            <w:tcMar>
+              <w:top w:type="dxa" w:w="40"/>
+              <w:left w:type="dxa" w:w="80"/>
+              <w:bottom w:type="dxa" w:w="40"/>
+              <w:right w:type="dxa" w:w="80"/>
+            </w:tcMar>
+            <w:vAlign w:val="center"/>
+          </w:tcPr>
+          <w:p>
+            <w:pPr>
+              <w:jc w:val="left"/>
+            </w:pPr>
+            <w:r>
+              <w:rPr>
+                <w:rFonts w:ascii="Times New Roman" w:cs="Times New Roman" w:eastAsia="Times New Roman" w:hAnsi="Times New Roman"/>
+                <w:b w:val="false"/>
+                <w:bCs w:val="false"/>
+                <w:sz w:val="20"/>
+                <w:szCs w:val="20"/>
+              </w:rPr>
+              <w:t xml:space="preserve">Validation (Section 3.10)</w:t>
+            </w:r>
+          </w:p>
+        </w:tc>
+        <w:tc>
+          <w:tcPr>
+            <w:tcW w:type="dxa" w:w="800"/>
+            <w:tcBorders>
+              <w:top w:val="single" w:color="000000" w:sz="4"/>
+              <w:left w:val="single" w:color="000000" w:sz="4"/>
+              <w:bottom w:val="single" w:color="000000" w:sz="4"/>
+              <w:right w:val="single" w:color="000000" w:sz="4"/>
+            </w:tcBorders>
+            <w:tcMar>
+              <w:top w:type="dxa" w:w="40"/>
+              <w:left w:type="dxa" w:w="80"/>
+              <w:bottom w:type="dxa" w:w="40"/>
+              <w:right w:type="dxa" w:w="80"/>
+            </w:tcMar>
+            <w:vAlign w:val="center"/>
+          </w:tcPr>
+          <w:p>
+            <w:pPr>
+              <w:jc w:val="left"/>
+            </w:pPr>
+            <w:r>
+              <w:rPr>
+                <w:rFonts w:ascii="Times New Roman" w:cs="Times New Roman" w:eastAsia="Times New Roman" w:hAnsi="Times New Roman"/>
+                <w:b w:val="false"/>
+                <w:bCs w:val="false"/>
+                <w:sz w:val="20"/>
+                <w:szCs w:val="20"/>
+              </w:rPr>
+              <w:t xml:space="preserve">2</w:t>
+            </w:r>
+          </w:p>
+        </w:tc>
+        <w:tc>
+          <w:tcPr>
+            <w:tcW w:type="dxa" w:w="4506"/>
+            <w:tcBorders>
+              <w:top w:val="single" w:color="000000" w:sz="4"/>
+              <w:left w:val="single" w:color="000000" w:sz="4"/>
+              <w:bottom w:val="single" w:color="000000" w:sz="4"/>
+              <w:right w:val="single" w:color="000000" w:sz="4"/>
+            </w:tcBorders>
+            <w:tcMar>
+              <w:top w:type="dxa" w:w="40"/>
+              <w:left w:type="dxa" w:w="80"/>
+              <w:bottom w:type="dxa" w:w="40"/>
+              <w:right w:type="dxa" w:w="80"/>
+            </w:tcMar>
+            <w:vAlign w:val="center"/>
+          </w:tcPr>
+          <w:p>
+            <w:pPr>
+              <w:jc w:val="left"/>
+            </w:pPr>
+            <w:r>
+              <w:rPr>
+                <w:rFonts w:ascii="Times New Roman" w:cs="Times New Roman" w:eastAsia="Times New Roman" w:hAnsi="Times New Roman"/>
+                <w:b w:val="false"/>
+                <w:bCs w:val="false"/>
+                <w:sz w:val="20"/>
+                <w:szCs w:val="20"/>
+              </w:rPr>
+              <w:t xml:space="preserve">matlab/sim (MATLAB model); matlab/simscape (EMT model)</w:t>
+            </w:r>
+          </w:p>
+        </w:tc>
+      </w:tr>
+    </w:tbl>
+    <w:p>
+      <w:pPr>
+        <w:spacing w:after="160"/>
+      </w:pPr>
+    </w:p>
+    <w:p>
+      <w:pPr>
         <w:pageBreakBefore/>
         <w:spacing w:after="240"/>
         <w:jc w:val="center"/>
@@ -24660,7 +26814,7 @@
         <w:pStyle w:val="ListParagraph"/>
         <w:numPr>
           <w:ilvl w:val="0"/>
-          <w:numId w:val="5"/>
+          <w:numId w:val="6"/>
         </w:numPr>
         <w:spacing w:after="60" w:line="360"/>
         <w:jc w:val="both"/>
@@ -24679,7 +26833,7 @@
         <w:pStyle w:val="ListParagraph"/>
         <w:numPr>
           <w:ilvl w:val="0"/>
-          <w:numId w:val="5"/>
+          <w:numId w:val="6"/>
         </w:numPr>
         <w:spacing w:after="60" w:line="360"/>
         <w:jc w:val="both"/>
@@ -24698,7 +26852,7 @@
         <w:pStyle w:val="ListParagraph"/>
         <w:numPr>
           <w:ilvl w:val="0"/>
-          <w:numId w:val="5"/>
+          <w:numId w:val="6"/>
         </w:numPr>
         <w:spacing w:after="60" w:line="360"/>
         <w:jc w:val="both"/>
@@ -24717,7 +26871,7 @@
         <w:pStyle w:val="ListParagraph"/>
         <w:numPr>
           <w:ilvl w:val="0"/>
-          <w:numId w:val="5"/>
+          <w:numId w:val="6"/>
         </w:numPr>
         <w:spacing w:after="60" w:line="360"/>
         <w:jc w:val="both"/>
@@ -24736,7 +26890,7 @@
         <w:pStyle w:val="ListParagraph"/>
         <w:numPr>
           <w:ilvl w:val="0"/>
-          <w:numId w:val="5"/>
+          <w:numId w:val="6"/>
         </w:numPr>
         <w:spacing w:after="60" w:line="360"/>
         <w:jc w:val="both"/>
@@ -30048,7 +32202,7 @@
         <w:pStyle w:val="ListParagraph"/>
         <w:numPr>
           <w:ilvl w:val="0"/>
-          <w:numId w:val="6"/>
+          <w:numId w:val="7"/>
         </w:numPr>
         <w:spacing w:after="60" w:line="360"/>
         <w:jc w:val="both"/>
@@ -30067,7 +32221,7 @@
         <w:pStyle w:val="ListParagraph"/>
         <w:numPr>
           <w:ilvl w:val="0"/>
-          <w:numId w:val="6"/>
+          <w:numId w:val="7"/>
         </w:numPr>
         <w:spacing w:after="60" w:line="360"/>
         <w:jc w:val="both"/>
@@ -30086,7 +32240,7 @@
         <w:pStyle w:val="ListParagraph"/>
         <w:numPr>
           <w:ilvl w:val="0"/>
-          <w:numId w:val="6"/>
+          <w:numId w:val="7"/>
         </w:numPr>
         <w:spacing w:after="60" w:line="360"/>
         <w:jc w:val="both"/>
@@ -31065,6 +33219,18 @@
       </w:pPr>
     </w:lvl>
   </w:abstractNum>
+  <w:abstractNum w:abstractNumId="8" w15:restartNumberingAfterBreak="0">
+    <w:multiLevelType w:val="hybridMultilevel"/>
+    <w:lvl w:ilvl="0" w15:tentative="1">
+      <w:start w:val="1"/>
+      <w:numFmt w:val="decimal"/>
+      <w:lvlText w:val="%1)"/>
+      <w:lvlJc w:val="left"/>
+      <w:pPr>
+        <w:ind w:left="1080" w:hanging="360"/>
+      </w:pPr>
+    </w:lvl>
+  </w:abstractNum>
   <w:num w:numId="1">
     <w:abstractNumId w:val="1"/>
     <w:lvlOverride w:ilvl="0">
@@ -31097,6 +33263,12 @@
   </w:num>
   <w:num w:numId="6">
     <w:abstractNumId w:val="7"/>
+    <w:lvlOverride w:ilvl="0">
+      <w:startOverride w:val="1"/>
+    </w:lvlOverride>
+  </w:num>
+  <w:num w:numId="7">
+    <w:abstractNumId w:val="8"/>
     <w:lvlOverride w:ilvl="0">
       <w:startOverride w:val="1"/>
     </w:lvlOverride>

</xml_diff>

<commit_message>
IREA manuscript in the Praise Worthy Prize template; missing-item checklists
- paper/make_irea_pwp.js -> IREA_manuscript_PWP.docx: two-column PWP layout
  copied from the authors' IREMOS manuscript (title block, abstract, II.1.
  headings, TABLE I captions, full-width figures, 8 pt references, Authors'
  information with affiliations, corresponding author and biographies)
- proposal: further missing items highlighted; checklist page in both files

Co-Authored-By: Claude Opus 5.5 <noreply@anthropic.com>
Claude-Session: https://claude.ai/code/session_01FcrrmkJTVMUBqnhfmaF7Pm
</commit_message>
<xml_diff>
--- a/paper/Thesis_Proposal_MB_Khan.docx
+++ b/paper/Thesis_Proposal_MB_Khan.docx
@@ -2,6 +2,207 @@
 <file path=word/document.xml><?xml version="1.0" encoding="utf-8"?>
 <w:document xmlns:wpc="http://schemas.microsoft.com/office/word/2010/wordprocessingCanvas" xmlns:mc="http://schemas.openxmlformats.org/markup-compatibility/2006" xmlns:o="urn:schemas-microsoft-com:office:office" xmlns:r="http://schemas.openxmlformats.org/officeDocument/2006/relationships" xmlns:m="http://schemas.openxmlformats.org/officeDocument/2006/math" xmlns:v="urn:schemas-microsoft-com:vml" xmlns:wp14="http://schemas.microsoft.com/office/word/2010/wordprocessingDrawing" xmlns:wp="http://schemas.openxmlformats.org/drawingml/2006/wordprocessingDrawing" xmlns:w10="urn:schemas-microsoft-com:office:word" xmlns:w="http://schemas.openxmlformats.org/wordprocessingml/2006/main" xmlns:w14="http://schemas.microsoft.com/office/word/2010/wordml" xmlns:w15="http://schemas.microsoft.com/office/word/2012/wordml" xmlns:wpg="http://schemas.microsoft.com/office/word/2010/wordprocessingGroup" xmlns:wpi="http://schemas.microsoft.com/office/word/2010/wordprocessingInk" xmlns:wne="http://schemas.microsoft.com/office/word/2006/wordml" xmlns:wps="http://schemas.microsoft.com/office/word/2010/wordprocessingShape" xmlns:cx="http://schemas.microsoft.com/office/drawing/2014/chartex" xmlns:cx1="http://schemas.microsoft.com/office/drawing/2015/9/8/chartex" xmlns:cx2="http://schemas.microsoft.com/office/drawing/2015/10/21/chartex" xmlns:cx3="http://schemas.microsoft.com/office/drawing/2016/5/9/chartex" xmlns:cx4="http://schemas.microsoft.com/office/drawing/2016/5/10/chartex" xmlns:cx5="http://schemas.microsoft.com/office/drawing/2016/5/11/chartex" xmlns:cx6="http://schemas.microsoft.com/office/drawing/2016/5/12/chartex" xmlns:cx7="http://schemas.microsoft.com/office/drawing/2016/5/13/chartex" xmlns:cx8="http://schemas.microsoft.com/office/drawing/2016/5/14/chartex" xmlns:aink="http://schemas.microsoft.com/office/drawing/2016/ink" xmlns:am3d="http://schemas.microsoft.com/office/drawing/2017/model3d" xmlns:w16cex="http://schemas.microsoft.com/office/word/2018/wordml/cex" xmlns:w16cid="http://schemas.microsoft.com/office/word/2016/wordml/cid" xmlns:w16="http://schemas.microsoft.com/office/word/2018/wordml" xmlns:w16sdtdh="http://schemas.microsoft.com/office/word/2020/wordml/sdtdatahash" xmlns:w16se="http://schemas.microsoft.com/office/word/2015/wordml/symex" mc:Ignorable="w14 w15 wp14">
   <w:body>
+    <w:p>
+      <w:pPr>
+        <w:spacing w:after="200"/>
+        <w:jc w:val="center"/>
+      </w:pPr>
+      <w:r>
+        <w:rPr>
+          <w:rFonts w:ascii="Times New Roman" w:cs="Times New Roman" w:eastAsia="Times New Roman" w:hAnsi="Times New Roman"/>
+          <w:b/>
+          <w:bCs/>
+          <w:i w:val="false"/>
+          <w:iCs w:val="false"/>
+          <w:sz w:val="28"/>
+          <w:szCs w:val="28"/>
+          <w:shd w:fill="FFFF00" w:color="auto" w:val="clear"/>
+        </w:rPr>
+        <w:t xml:space="preserve">CHECKLIST OF MISSING ITEMS (delete this page before submission)</w:t>
+      </w:r>
+    </w:p>
+    <w:p>
+      <w:pPr>
+        <w:spacing w:after="100" w:line="300"/>
+        <w:ind w:left="360" w:hanging="360"/>
+      </w:pPr>
+      <w:r>
+        <w:rPr>
+          <w:rFonts w:ascii="Times New Roman" w:cs="Times New Roman" w:eastAsia="Times New Roman" w:hAnsi="Times New Roman"/>
+          <w:b w:val="false"/>
+          <w:bCs w:val="false"/>
+          <w:i w:val="false"/>
+          <w:iCs w:val="false"/>
+          <w:sz w:val="24"/>
+          <w:szCs w:val="24"/>
+          <w:shd w:fill="FFFF00" w:color="auto" w:val="clear"/>
+        </w:rPr>
+        <w:t xml:space="preserve">1. Run the four PRISMA searches (Table 2.1): record the date and the hits per database, then fill every n = ____ in Fig. 2.1 and Section 2.2.</w:t>
+      </w:r>
+    </w:p>
+    <w:p>
+      <w:pPr>
+        <w:spacing w:after="100" w:line="300"/>
+        <w:ind w:left="360" w:hanging="360"/>
+      </w:pPr>
+      <w:r>
+        <w:rPr>
+          <w:rFonts w:ascii="Times New Roman" w:cs="Times New Roman" w:eastAsia="Times New Roman" w:hAnsi="Times New Roman"/>
+          <w:b w:val="false"/>
+          <w:bCs w:val="false"/>
+          <w:i w:val="false"/>
+          <w:iCs w:val="false"/>
+          <w:sz w:val="24"/>
+          <w:szCs w:val="24"/>
+          <w:shd w:fill="FFFF00" w:color="auto" w:val="clear"/>
+        </w:rPr>
+        <w:t xml:space="preserve">2. Confirm the degree title (Master of Engineering or M.Sc.) on the abstract page.</w:t>
+      </w:r>
+    </w:p>
+    <w:p>
+      <w:pPr>
+        <w:spacing w:after="100" w:line="300"/>
+        <w:ind w:left="360" w:hanging="360"/>
+      </w:pPr>
+      <w:r>
+        <w:rPr>
+          <w:rFonts w:ascii="Times New Roman" w:cs="Times New Roman" w:eastAsia="Times New Roman" w:hAnsi="Times New Roman"/>
+          <w:b w:val="false"/>
+          <w:bCs w:val="false"/>
+          <w:i w:val="false"/>
+          <w:iCs w:val="false"/>
+          <w:sz w:val="24"/>
+          <w:szCs w:val="24"/>
+          <w:shd w:fill="FFFF00" w:color="auto" w:val="clear"/>
+        </w:rPr>
+        <w:t xml:space="preserve">3. Add a citation for the Thailand renewable-energy statement in Section 1.2.</w:t>
+      </w:r>
+    </w:p>
+    <w:p>
+      <w:pPr>
+        <w:spacing w:after="100" w:line="300"/>
+        <w:ind w:left="360" w:hanging="360"/>
+      </w:pPr>
+      <w:r>
+        <w:rPr>
+          <w:rFonts w:ascii="Times New Roman" w:cs="Times New Roman" w:eastAsia="Times New Roman" w:hAnsi="Times New Roman"/>
+          <w:b w:val="false"/>
+          <w:bCs w:val="false"/>
+          <w:i w:val="false"/>
+          <w:iCs w:val="false"/>
+          <w:sz w:val="24"/>
+          <w:szCs w:val="24"/>
+          <w:shd w:fill="FFFF00" w:color="auto" w:val="clear"/>
+        </w:rPr>
+        <w:t xml:space="preserve">4. Cite the source of the 1 Hz/s and 0.2 Hz limits used in Study 2 (Section 3.6), or state that they are design choices.</w:t>
+      </w:r>
+    </w:p>
+    <w:p>
+      <w:pPr>
+        <w:spacing w:after="100" w:line="300"/>
+        <w:ind w:left="360" w:hanging="360"/>
+      </w:pPr>
+      <w:r>
+        <w:rPr>
+          <w:rFonts w:ascii="Times New Roman" w:cs="Times New Roman" w:eastAsia="Times New Roman" w:hAnsi="Times New Roman"/>
+          <w:b w:val="false"/>
+          <w:bCs w:val="false"/>
+          <w:i w:val="false"/>
+          <w:iCs w:val="false"/>
+          <w:sz w:val="24"/>
+          <w:szCs w:val="24"/>
+          <w:shd w:fill="FFFF00" w:color="auto" w:val="clear"/>
+        </w:rPr>
+        <w:t xml:space="preserve">5. Confirm the circuit-level (EMT) results with the Simscape Electrical model in MATLAB R2021a (Section 4.3.5).</w:t>
+      </w:r>
+    </w:p>
+    <w:p>
+      <w:pPr>
+        <w:spacing w:after="100" w:line="300"/>
+        <w:ind w:left="360" w:hanging="360"/>
+      </w:pPr>
+      <w:r>
+        <w:rPr>
+          <w:rFonts w:ascii="Times New Roman" w:cs="Times New Roman" w:eastAsia="Times New Roman" w:hAnsi="Times New Roman"/>
+          <w:b w:val="false"/>
+          <w:bCs w:val="false"/>
+          <w:i w:val="false"/>
+          <w:iCs w:val="false"/>
+          <w:sz w:val="24"/>
+          <w:szCs w:val="24"/>
+          <w:shd w:fill="FFFF00" w:color="auto" w:val="clear"/>
+        </w:rPr>
+        <w:t xml:space="preserve">6. Map months 1–12 of Table 5.1 to the academic calendar.</w:t>
+      </w:r>
+    </w:p>
+    <w:p>
+      <w:pPr>
+        <w:spacing w:after="100" w:line="300"/>
+        <w:ind w:left="360" w:hanging="360"/>
+      </w:pPr>
+      <w:r>
+        <w:rPr>
+          <w:rFonts w:ascii="Times New Roman" w:cs="Times New Roman" w:eastAsia="Times New Roman" w:hAnsi="Times New Roman"/>
+          <w:b w:val="false"/>
+          <w:bCs w:val="false"/>
+          <w:i w:val="false"/>
+          <w:iCs w:val="false"/>
+          <w:sz w:val="24"/>
+          <w:szCs w:val="24"/>
+          <w:shd w:fill="FFFF00" w:color="auto" w:val="clear"/>
+        </w:rPr>
+        <w:t xml:space="preserve">7. Update the status of the three manuscripts (Section 5.4 and Appendix) and attach them in the Appendix.</w:t>
+      </w:r>
+    </w:p>
+    <w:p>
+      <w:pPr>
+        <w:spacing w:after="100" w:line="300"/>
+        <w:ind w:left="360" w:hanging="360"/>
+      </w:pPr>
+      <w:r>
+        <w:rPr>
+          <w:rFonts w:ascii="Times New Roman" w:cs="Times New Roman" w:eastAsia="Times New Roman" w:hAnsi="Times New Roman"/>
+          <w:b w:val="false"/>
+          <w:bCs w:val="false"/>
+          <w:i w:val="false"/>
+          <w:iCs w:val="false"/>
+          <w:sz w:val="24"/>
+          <w:szCs w:val="24"/>
+          <w:shd w:fill="FFFF00" w:color="auto" w:val="clear"/>
+        </w:rPr>
+        <w:t xml:space="preserve">8. Check every reference against its DOI (docs/PROPOSAL_REFERENCES.md).</w:t>
+      </w:r>
+    </w:p>
+    <w:p>
+      <w:pPr>
+        <w:spacing w:after="100" w:line="300"/>
+        <w:ind w:left="360" w:hanging="360"/>
+      </w:pPr>
+      <w:r>
+        <w:rPr>
+          <w:rFonts w:ascii="Times New Roman" w:cs="Times New Roman" w:eastAsia="Times New Roman" w:hAnsi="Times New Roman"/>
+          <w:b w:val="false"/>
+          <w:bCs w:val="false"/>
+          <w:i w:val="false"/>
+          <w:iCs w:val="false"/>
+          <w:sz w:val="24"/>
+          <w:szCs w:val="24"/>
+          <w:shd w:fill="FFFF00" w:color="auto" w:val="clear"/>
+        </w:rPr>
+        <w:t xml:space="preserve">9. In Word, update the table of contents (click Yes when asked, or press F9 in the table).</w:t>
+      </w:r>
+    </w:p>
+    <w:p>
+      <w:pPr>
+        <w:sectPr>
+          <w:headerReference w:type="default" r:id="rId7"/>
+          <w:pgSz w:w="11906" w:h="16838" w:orient="portrait"/>
+          <w:pgMar w:top="2160" w:right="1440" w:bottom="1440" w:left="2160" w:header="720" w:footer="708" w:gutter="0"/>
+          <w:pgNumType/>
+          <w:docGrid w:linePitch="360"/>
+        </w:sectPr>
+      </w:pPr>
+    </w:p>
     <w:p>
       <w:pPr>
         <w:spacing w:before="600"/>
@@ -131,7 +332,7 @@
     <w:p>
       <w:pPr>
         <w:sectPr>
-          <w:headerReference w:type="default" r:id="rId7"/>
+          <w:headerReference w:type="default" r:id="rId8"/>
           <w:pgSz w:w="11906" w:h="16838" w:orient="portrait"/>
           <w:pgMar w:top="2160" w:right="1440" w:bottom="1440" w:left="2160" w:header="720" w:footer="708" w:gutter="0"/>
           <w:pgNumType/>
@@ -430,7 +631,7 @@
     <w:p>
       <w:pPr>
         <w:sectPr>
-          <w:headerReference w:type="default" r:id="rId8"/>
+          <w:headerReference w:type="default" r:id="rId9"/>
           <w:pgSz w:w="11906" w:h="16838" w:orient="portrait"/>
           <w:pgMar w:top="2160" w:right="1440" w:bottom="1440" w:left="2160" w:header="720" w:footer="708" w:gutter="0"/>
           <w:pgNumType w:start="1" w:fmt="upperRoman"/>
@@ -549,7 +750,28 @@
           <w:sz w:val="28"/>
           <w:szCs w:val="28"/>
         </w:rPr>
-        <w:t xml:space="preserve">Thailand, like many countries, is adding solar and wind capacity to reduce fuel imports and emissions, and remote communities, islands and industrial sites increasingly operate as hybrid microgrids in which a diesel generator, PV, wind and a BESS share the load. In such systems the frequency is set by very little rotating mass. A virtual synchronous generator on the BESS converter is the natural remedy, but three practical problems limit how it is designed today.</w:t>
+        <w:t xml:space="preserve">Thailand, like many countries, is adding solar and wind capacity to reduce fuel imports and emissions, and remote communities, islands and industrial sites increasingly operate as hybrid microgrids in which a diesel generator, PV, wind and a BESS share the load. </w:t>
+      </w:r>
+      <w:r>
+        <w:rPr>
+          <w:rFonts w:ascii="Times New Roman" w:cs="Times New Roman" w:eastAsia="Times New Roman" w:hAnsi="Times New Roman"/>
+          <w:b w:val="false"/>
+          <w:bCs w:val="false"/>
+          <w:i w:val="false"/>
+          <w:iCs w:val="false"/>
+          <w:sz w:val="28"/>
+          <w:szCs w:val="28"/>
+          <w:shd w:fill="FFFF00" w:color="auto" w:val="clear"/>
+        </w:rPr>
+        <w:t xml:space="preserve">[AUTHOR: add a citation with figures, e.g. Thailand's Power Development Plan or ERC/EGAT renewable statistics]</w:t>
+      </w:r>
+      <w:r>
+        <w:rPr>
+          <w:rFonts w:ascii="Times New Roman" w:cs="Times New Roman" w:eastAsia="Times New Roman" w:hAnsi="Times New Roman"/>
+          <w:sz w:val="28"/>
+          <w:szCs w:val="28"/>
+        </w:rPr>
+        <w:t xml:space="preserve"> In such systems the frequency is set by very little rotating mass. A virtual synchronous generator on the BESS converter is the natural remedy, but three practical problems limit how it is designed today.</w:t>
       </w:r>
     </w:p>
     <w:p>
@@ -1692,7 +1914,7 @@
                     </pic:cNvPicPr>
                   </pic:nvPicPr>
                   <pic:blipFill>
-                    <a:blip r:embed="rId10" cstate="none"/>
+                    <a:blip r:embed="rId11" cstate="none"/>
                     <a:srcRect/>
                     <a:stretch>
                       <a:fillRect/>
@@ -1940,6 +2162,24 @@
     </w:p>
     <w:p>
       <w:pPr>
+        <w:spacing w:before="120"/>
+      </w:pPr>
+      <w:r>
+        <w:rPr>
+          <w:rFonts w:ascii="Times New Roman" w:cs="Times New Roman" w:eastAsia="Times New Roman" w:hAnsi="Times New Roman"/>
+          <w:b w:val="false"/>
+          <w:bCs w:val="false"/>
+          <w:i w:val="false"/>
+          <w:iCs w:val="false"/>
+          <w:sz w:val="24"/>
+          <w:szCs w:val="24"/>
+          <w:shd w:fill="FFFF00" w:color="auto" w:val="clear"/>
+        </w:rPr>
+        <w:t xml:space="preserve">[AUTHOR: write the search date in the caption of Table 2.1]</w:t>
+      </w:r>
+    </w:p>
+    <w:p>
+      <w:pPr>
         <w:keepNext/>
         <w:spacing w:after="80" w:before="200"/>
         <w:jc w:val="left"/>
@@ -2405,7 +2645,7 @@
                     </pic:cNvPicPr>
                   </pic:nvPicPr>
                   <pic:blipFill>
-                    <a:blip r:embed="rId11" cstate="none"/>
+                    <a:blip r:embed="rId12" cstate="none"/>
                     <a:srcRect/>
                     <a:stretch>
                       <a:fillRect/>
@@ -10094,7 +10334,28 @@
           <w:sz w:val="28"/>
           <w:szCs w:val="28"/>
         </w:rPr>
-        <w:t xml:space="preserve">Second, because the RoCoF peaks immediately after a step, when the deviation is still near zero, and the deviation peaks at the nadir, when the RoCoF is zero, each mechanism is sized at its own peak (time-separated requirement), with Δf_band = 0.2 Hz and RoCoF_lim = 1 Hz/s:</w:t>
+        <w:t xml:space="preserve">Second, because the RoCoF peaks immediately after a step, when the deviation is still near zero, and the deviation peaks at the nadir, when the RoCoF is zero, each mechanism is sized at its own peak (time-separated requirement), with Δf_band = 0.2 Hz and RoCoF_lim = 1 Hz/s </w:t>
+      </w:r>
+      <w:r>
+        <w:rPr>
+          <w:rFonts w:ascii="Times New Roman" w:cs="Times New Roman" w:eastAsia="Times New Roman" w:hAnsi="Times New Roman"/>
+          <w:b w:val="false"/>
+          <w:bCs w:val="false"/>
+          <w:i w:val="false"/>
+          <w:iCs w:val="false"/>
+          <w:sz w:val="28"/>
+          <w:szCs w:val="28"/>
+          <w:shd w:fill="FFFF00" w:color="auto" w:val="clear"/>
+        </w:rPr>
+        <w:t xml:space="preserve">[AUTHOR: cite the grid-code or utility source for these limits (e.g. PEA/EGAT grid code) or state that they are design choices]</w:t>
+      </w:r>
+      <w:r>
+        <w:rPr>
+          <w:rFonts w:ascii="Times New Roman" w:cs="Times New Roman" w:eastAsia="Times New Roman" w:hAnsi="Times New Roman"/>
+          <w:sz w:val="28"/>
+          <w:szCs w:val="28"/>
+        </w:rPr>
+        <w:t xml:space="preserve">:</w:t>
       </w:r>
     </w:p>
     <w:p>
@@ -14717,7 +14978,7 @@
                     </pic:cNvPicPr>
                   </pic:nvPicPr>
                   <pic:blipFill>
-                    <a:blip r:embed="rId12" cstate="none"/>
+                    <a:blip r:embed="rId13" cstate="none"/>
                     <a:srcRect/>
                     <a:stretch>
                       <a:fillRect/>
@@ -14778,7 +15039,7 @@
                     </pic:cNvPicPr>
                   </pic:nvPicPr>
                   <pic:blipFill>
-                    <a:blip r:embed="rId13" cstate="none"/>
+                    <a:blip r:embed="rId14" cstate="none"/>
                     <a:srcRect/>
                     <a:stretch>
                       <a:fillRect/>
@@ -18238,7 +18499,7 @@
                     </pic:cNvPicPr>
                   </pic:nvPicPr>
                   <pic:blipFill>
-                    <a:blip r:embed="rId14" cstate="none"/>
+                    <a:blip r:embed="rId15" cstate="none"/>
                     <a:srcRect/>
                     <a:stretch>
                       <a:fillRect/>
@@ -18299,7 +18560,7 @@
                     </pic:cNvPicPr>
                   </pic:nvPicPr>
                   <pic:blipFill>
-                    <a:blip r:embed="rId15" cstate="none"/>
+                    <a:blip r:embed="rId16" cstate="none"/>
                     <a:srcRect/>
                     <a:stretch>
                       <a:fillRect/>
@@ -18433,7 +18694,7 @@
                     </pic:cNvPicPr>
                   </pic:nvPicPr>
                   <pic:blipFill>
-                    <a:blip r:embed="rId16" cstate="none"/>
+                    <a:blip r:embed="rId17" cstate="none"/>
                     <a:srcRect/>
                     <a:stretch>
                       <a:fillRect/>
@@ -19895,7 +20156,7 @@
                     </pic:cNvPicPr>
                   </pic:nvPicPr>
                   <pic:blipFill>
-                    <a:blip r:embed="rId17" cstate="none"/>
+                    <a:blip r:embed="rId18" cstate="none"/>
                     <a:srcRect/>
                     <a:stretch>
                       <a:fillRect/>
@@ -23399,7 +23660,7 @@
                     </pic:cNvPicPr>
                   </pic:nvPicPr>
                   <pic:blipFill>
-                    <a:blip r:embed="rId18" cstate="none"/>
+                    <a:blip r:embed="rId19" cstate="none"/>
                     <a:srcRect/>
                     <a:stretch>
                       <a:fillRect/>
@@ -25585,7 +25846,7 @@
                     </pic:cNvPicPr>
                   </pic:nvPicPr>
                   <pic:blipFill>
-                    <a:blip r:embed="rId19" cstate="none"/>
+                    <a:blip r:embed="rId20" cstate="none"/>
                     <a:srcRect/>
                     <a:stretch>
                       <a:fillRect/>
@@ -25646,7 +25907,7 @@
                     </pic:cNvPicPr>
                   </pic:nvPicPr>
                   <pic:blipFill>
-                    <a:blip r:embed="rId20" cstate="none"/>
+                    <a:blip r:embed="rId21" cstate="none"/>
                     <a:srcRect/>
                     <a:stretch>
                       <a:fillRect/>
@@ -26639,7 +26900,7 @@
                     </pic:cNvPicPr>
                   </pic:nvPicPr>
                   <pic:blipFill>
-                    <a:blip r:embed="rId21" cstate="none"/>
+                    <a:blip r:embed="rId22" cstate="none"/>
                     <a:srcRect/>
                     <a:stretch>
                       <a:fillRect/>
@@ -32195,6 +32456,25 @@
           <w:szCs w:val="28"/>
         </w:rPr>
         <w:t xml:space="preserve">5.4	Expected Publications</w:t>
+      </w:r>
+    </w:p>
+    <w:p>
+      <w:pPr>
+        <w:spacing w:after="120" w:line="360"/>
+        <w:jc w:val="both"/>
+      </w:pPr>
+      <w:r>
+        <w:rPr>
+          <w:rFonts w:ascii="Times New Roman" w:cs="Times New Roman" w:eastAsia="Times New Roman" w:hAnsi="Times New Roman"/>
+          <w:b w:val="false"/>
+          <w:bCs w:val="false"/>
+          <w:i w:val="false"/>
+          <w:iCs w:val="false"/>
+          <w:sz w:val="28"/>
+          <w:szCs w:val="28"/>
+          <w:shd w:fill="FFFF00" w:color="auto" w:val="clear"/>
+        </w:rPr>
+        <w:t xml:space="preserve">[AUTHOR: update the status of each manuscript (submitted / under review / accepted) before submission]</w:t>
       </w:r>
     </w:p>
     <w:p>
@@ -32925,7 +33205,7 @@
       </w:r>
     </w:p>
     <w:sectPr>
-      <w:headerReference w:type="default" r:id="rId9"/>
+      <w:headerReference w:type="default" r:id="rId10"/>
       <w:pgSz w:w="11906" w:h="16838" w:orient="portrait"/>
       <w:pgMar w:top="2160" w:right="1440" w:bottom="1440" w:left="2160" w:header="720" w:footer="708" w:gutter="0"/>
       <w:pgNumType w:start="1" w:fmt="decimal"/>
@@ -33021,6 +33301,12 @@
 
 <file path=word/header2.xml><?xml version="1.0" encoding="utf-8"?>
 <w:hdr xmlns:wpc="http://schemas.microsoft.com/office/word/2010/wordprocessingCanvas" xmlns:mc="http://schemas.openxmlformats.org/markup-compatibility/2006" xmlns:o="urn:schemas-microsoft-com:office:office" xmlns:r="http://schemas.openxmlformats.org/officeDocument/2006/relationships" xmlns:m="http://schemas.openxmlformats.org/officeDocument/2006/math" xmlns:v="urn:schemas-microsoft-com:vml" xmlns:wp14="http://schemas.microsoft.com/office/word/2010/wordprocessingDrawing" xmlns:wp="http://schemas.openxmlformats.org/drawingml/2006/wordprocessingDrawing" xmlns:w10="urn:schemas-microsoft-com:office:word" xmlns:w="http://schemas.openxmlformats.org/wordprocessingml/2006/main" xmlns:w14="http://schemas.microsoft.com/office/word/2010/wordml" xmlns:w15="http://schemas.microsoft.com/office/word/2012/wordml" xmlns:wpg="http://schemas.microsoft.com/office/word/2010/wordprocessingGroup" xmlns:wpi="http://schemas.microsoft.com/office/word/2010/wordprocessingInk" xmlns:wne="http://schemas.microsoft.com/office/word/2006/wordml" xmlns:wps="http://schemas.microsoft.com/office/word/2010/wordprocessingShape" xmlns:cx="http://schemas.microsoft.com/office/drawing/2014/chartex" xmlns:cx1="http://schemas.microsoft.com/office/drawing/2015/9/8/chartex" xmlns:cx2="http://schemas.microsoft.com/office/drawing/2015/10/21/chartex" xmlns:cx3="http://schemas.microsoft.com/office/drawing/2016/5/9/chartex" xmlns:cx4="http://schemas.microsoft.com/office/drawing/2016/5/10/chartex" xmlns:cx5="http://schemas.microsoft.com/office/drawing/2016/5/11/chartex" xmlns:cx6="http://schemas.microsoft.com/office/drawing/2016/5/12/chartex" xmlns:cx7="http://schemas.microsoft.com/office/drawing/2016/5/13/chartex" xmlns:cx8="http://schemas.microsoft.com/office/drawing/2016/5/14/chartex" xmlns:w16cid="http://schemas.microsoft.com/office/word/2016/wordml/cid" xmlns:w16se="http://schemas.microsoft.com/office/word/2015/wordml/symex">
+  <w:p/>
+</w:hdr>
+</file>
+
+<file path=word/header3.xml><?xml version="1.0" encoding="utf-8"?>
+<w:hdr xmlns:wpc="http://schemas.microsoft.com/office/word/2010/wordprocessingCanvas" xmlns:mc="http://schemas.openxmlformats.org/markup-compatibility/2006" xmlns:o="urn:schemas-microsoft-com:office:office" xmlns:r="http://schemas.openxmlformats.org/officeDocument/2006/relationships" xmlns:m="http://schemas.openxmlformats.org/officeDocument/2006/math" xmlns:v="urn:schemas-microsoft-com:vml" xmlns:wp14="http://schemas.microsoft.com/office/word/2010/wordprocessingDrawing" xmlns:wp="http://schemas.openxmlformats.org/drawingml/2006/wordprocessingDrawing" xmlns:w10="urn:schemas-microsoft-com:office:word" xmlns:w="http://schemas.openxmlformats.org/wordprocessingml/2006/main" xmlns:w14="http://schemas.microsoft.com/office/word/2010/wordml" xmlns:w15="http://schemas.microsoft.com/office/word/2012/wordml" xmlns:wpg="http://schemas.microsoft.com/office/word/2010/wordprocessingGroup" xmlns:wpi="http://schemas.microsoft.com/office/word/2010/wordprocessingInk" xmlns:wne="http://schemas.microsoft.com/office/word/2006/wordml" xmlns:wps="http://schemas.microsoft.com/office/word/2010/wordprocessingShape" xmlns:cx="http://schemas.microsoft.com/office/drawing/2014/chartex" xmlns:cx1="http://schemas.microsoft.com/office/drawing/2015/9/8/chartex" xmlns:cx2="http://schemas.microsoft.com/office/drawing/2015/10/21/chartex" xmlns:cx3="http://schemas.microsoft.com/office/drawing/2016/5/9/chartex" xmlns:cx4="http://schemas.microsoft.com/office/drawing/2016/5/10/chartex" xmlns:cx5="http://schemas.microsoft.com/office/drawing/2016/5/11/chartex" xmlns:cx6="http://schemas.microsoft.com/office/drawing/2016/5/12/chartex" xmlns:cx7="http://schemas.microsoft.com/office/drawing/2016/5/13/chartex" xmlns:cx8="http://schemas.microsoft.com/office/drawing/2016/5/14/chartex" xmlns:w16cid="http://schemas.microsoft.com/office/word/2016/wordml/cid" xmlns:w16se="http://schemas.microsoft.com/office/word/2015/wordml/symex">
   <w:p>
     <w:pPr>
       <w:jc w:val="right"/>
@@ -33040,7 +33326,7 @@
 </w:hdr>
 </file>
 
-<file path=word/header3.xml><?xml version="1.0" encoding="utf-8"?>
+<file path=word/header4.xml><?xml version="1.0" encoding="utf-8"?>
 <w:hdr xmlns:wpc="http://schemas.microsoft.com/office/word/2010/wordprocessingCanvas" xmlns:mc="http://schemas.openxmlformats.org/markup-compatibility/2006" xmlns:o="urn:schemas-microsoft-com:office:office" xmlns:r="http://schemas.openxmlformats.org/officeDocument/2006/relationships" xmlns:m="http://schemas.openxmlformats.org/officeDocument/2006/math" xmlns:v="urn:schemas-microsoft-com:vml" xmlns:wp14="http://schemas.microsoft.com/office/word/2010/wordprocessingDrawing" xmlns:wp="http://schemas.openxmlformats.org/drawingml/2006/wordprocessingDrawing" xmlns:w10="urn:schemas-microsoft-com:office:word" xmlns:w="http://schemas.openxmlformats.org/wordprocessingml/2006/main" xmlns:w14="http://schemas.microsoft.com/office/word/2010/wordml" xmlns:w15="http://schemas.microsoft.com/office/word/2012/wordml" xmlns:wpg="http://schemas.microsoft.com/office/word/2010/wordprocessingGroup" xmlns:wpi="http://schemas.microsoft.com/office/word/2010/wordprocessingInk" xmlns:wne="http://schemas.microsoft.com/office/word/2006/wordml" xmlns:wps="http://schemas.microsoft.com/office/word/2010/wordprocessingShape" xmlns:cx="http://schemas.microsoft.com/office/drawing/2014/chartex" xmlns:cx1="http://schemas.microsoft.com/office/drawing/2015/9/8/chartex" xmlns:cx2="http://schemas.microsoft.com/office/drawing/2015/10/21/chartex" xmlns:cx3="http://schemas.microsoft.com/office/drawing/2016/5/9/chartex" xmlns:cx4="http://schemas.microsoft.com/office/drawing/2016/5/10/chartex" xmlns:cx5="http://schemas.microsoft.com/office/drawing/2016/5/11/chartex" xmlns:cx6="http://schemas.microsoft.com/office/drawing/2016/5/12/chartex" xmlns:cx7="http://schemas.microsoft.com/office/drawing/2016/5/13/chartex" xmlns:cx8="http://schemas.microsoft.com/office/drawing/2016/5/14/chartex" xmlns:w16cid="http://schemas.microsoft.com/office/word/2016/wordml/cid" xmlns:w16se="http://schemas.microsoft.com/office/word/2015/wordml/symex">
   <w:p>
     <w:pPr>

</xml_diff>

<commit_message>
Proposal: add literature comparison from full texts (highlighted for review)
Adds evidence sentences in Section 1.2, reported results and fixed-bound
discussion in Sections 2.4-2.7, corrections and an Egbomwan (2025) row in
Table 2.4, new Table 2.5 (test conditions and reported results), Section 4.4
positioning paragraph with Table 4.6, and the Liyanage et al. (2026) review
reference. All additions are highlighted in yellow for the author's review.

Co-Authored-By: Claude Opus 5.5 <noreply@anthropic.com>
Claude-Session: https://claude.ai/code/session_01FcrrmkJTVMUBqnhfmaF7Pm
</commit_message>
<xml_diff>
--- a/paper/Thesis_Proposal_MB_Khan.docx
+++ b/paper/Thesis_Proposal_MB_Khan.docx
@@ -170,7 +170,26 @@
           <w:szCs w:val="24"/>
           <w:shd w:fill="FFFF00" w:color="auto" w:val="clear"/>
         </w:rPr>
-        <w:t xml:space="preserve">8. In Word, update the table of contents (click Yes when asked, or press F9 in the table).</w:t>
+        <w:t xml:space="preserve">8. Review the literature-comparison additions highlighted in yellow (Sections 1.2, 2.4, 2.5, 2.6, 2.7, 4.4; Tables 2.4, 2.5 and 4.6; reference Liyanage et al.) and remove the highlight from what you accept.</w:t>
+      </w:r>
+    </w:p>
+    <w:p>
+      <w:pPr>
+        <w:spacing w:after="100" w:line="300"/>
+        <w:ind w:left="360" w:hanging="360"/>
+      </w:pPr>
+      <w:r>
+        <w:rPr>
+          <w:rFonts w:ascii="Times New Roman" w:cs="Times New Roman" w:eastAsia="Times New Roman" w:hAnsi="Times New Roman"/>
+          <w:b w:val="false"/>
+          <w:bCs w:val="false"/>
+          <w:i w:val="false"/>
+          <w:iCs w:val="false"/>
+          <w:sz w:val="24"/>
+          <w:szCs w:val="24"/>
+          <w:shd w:fill="FFFF00" w:color="auto" w:val="clear"/>
+        </w:rPr>
+        <w:t xml:space="preserve">9. In Word, update the table of contents (click Yes when asked, or press F9 in the table).</w:t>
       </w:r>
     </w:p>
     <w:p>
@@ -768,6 +787,26 @@
           <w:szCs w:val="28"/>
         </w:rPr>
         <w:t xml:space="preserve">First, virtual inertia and damping are not free. Every second of virtual inertia and every unit of damping commits the converter to inject power in proportion to the RoCoF and to the frequency deviation. A battery that is already discharging to cover the evening peak, or one whose state of charge (SoC) is close to its limit, may not be able to deliver that power. Most adaptive VSG schemes in the literature, rule-based or learned, bound J and D only by fixed ranges and never check them against the power the converter has left (Alipoor et al., 2015; Li et al., 2017; Oboreh-Snapps et al., 2024). A controller that promises inertia it cannot deliver gives a false sense of security and saturates the converter exactly when it is needed.</w:t>
+      </w:r>
+    </w:p>
+    <w:p>
+      <w:pPr>
+        <w:spacing w:after="120" w:line="360"/>
+        <w:ind w:firstLine="720"/>
+        <w:jc w:val="both"/>
+      </w:pPr>
+      <w:r>
+        <w:rPr>
+          <w:rFonts w:ascii="Times New Roman" w:cs="Times New Roman" w:eastAsia="Times New Roman" w:hAnsi="Times New Roman"/>
+          <w:b w:val="false"/>
+          <w:bCs w:val="false"/>
+          <w:i w:val="false"/>
+          <w:iCs w:val="false"/>
+          <w:sz w:val="28"/>
+          <w:szCs w:val="28"/>
+          <w:shd w:fill="FFFF00" w:color="auto" w:val="clear"/>
+        </w:rPr>
+        <w:t xml:space="preserve">The margin is narrow in practice. Power converters tolerate only about 20–40 % overcurrent, whereas a synchronous generator can supply up to seven times its rated current (Qoria et al., 2020), and in the laboratory tests of Alipoor et al. (2015) a VSG with a fixed inertia exceeded its current limit after a 3.6 kW step in its power reference and was tripped at t = 1.43 s.</w:t>
       </w:r>
     </w:p>
     <w:p>
@@ -6208,6 +6247,26 @@
     </w:p>
     <w:p>
       <w:pPr>
+        <w:spacing w:after="120" w:line="360"/>
+        <w:ind w:firstLine="720"/>
+        <w:jc w:val="both"/>
+      </w:pPr>
+      <w:r>
+        <w:rPr>
+          <w:rFonts w:ascii="Times New Roman" w:cs="Times New Roman" w:eastAsia="Times New Roman" w:hAnsi="Times New Roman"/>
+          <w:b w:val="false"/>
+          <w:bCs w:val="false"/>
+          <w:i w:val="false"/>
+          <w:iCs w:val="false"/>
+          <w:sz w:val="28"/>
+          <w:szCs w:val="28"/>
+          <w:shd w:fill="FFFF00" w:color="auto" w:val="clear"/>
+        </w:rPr>
+        <w:t xml:space="preserve">The reported benefits of these rules are measured against constant-parameter VSGs. Li et al. (2017) reduce the frequency deviation after a 50 kW load shedding from about 0.75 Hz to 0.45 Hz, Shi et al. (2024) from 0.5 Hz to 0.2 Hz after a 15 kW power step, and Han et al. (2023) reduce the frequency dip after a 40 kW load step by 54.67 %. Han et al. (2023) confirm their scheme in a hardware-in-the-loop test and Alipoor et al. (2015) on a laboratory inverter; the other rule-based studies are simulation only (Table 2.5).</w:t>
+      </w:r>
+    </w:p>
+    <w:p>
+      <w:pPr>
         <w:pStyle w:val="Heading2"/>
         <w:keepNext/>
         <w:tabs>
@@ -6239,6 +6298,26 @@
           <w:szCs w:val="28"/>
         </w:rPr>
         <w:t xml:space="preserve">Deep reinforcement learning is attractive for VSG tuning because the mapping from the system state to good parameters is nonlinear and the actions are continuous (Glavic, 2019). DDPG (Lillicrap et al., 2016) and TD3 (Fujimoto et al., 2018), which corrects the value overestimation of DDPG, are the usual choices. Afifi et al. (2023) use DDPG to regulate droop, inertia and damping in an islanded microgrid; Lu and Zhuan (2024) tune inertia and damping with soft actor–critic and a settling-time reward; Egbomwan et al. (2023, 2025) apply TD3 and a learning-based predictive scheme to virtual inertia control; and Oboreh-Snapps et al. (2024) validate a TD3-based VSG on a real-time digital simulator. Criollo et al. (2026) compare DDPG, TD3 and soft actor–critic for microgrid clusters, and Li et al. (2026) benchmark a TD3-based adaptive VSG against fixed, rule-based, DDPG and RBF controllers. Comparisons between DDPG and TD3 therefore already exist; what is still missing is a check of the learned parameters against converter capability and an evaluation protocol that makes the reported gains trustworthy.</w:t>
+      </w:r>
+    </w:p>
+    <w:p>
+      <w:pPr>
+        <w:spacing w:after="120" w:line="360"/>
+        <w:ind w:firstLine="720"/>
+        <w:jc w:val="both"/>
+      </w:pPr>
+      <w:r>
+        <w:rPr>
+          <w:rFonts w:ascii="Times New Roman" w:cs="Times New Roman" w:eastAsia="Times New Roman" w:hAnsi="Times New Roman"/>
+          <w:b w:val="false"/>
+          <w:bCs w:val="false"/>
+          <w:i w:val="false"/>
+          <w:iCs w:val="false"/>
+          <w:sz w:val="28"/>
+          <w:szCs w:val="28"/>
+          <w:shd w:fill="FFFF00" w:color="auto" w:val="clear"/>
+        </w:rPr>
+        <w:t xml:space="preserve">The reported gains of the learning studies are large, but they are measured against weak references. Against a fixed VSG with default parameters, Lu and Zhuan (2024) report a 40 % lower maximum frequency deviation (0.35 Hz to 0.21 Hz) and Li et al. (2026) a 33 % lower one (1.00 Hz to 0.67 Hz) after a step in the active-power reference. Against PI or PID control, Egbomwan et al. (2023) report a 56.6 % lower mean absolute frequency error and Criollo et al. (2026) a 37.23 % lower RoCoF. Each result comes from a single trained agent evaluated on one to three disturbances, and only Li et al. (2026) tune a baseline, their rule-based controller, by grid search. Oboreh-Snapps et al. (2024) present their real-time results graphically, without numerical metrics (Table 2.5).</w:t>
       </w:r>
     </w:p>
     <w:p>
@@ -6293,6 +6372,26 @@
     </w:p>
     <w:p>
       <w:pPr>
+        <w:spacing w:after="120" w:line="360"/>
+        <w:ind w:firstLine="720"/>
+        <w:jc w:val="both"/>
+      </w:pPr>
+      <w:r>
+        <w:rPr>
+          <w:rFonts w:ascii="Times New Roman" w:cs="Times New Roman" w:eastAsia="Times New Roman" w:hAnsi="Times New Roman"/>
+          <w:b w:val="false"/>
+          <w:bCs w:val="false"/>
+          <w:i w:val="false"/>
+          <w:iCs w:val="false"/>
+          <w:sz w:val="28"/>
+          <w:szCs w:val="28"/>
+          <w:shd w:fill="FFFF00" w:color="auto" w:val="clear"/>
+        </w:rPr>
+        <w:t xml:space="preserve">Among the reviewed adaptive schemes, the closest to a capability check are fixed bounds. Shi et al. (2024) limit the inertia by the rated power, J ≤ P_max / max(ω dω/dt); Lu and Zhuan (2024) restrict J and D to a region derived from a damping-ratio range, with 20 ≤ D ≤ 50 for a 100 kW inverter; Egbomwan et al. (2025) pass the agent's action through a predictive safety filter with fixed lower and upper limits on the inertia power; and Han et al. (2023) reduce the inertia when the state of charge leaves the 20–90 % band. None of these limits changes with the power that the converter has already committed to the energy-management dispatch, which is the quantity tracked by the headroom constraint of this thesis.</w:t>
+      </w:r>
+    </w:p>
+    <w:p>
+      <w:pPr>
         <w:pStyle w:val="Heading2"/>
         <w:keepNext/>
         <w:tabs>
@@ -6324,6 +6423,26 @@
           <w:szCs w:val="28"/>
         </w:rPr>
         <w:t xml:space="preserve">Table 2.4 compares the reviewed studies on the aspects that matter for feasible synthetic inertia. Five gaps stand out: (i) the commanded inertia and damping are almost never checked against converter headroom; (ii) learned controllers are rarely compared with tuned baselines over several seeds; (iii) no study bounds in advance how much adaptation can gain; (iv) systems in which a synchronous machine shares the transient with the VSG are rarely considered together with learning; and (v) learned VSG schedules are seldom validated at circuit level. The proposed framework addresses all five.</w:t>
+      </w:r>
+    </w:p>
+    <w:p>
+      <w:pPr>
+        <w:spacing w:after="120" w:line="360"/>
+        <w:ind w:firstLine="720"/>
+        <w:jc w:val="both"/>
+      </w:pPr>
+      <w:r>
+        <w:rPr>
+          <w:rFonts w:ascii="Times New Roman" w:cs="Times New Roman" w:eastAsia="Times New Roman" w:hAnsi="Times New Roman"/>
+          <w:b w:val="false"/>
+          <w:bCs w:val="false"/>
+          <w:i w:val="false"/>
+          <w:iCs w:val="false"/>
+          <w:sz w:val="28"/>
+          <w:szCs w:val="28"/>
+          <w:shd w:fill="FFFF00" w:color="auto" w:val="clear"/>
+        </w:rPr>
+        <w:t xml:space="preserve">A full-text check of the eleven external studies in Table 2.4 quantifies these gaps (Table 2.5). None reports results over several training seeds or a significance test; none drives its tests with measured or reanalysis weather data; and none bounds the attainable gain before training. Four model a synchronous generator in at least one test case (Alipoor et al., 2015; Afifi et al., 2023; Egbomwan et al., 2025; Criollo et al., 2026), and three go beyond software simulation, with a laboratory inverter (Alipoor et al., 2015), hardware-in-the-loop (Han et al., 2023) or a real-time digital simulator (Oboreh-Snapps et al., 2024). A recent review of RL-based virtual-inertia control likewise notes that few studies integrate classical stability analysis into reinforcement learning (Liyanage et al., 2026).</w:t>
       </w:r>
     </w:p>
     <w:p>
@@ -6750,6 +6869,7 @@
               <w:bottom w:val="single" w:color="000000" w:sz="4"/>
               <w:right w:val="single" w:color="000000" w:sz="4"/>
             </w:tcBorders>
+            <w:shd w:fill="FFFF00" w:color="auto" w:val="clear"/>
             <w:tcMar>
               <w:top w:type="dxa" w:w="40"/>
               <w:left w:type="dxa" w:w="80"/>
@@ -6770,7 +6890,7 @@
                 <w:sz w:val="21"/>
                 <w:szCs w:val="21"/>
               </w:rPr>
-              <w:t xml:space="preserve">–</w:t>
+              <w:t xml:space="preserve">✓ (lab inverter)</w:t>
             </w:r>
           </w:p>
         </w:tc>
@@ -7158,6 +7278,7 @@
               <w:bottom w:val="single" w:color="000000" w:sz="4"/>
               <w:right w:val="single" w:color="000000" w:sz="4"/>
             </w:tcBorders>
+            <w:shd w:fill="FFFF00" w:color="auto" w:val="clear"/>
             <w:tcMar>
               <w:top w:type="dxa" w:w="40"/>
               <w:left w:type="dxa" w:w="80"/>
@@ -7178,7 +7299,7 @@
                 <w:sz w:val="21"/>
                 <w:szCs w:val="21"/>
               </w:rPr>
-              <w:t xml:space="preserve">–</w:t>
+              <w:t xml:space="preserve">✓ (HIL)</w:t>
             </w:r>
           </w:p>
         </w:tc>
@@ -7296,6 +7417,7 @@
               <w:bottom w:val="single" w:color="000000" w:sz="4"/>
               <w:right w:val="single" w:color="000000" w:sz="4"/>
             </w:tcBorders>
+            <w:shd w:fill="FFFF00" w:color="auto" w:val="clear"/>
             <w:tcMar>
               <w:top w:type="dxa" w:w="40"/>
               <w:left w:type="dxa" w:w="80"/>
@@ -7316,7 +7438,7 @@
                 <w:sz w:val="21"/>
                 <w:szCs w:val="21"/>
               </w:rPr>
-              <w:t xml:space="preserve">–</w:t>
+              <w:t xml:space="preserve">static J bound (rated power)</w:t>
             </w:r>
           </w:p>
         </w:tc>
@@ -7704,6 +7826,7 @@
               <w:bottom w:val="single" w:color="000000" w:sz="4"/>
               <w:right w:val="single" w:color="000000" w:sz="4"/>
             </w:tcBorders>
+            <w:shd w:fill="FFFF00" w:color="auto" w:val="clear"/>
             <w:tcMar>
               <w:top w:type="dxa" w:w="40"/>
               <w:left w:type="dxa" w:w="80"/>
@@ -7724,7 +7847,7 @@
                 <w:sz w:val="21"/>
                 <w:szCs w:val="21"/>
               </w:rPr>
-              <w:t xml:space="preserve">–</w:t>
+              <w:t xml:space="preserve">fixed J–D region</w:t>
             </w:r>
           </w:p>
         </w:tc>
@@ -8217,6 +8340,7 @@
               <w:bottom w:val="single" w:color="000000" w:sz="4"/>
               <w:right w:val="single" w:color="000000" w:sz="4"/>
             </w:tcBorders>
+            <w:shd w:fill="FFFF00" w:color="auto" w:val="clear"/>
             <w:tcMar>
               <w:top w:type="dxa" w:w="40"/>
               <w:left w:type="dxa" w:w="80"/>
@@ -8237,7 +8361,7 @@
                 <w:sz w:val="21"/>
                 <w:szCs w:val="21"/>
               </w:rPr>
-              <w:t xml:space="preserve">Criollo et al. (2026)</w:t>
+              <w:t xml:space="preserve">Egbomwan et al. (2025)</w:t>
             </w:r>
           </w:p>
         </w:tc>
@@ -8250,6 +8374,7 @@
               <w:bottom w:val="single" w:color="000000" w:sz="4"/>
               <w:right w:val="single" w:color="000000" w:sz="4"/>
             </w:tcBorders>
+            <w:shd w:fill="FFFF00" w:color="auto" w:val="clear"/>
             <w:tcMar>
               <w:top w:type="dxa" w:w="40"/>
               <w:left w:type="dxa" w:w="80"/>
@@ -8270,7 +8395,7 @@
                 <w:sz w:val="21"/>
                 <w:szCs w:val="21"/>
               </w:rPr>
-              <w:t xml:space="preserve">DDPG, TD3, SAC</w:t>
+              <w:t xml:space="preserve">PINN + TD3 + safety filter</w:t>
             </w:r>
           </w:p>
         </w:tc>
@@ -8283,6 +8408,7 @@
               <w:bottom w:val="single" w:color="000000" w:sz="4"/>
               <w:right w:val="single" w:color="000000" w:sz="4"/>
             </w:tcBorders>
+            <w:shd w:fill="FFFF00" w:color="auto" w:val="clear"/>
             <w:tcMar>
               <w:top w:type="dxa" w:w="40"/>
               <w:left w:type="dxa" w:w="80"/>
@@ -8303,7 +8429,7 @@
                 <w:sz w:val="21"/>
                 <w:szCs w:val="21"/>
               </w:rPr>
-              <w:t xml:space="preserve">J, D</w:t>
+              <w:t xml:space="preserve">inertia power</w:t>
             </w:r>
           </w:p>
         </w:tc>
@@ -8316,6 +8442,7 @@
               <w:bottom w:val="single" w:color="000000" w:sz="4"/>
               <w:right w:val="single" w:color="000000" w:sz="4"/>
             </w:tcBorders>
+            <w:shd w:fill="FFFF00" w:color="auto" w:val="clear"/>
             <w:tcMar>
               <w:top w:type="dxa" w:w="40"/>
               <w:left w:type="dxa" w:w="80"/>
@@ -8336,7 +8463,7 @@
                 <w:sz w:val="21"/>
                 <w:szCs w:val="21"/>
               </w:rPr>
-              <w:t xml:space="preserve">–</w:t>
+              <w:t xml:space="preserve">fixed power bounds</w:t>
             </w:r>
           </w:p>
         </w:tc>
@@ -8349,6 +8476,7 @@
               <w:bottom w:val="single" w:color="000000" w:sz="4"/>
               <w:right w:val="single" w:color="000000" w:sz="4"/>
             </w:tcBorders>
+            <w:shd w:fill="FFFF00" w:color="auto" w:val="clear"/>
             <w:tcMar>
               <w:top w:type="dxa" w:w="40"/>
               <w:left w:type="dxa" w:w="80"/>
@@ -8382,6 +8510,7 @@
               <w:bottom w:val="single" w:color="000000" w:sz="4"/>
               <w:right w:val="single" w:color="000000" w:sz="4"/>
             </w:tcBorders>
+            <w:shd w:fill="FFFF00" w:color="auto" w:val="clear"/>
             <w:tcMar>
               <w:top w:type="dxa" w:w="40"/>
               <w:left w:type="dxa" w:w="80"/>
@@ -8441,7 +8570,7 @@
                 <w:sz w:val="21"/>
                 <w:szCs w:val="21"/>
               </w:rPr>
-              <w:t xml:space="preserve">Li et al. (2026)</w:t>
+              <w:t xml:space="preserve">Criollo et al. (2026)</w:t>
             </w:r>
           </w:p>
         </w:tc>
@@ -8474,7 +8603,7 @@
                 <w:sz w:val="21"/>
                 <w:szCs w:val="21"/>
               </w:rPr>
-              <w:t xml:space="preserve">TD3 vs DDPG, rule, RBF</w:t>
+              <w:t xml:space="preserve">DDPG, TD3, SAC</w:t>
             </w:r>
           </w:p>
         </w:tc>
@@ -8573,7 +8702,7 @@
                 <w:sz w:val="21"/>
                 <w:szCs w:val="21"/>
               </w:rPr>
-              <w:t xml:space="preserve">baselines only</w:t>
+              <w:t xml:space="preserve">–</w:t>
             </w:r>
           </w:p>
         </w:tc>
@@ -8645,7 +8774,7 @@
                 <w:sz w:val="21"/>
                 <w:szCs w:val="21"/>
               </w:rPr>
-              <w:t xml:space="preserve">Khan et al. (TREC)</w:t>
+              <w:t xml:space="preserve">Li et al. (2026)</w:t>
             </w:r>
           </w:p>
         </w:tc>
@@ -8678,7 +8807,7 @@
                 <w:sz w:val="21"/>
                 <w:szCs w:val="21"/>
               </w:rPr>
-              <w:t xml:space="preserve">DDPG vs TD3</w:t>
+              <w:t xml:space="preserve">TD3 vs DDPG, rule, RBF</w:t>
             </w:r>
           </w:p>
         </w:tc>
@@ -8711,7 +8840,7 @@
                 <w:sz w:val="21"/>
                 <w:szCs w:val="21"/>
               </w:rPr>
-              <w:t xml:space="preserve">J, D, Kq</w:t>
+              <w:t xml:space="preserve">J, D</w:t>
             </w:r>
           </w:p>
         </w:tc>
@@ -8744,7 +8873,7 @@
                 <w:sz w:val="21"/>
                 <w:szCs w:val="21"/>
               </w:rPr>
-              <w:t xml:space="preserve">✓ (sum rule)</w:t>
+              <w:t xml:space="preserve">–</w:t>
             </w:r>
           </w:p>
         </w:tc>
@@ -8757,6 +8886,7 @@
               <w:bottom w:val="single" w:color="000000" w:sz="4"/>
               <w:right w:val="single" w:color="000000" w:sz="4"/>
             </w:tcBorders>
+            <w:shd w:fill="FFFF00" w:color="auto" w:val="clear"/>
             <w:tcMar>
               <w:top w:type="dxa" w:w="40"/>
               <w:left w:type="dxa" w:w="80"/>
@@ -8777,7 +8907,7 @@
                 <w:sz w:val="21"/>
                 <w:szCs w:val="21"/>
               </w:rPr>
-              <w:t xml:space="preserve">–</w:t>
+              <w:t xml:space="preserve">rule baseline grid-searched; single run</w:t>
             </w:r>
           </w:p>
         </w:tc>
@@ -8849,7 +8979,7 @@
                 <w:sz w:val="21"/>
                 <w:szCs w:val="21"/>
               </w:rPr>
-              <w:t xml:space="preserve">Khan et al. (IREMOS)</w:t>
+              <w:t xml:space="preserve">Khan et al. (TREC)</w:t>
             </w:r>
           </w:p>
         </w:tc>
@@ -8981,7 +9111,7 @@
                 <w:sz w:val="21"/>
                 <w:szCs w:val="21"/>
               </w:rPr>
-              <w:t xml:space="preserve">✓ (10 seeds)</w:t>
+              <w:t xml:space="preserve">–</w:t>
             </w:r>
           </w:p>
         </w:tc>
@@ -9033,6 +9163,210 @@
               <w:bottom w:val="single" w:color="000000" w:sz="4"/>
               <w:right w:val="single" w:color="000000" w:sz="4"/>
             </w:tcBorders>
+            <w:tcMar>
+              <w:top w:type="dxa" w:w="40"/>
+              <w:left w:type="dxa" w:w="80"/>
+              <w:bottom w:type="dxa" w:w="40"/>
+              <w:right w:type="dxa" w:w="80"/>
+            </w:tcMar>
+            <w:vAlign w:val="center"/>
+          </w:tcPr>
+          <w:p>
+            <w:pPr>
+              <w:jc w:val="left"/>
+            </w:pPr>
+            <w:r>
+              <w:rPr>
+                <w:rFonts w:ascii="Times New Roman" w:cs="Times New Roman" w:eastAsia="Times New Roman" w:hAnsi="Times New Roman"/>
+                <w:b w:val="false"/>
+                <w:bCs w:val="false"/>
+                <w:sz w:val="21"/>
+                <w:szCs w:val="21"/>
+              </w:rPr>
+              <w:t xml:space="preserve">Khan et al. (IREMOS)</w:t>
+            </w:r>
+          </w:p>
+        </w:tc>
+        <w:tc>
+          <w:tcPr>
+            <w:tcW w:type="dxa" w:w="1450"/>
+            <w:tcBorders>
+              <w:top w:val="single" w:color="000000" w:sz="4"/>
+              <w:left w:val="single" w:color="000000" w:sz="4"/>
+              <w:bottom w:val="single" w:color="000000" w:sz="4"/>
+              <w:right w:val="single" w:color="000000" w:sz="4"/>
+            </w:tcBorders>
+            <w:tcMar>
+              <w:top w:type="dxa" w:w="40"/>
+              <w:left w:type="dxa" w:w="80"/>
+              <w:bottom w:type="dxa" w:w="40"/>
+              <w:right w:type="dxa" w:w="80"/>
+            </w:tcMar>
+            <w:vAlign w:val="center"/>
+          </w:tcPr>
+          <w:p>
+            <w:pPr>
+              <w:jc w:val="center"/>
+            </w:pPr>
+            <w:r>
+              <w:rPr>
+                <w:rFonts w:ascii="Times New Roman" w:cs="Times New Roman" w:eastAsia="Times New Roman" w:hAnsi="Times New Roman"/>
+                <w:b w:val="false"/>
+                <w:bCs w:val="false"/>
+                <w:sz w:val="21"/>
+                <w:szCs w:val="21"/>
+              </w:rPr>
+              <w:t xml:space="preserve">DDPG vs TD3</w:t>
+            </w:r>
+          </w:p>
+        </w:tc>
+        <w:tc>
+          <w:tcPr>
+            <w:tcW w:type="dxa" w:w="1250"/>
+            <w:tcBorders>
+              <w:top w:val="single" w:color="000000" w:sz="4"/>
+              <w:left w:val="single" w:color="000000" w:sz="4"/>
+              <w:bottom w:val="single" w:color="000000" w:sz="4"/>
+              <w:right w:val="single" w:color="000000" w:sz="4"/>
+            </w:tcBorders>
+            <w:tcMar>
+              <w:top w:type="dxa" w:w="40"/>
+              <w:left w:type="dxa" w:w="80"/>
+              <w:bottom w:type="dxa" w:w="40"/>
+              <w:right w:type="dxa" w:w="80"/>
+            </w:tcMar>
+            <w:vAlign w:val="center"/>
+          </w:tcPr>
+          <w:p>
+            <w:pPr>
+              <w:jc w:val="center"/>
+            </w:pPr>
+            <w:r>
+              <w:rPr>
+                <w:rFonts w:ascii="Times New Roman" w:cs="Times New Roman" w:eastAsia="Times New Roman" w:hAnsi="Times New Roman"/>
+                <w:b w:val="false"/>
+                <w:bCs w:val="false"/>
+                <w:sz w:val="21"/>
+                <w:szCs w:val="21"/>
+              </w:rPr>
+              <w:t xml:space="preserve">J, D, Kq</w:t>
+            </w:r>
+          </w:p>
+        </w:tc>
+        <w:tc>
+          <w:tcPr>
+            <w:tcW w:type="dxa" w:w="1350"/>
+            <w:tcBorders>
+              <w:top w:val="single" w:color="000000" w:sz="4"/>
+              <w:left w:val="single" w:color="000000" w:sz="4"/>
+              <w:bottom w:val="single" w:color="000000" w:sz="4"/>
+              <w:right w:val="single" w:color="000000" w:sz="4"/>
+            </w:tcBorders>
+            <w:tcMar>
+              <w:top w:type="dxa" w:w="40"/>
+              <w:left w:type="dxa" w:w="80"/>
+              <w:bottom w:type="dxa" w:w="40"/>
+              <w:right w:type="dxa" w:w="80"/>
+            </w:tcMar>
+            <w:vAlign w:val="center"/>
+          </w:tcPr>
+          <w:p>
+            <w:pPr>
+              <w:jc w:val="center"/>
+            </w:pPr>
+            <w:r>
+              <w:rPr>
+                <w:rFonts w:ascii="Times New Roman" w:cs="Times New Roman" w:eastAsia="Times New Roman" w:hAnsi="Times New Roman"/>
+                <w:b w:val="false"/>
+                <w:bCs w:val="false"/>
+                <w:sz w:val="21"/>
+                <w:szCs w:val="21"/>
+              </w:rPr>
+              <w:t xml:space="preserve">✓ (sum rule)</w:t>
+            </w:r>
+          </w:p>
+        </w:tc>
+        <w:tc>
+          <w:tcPr>
+            <w:tcW w:type="dxa" w:w="1300"/>
+            <w:tcBorders>
+              <w:top w:val="single" w:color="000000" w:sz="4"/>
+              <w:left w:val="single" w:color="000000" w:sz="4"/>
+              <w:bottom w:val="single" w:color="000000" w:sz="4"/>
+              <w:right w:val="single" w:color="000000" w:sz="4"/>
+            </w:tcBorders>
+            <w:tcMar>
+              <w:top w:type="dxa" w:w="40"/>
+              <w:left w:type="dxa" w:w="80"/>
+              <w:bottom w:type="dxa" w:w="40"/>
+              <w:right w:type="dxa" w:w="80"/>
+            </w:tcMar>
+            <w:vAlign w:val="center"/>
+          </w:tcPr>
+          <w:p>
+            <w:pPr>
+              <w:jc w:val="center"/>
+            </w:pPr>
+            <w:r>
+              <w:rPr>
+                <w:rFonts w:ascii="Times New Roman" w:cs="Times New Roman" w:eastAsia="Times New Roman" w:hAnsi="Times New Roman"/>
+                <w:b w:val="false"/>
+                <w:bCs w:val="false"/>
+                <w:sz w:val="21"/>
+                <w:szCs w:val="21"/>
+              </w:rPr>
+              <w:t xml:space="preserve">✓ (10 seeds)</w:t>
+            </w:r>
+          </w:p>
+        </w:tc>
+        <w:tc>
+          <w:tcPr>
+            <w:tcW w:type="dxa" w:w="1306"/>
+            <w:tcBorders>
+              <w:top w:val="single" w:color="000000" w:sz="4"/>
+              <w:left w:val="single" w:color="000000" w:sz="4"/>
+              <w:bottom w:val="single" w:color="000000" w:sz="4"/>
+              <w:right w:val="single" w:color="000000" w:sz="4"/>
+            </w:tcBorders>
+            <w:tcMar>
+              <w:top w:type="dxa" w:w="40"/>
+              <w:left w:type="dxa" w:w="80"/>
+              <w:bottom w:type="dxa" w:w="40"/>
+              <w:right w:type="dxa" w:w="80"/>
+            </w:tcMar>
+            <w:vAlign w:val="center"/>
+          </w:tcPr>
+          <w:p>
+            <w:pPr>
+              <w:jc w:val="center"/>
+            </w:pPr>
+            <w:r>
+              <w:rPr>
+                <w:rFonts w:ascii="Times New Roman" w:cs="Times New Roman" w:eastAsia="Times New Roman" w:hAnsi="Times New Roman"/>
+                <w:b w:val="false"/>
+                <w:bCs w:val="false"/>
+                <w:sz w:val="21"/>
+                <w:szCs w:val="21"/>
+              </w:rPr>
+              <w:t xml:space="preserve">–</w:t>
+            </w:r>
+          </w:p>
+        </w:tc>
+      </w:tr>
+      <w:tr>
+        <w:trPr>
+          <w:cantSplit/>
+          <w:tblHeader w:val="false"/>
+        </w:trPr>
+        <w:tc>
+          <w:tcPr>
+            <w:tcW w:type="dxa" w:w="1650"/>
+            <w:tcBorders>
+              <w:top w:val="single" w:color="000000" w:sz="4"/>
+              <w:left w:val="single" w:color="000000" w:sz="4"/>
+              <w:bottom w:val="single" w:color="000000" w:sz="4"/>
+              <w:right w:val="single" w:color="000000" w:sz="4"/>
+            </w:tcBorders>
             <w:shd w:fill="E2EFDA" w:color="auto" w:val="clear"/>
             <w:tcMar>
               <w:top w:type="dxa" w:w="40"/>
@@ -9234,6 +9568,3028 @@
       <w:pPr>
         <w:spacing w:after="160"/>
       </w:pPr>
+    </w:p>
+    <w:p>
+      <w:pPr>
+        <w:spacing w:after="160" w:line="276"/>
+      </w:pPr>
+      <w:r>
+        <w:rPr>
+          <w:rFonts w:ascii="Times New Roman" w:cs="Times New Roman" w:eastAsia="Times New Roman" w:hAnsi="Times New Roman"/>
+          <w:b w:val="false"/>
+          <w:bCs w:val="false"/>
+          <w:i w:val="false"/>
+          <w:iCs w:val="false"/>
+          <w:sz w:val="22"/>
+          <w:szCs w:val="22"/>
+          <w:shd w:fill="FFFF00" w:color="auto" w:val="clear"/>
+        </w:rPr>
+        <w:t xml:space="preserve">Yellow cells were checked against the full texts of the cited papers. HIL: hardware-in-the-loop; PINN: physics-informed neural network.</w:t>
+      </w:r>
+    </w:p>
+    <w:p>
+      <w:pPr>
+        <w:keepNext/>
+        <w:spacing w:after="80" w:before="200"/>
+        <w:jc w:val="left"/>
+      </w:pPr>
+      <w:r>
+        <w:rPr>
+          <w:rFonts w:ascii="Times New Roman" w:cs="Times New Roman" w:eastAsia="Times New Roman" w:hAnsi="Times New Roman"/>
+          <w:b w:val="false"/>
+          <w:bCs w:val="false"/>
+          <w:i w:val="false"/>
+          <w:iCs w:val="false"/>
+          <w:sz w:val="26"/>
+          <w:szCs w:val="26"/>
+          <w:shd w:fill="FFFF00" w:color="auto" w:val="clear"/>
+        </w:rPr>
+        <w:t xml:space="preserve">Table 2.5 Test conditions and reported results of the compared studies (each against its own baseline)</w:t>
+      </w:r>
+    </w:p>
+    <w:tbl>
+      <w:tblPr>
+        <w:tblW w:type="dxa" w:w="8306"/>
+        <w:tblBorders>
+          <w:top w:val="single" w:color="auto" w:sz="4"/>
+          <w:left w:val="single" w:color="auto" w:sz="4"/>
+          <w:bottom w:val="single" w:color="auto" w:sz="4"/>
+          <w:right w:val="single" w:color="auto" w:sz="4"/>
+          <w:insideH w:val="single" w:color="auto" w:sz="4"/>
+          <w:insideV w:val="single" w:color="auto" w:sz="4"/>
+        </w:tblBorders>
+      </w:tblPr>
+      <w:tblGrid>
+        <w:gridCol w:w="1350"/>
+        <w:gridCol w:w="1700"/>
+        <w:gridCol w:w="850"/>
+        <w:gridCol w:w="1250"/>
+        <w:gridCol w:w="1250"/>
+        <w:gridCol w:w="1906"/>
+      </w:tblGrid>
+      <w:tr>
+        <w:trPr>
+          <w:cantSplit/>
+          <w:tblHeader/>
+        </w:trPr>
+        <w:tc>
+          <w:tcPr>
+            <w:tcW w:type="dxa" w:w="1350"/>
+            <w:tcBorders>
+              <w:top w:val="single" w:color="000000" w:sz="4"/>
+              <w:left w:val="single" w:color="000000" w:sz="4"/>
+              <w:bottom w:val="single" w:color="000000" w:sz="4"/>
+              <w:right w:val="single" w:color="000000" w:sz="4"/>
+            </w:tcBorders>
+            <w:shd w:fill="E8E8E8" w:color="auto" w:val="clear"/>
+            <w:tcMar>
+              <w:top w:type="dxa" w:w="40"/>
+              <w:left w:type="dxa" w:w="80"/>
+              <w:bottom w:type="dxa" w:w="40"/>
+              <w:right w:type="dxa" w:w="80"/>
+            </w:tcMar>
+            <w:vAlign w:val="center"/>
+          </w:tcPr>
+          <w:p>
+            <w:pPr>
+              <w:jc w:val="center"/>
+            </w:pPr>
+            <w:r>
+              <w:rPr>
+                <w:rFonts w:ascii="Times New Roman" w:cs="Times New Roman" w:eastAsia="Times New Roman" w:hAnsi="Times New Roman"/>
+                <w:b/>
+                <w:bCs/>
+                <w:sz w:val="19"/>
+                <w:szCs w:val="19"/>
+              </w:rPr>
+              <w:t xml:space="preserve">Reference</w:t>
+            </w:r>
+          </w:p>
+        </w:tc>
+        <w:tc>
+          <w:tcPr>
+            <w:tcW w:type="dxa" w:w="1700"/>
+            <w:tcBorders>
+              <w:top w:val="single" w:color="000000" w:sz="4"/>
+              <w:left w:val="single" w:color="000000" w:sz="4"/>
+              <w:bottom w:val="single" w:color="000000" w:sz="4"/>
+              <w:right w:val="single" w:color="000000" w:sz="4"/>
+            </w:tcBorders>
+            <w:shd w:fill="E8E8E8" w:color="auto" w:val="clear"/>
+            <w:tcMar>
+              <w:top w:type="dxa" w:w="40"/>
+              <w:left w:type="dxa" w:w="80"/>
+              <w:bottom w:type="dxa" w:w="40"/>
+              <w:right w:type="dxa" w:w="80"/>
+            </w:tcMar>
+            <w:vAlign w:val="center"/>
+          </w:tcPr>
+          <w:p>
+            <w:pPr>
+              <w:jc w:val="center"/>
+            </w:pPr>
+            <w:r>
+              <w:rPr>
+                <w:rFonts w:ascii="Times New Roman" w:cs="Times New Roman" w:eastAsia="Times New Roman" w:hAnsi="Times New Roman"/>
+                <w:b/>
+                <w:bCs/>
+                <w:sz w:val="19"/>
+                <w:szCs w:val="19"/>
+              </w:rPr>
+              <w:t xml:space="preserve">Test system</w:t>
+            </w:r>
+          </w:p>
+        </w:tc>
+        <w:tc>
+          <w:tcPr>
+            <w:tcW w:type="dxa" w:w="850"/>
+            <w:tcBorders>
+              <w:top w:val="single" w:color="000000" w:sz="4"/>
+              <w:left w:val="single" w:color="000000" w:sz="4"/>
+              <w:bottom w:val="single" w:color="000000" w:sz="4"/>
+              <w:right w:val="single" w:color="000000" w:sz="4"/>
+            </w:tcBorders>
+            <w:shd w:fill="E8E8E8" w:color="auto" w:val="clear"/>
+            <w:tcMar>
+              <w:top w:type="dxa" w:w="40"/>
+              <w:left w:type="dxa" w:w="80"/>
+              <w:bottom w:type="dxa" w:w="40"/>
+              <w:right w:type="dxa" w:w="80"/>
+            </w:tcMar>
+            <w:vAlign w:val="center"/>
+          </w:tcPr>
+          <w:p>
+            <w:pPr>
+              <w:jc w:val="center"/>
+            </w:pPr>
+            <w:r>
+              <w:rPr>
+                <w:rFonts w:ascii="Times New Roman" w:cs="Times New Roman" w:eastAsia="Times New Roman" w:hAnsi="Times New Roman"/>
+                <w:b/>
+                <w:bCs/>
+                <w:sz w:val="19"/>
+                <w:szCs w:val="19"/>
+              </w:rPr>
+              <w:t xml:space="preserve">Sync. machine</w:t>
+            </w:r>
+          </w:p>
+        </w:tc>
+        <w:tc>
+          <w:tcPr>
+            <w:tcW w:type="dxa" w:w="1250"/>
+            <w:tcBorders>
+              <w:top w:val="single" w:color="000000" w:sz="4"/>
+              <w:left w:val="single" w:color="000000" w:sz="4"/>
+              <w:bottom w:val="single" w:color="000000" w:sz="4"/>
+              <w:right w:val="single" w:color="000000" w:sz="4"/>
+            </w:tcBorders>
+            <w:shd w:fill="E8E8E8" w:color="auto" w:val="clear"/>
+            <w:tcMar>
+              <w:top w:type="dxa" w:w="40"/>
+              <w:left w:type="dxa" w:w="80"/>
+              <w:bottom w:type="dxa" w:w="40"/>
+              <w:right w:type="dxa" w:w="80"/>
+            </w:tcMar>
+            <w:vAlign w:val="center"/>
+          </w:tcPr>
+          <w:p>
+            <w:pPr>
+              <w:jc w:val="center"/>
+            </w:pPr>
+            <w:r>
+              <w:rPr>
+                <w:rFonts w:ascii="Times New Roman" w:cs="Times New Roman" w:eastAsia="Times New Roman" w:hAnsi="Times New Roman"/>
+                <w:b/>
+                <w:bCs/>
+                <w:sz w:val="19"/>
+                <w:szCs w:val="19"/>
+              </w:rPr>
+              <w:t xml:space="preserve">Tool / validation</w:t>
+            </w:r>
+          </w:p>
+        </w:tc>
+        <w:tc>
+          <w:tcPr>
+            <w:tcW w:type="dxa" w:w="1250"/>
+            <w:tcBorders>
+              <w:top w:val="single" w:color="000000" w:sz="4"/>
+              <w:left w:val="single" w:color="000000" w:sz="4"/>
+              <w:bottom w:val="single" w:color="000000" w:sz="4"/>
+              <w:right w:val="single" w:color="000000" w:sz="4"/>
+            </w:tcBorders>
+            <w:shd w:fill="E8E8E8" w:color="auto" w:val="clear"/>
+            <w:tcMar>
+              <w:top w:type="dxa" w:w="40"/>
+              <w:left w:type="dxa" w:w="80"/>
+              <w:bottom w:type="dxa" w:w="40"/>
+              <w:right w:type="dxa" w:w="80"/>
+            </w:tcMar>
+            <w:vAlign w:val="center"/>
+          </w:tcPr>
+          <w:p>
+            <w:pPr>
+              <w:jc w:val="center"/>
+            </w:pPr>
+            <w:r>
+              <w:rPr>
+                <w:rFonts w:ascii="Times New Roman" w:cs="Times New Roman" w:eastAsia="Times New Roman" w:hAnsi="Times New Roman"/>
+                <w:b/>
+                <w:bCs/>
+                <w:sz w:val="19"/>
+                <w:szCs w:val="19"/>
+              </w:rPr>
+              <w:t xml:space="preserve">Baseline</w:t>
+            </w:r>
+          </w:p>
+        </w:tc>
+        <w:tc>
+          <w:tcPr>
+            <w:tcW w:type="dxa" w:w="1906"/>
+            <w:tcBorders>
+              <w:top w:val="single" w:color="000000" w:sz="4"/>
+              <w:left w:val="single" w:color="000000" w:sz="4"/>
+              <w:bottom w:val="single" w:color="000000" w:sz="4"/>
+              <w:right w:val="single" w:color="000000" w:sz="4"/>
+            </w:tcBorders>
+            <w:shd w:fill="E8E8E8" w:color="auto" w:val="clear"/>
+            <w:tcMar>
+              <w:top w:type="dxa" w:w="40"/>
+              <w:left w:type="dxa" w:w="80"/>
+              <w:bottom w:type="dxa" w:w="40"/>
+              <w:right w:type="dxa" w:w="80"/>
+            </w:tcMar>
+            <w:vAlign w:val="center"/>
+          </w:tcPr>
+          <w:p>
+            <w:pPr>
+              <w:jc w:val="center"/>
+            </w:pPr>
+            <w:r>
+              <w:rPr>
+                <w:rFonts w:ascii="Times New Roman" w:cs="Times New Roman" w:eastAsia="Times New Roman" w:hAnsi="Times New Roman"/>
+                <w:b/>
+                <w:bCs/>
+                <w:sz w:val="19"/>
+                <w:szCs w:val="19"/>
+              </w:rPr>
+              <w:t xml:space="preserve">Reported result (source)</w:t>
+            </w:r>
+          </w:p>
+        </w:tc>
+      </w:tr>
+      <w:tr>
+        <w:trPr>
+          <w:cantSplit/>
+          <w:tblHeader w:val="false"/>
+        </w:trPr>
+        <w:tc>
+          <w:tcPr>
+            <w:tcW w:type="dxa" w:w="1350"/>
+            <w:tcBorders>
+              <w:top w:val="single" w:color="000000" w:sz="4"/>
+              <w:left w:val="single" w:color="000000" w:sz="4"/>
+              <w:bottom w:val="single" w:color="000000" w:sz="4"/>
+              <w:right w:val="single" w:color="000000" w:sz="4"/>
+            </w:tcBorders>
+            <w:shd w:fill="FFFF00" w:color="auto" w:val="clear"/>
+            <w:tcMar>
+              <w:top w:type="dxa" w:w="40"/>
+              <w:left w:type="dxa" w:w="80"/>
+              <w:bottom w:type="dxa" w:w="40"/>
+              <w:right w:type="dxa" w:w="80"/>
+            </w:tcMar>
+            <w:vAlign w:val="center"/>
+          </w:tcPr>
+          <w:p>
+            <w:pPr>
+              <w:jc w:val="left"/>
+            </w:pPr>
+            <w:r>
+              <w:rPr>
+                <w:rFonts w:ascii="Times New Roman" w:cs="Times New Roman" w:eastAsia="Times New Roman" w:hAnsi="Times New Roman"/>
+                <w:b w:val="false"/>
+                <w:bCs w:val="false"/>
+                <w:sz w:val="19"/>
+                <w:szCs w:val="19"/>
+              </w:rPr>
+              <w:t xml:space="preserve">Alipoor et al. (2015)</w:t>
+            </w:r>
+          </w:p>
+        </w:tc>
+        <w:tc>
+          <w:tcPr>
+            <w:tcW w:type="dxa" w:w="1700"/>
+            <w:tcBorders>
+              <w:top w:val="single" w:color="000000" w:sz="4"/>
+              <w:left w:val="single" w:color="000000" w:sz="4"/>
+              <w:bottom w:val="single" w:color="000000" w:sz="4"/>
+              <w:right w:val="single" w:color="000000" w:sz="4"/>
+            </w:tcBorders>
+            <w:shd w:fill="FFFF00" w:color="auto" w:val="clear"/>
+            <w:tcMar>
+              <w:top w:type="dxa" w:w="40"/>
+              <w:left w:type="dxa" w:w="80"/>
+              <w:bottom w:type="dxa" w:w="40"/>
+              <w:right w:type="dxa" w:w="80"/>
+            </w:tcMar>
+            <w:vAlign w:val="center"/>
+          </w:tcPr>
+          <w:p>
+            <w:pPr>
+              <w:jc w:val="center"/>
+            </w:pPr>
+            <w:r>
+              <w:rPr>
+                <w:rFonts w:ascii="Times New Roman" w:cs="Times New Roman" w:eastAsia="Times New Roman" w:hAnsi="Times New Roman"/>
+                <w:b w:val="false"/>
+                <w:bCs w:val="false"/>
+                <w:sz w:val="19"/>
+                <w:szCs w:val="19"/>
+              </w:rPr>
+              <w:t xml:space="preserve">50 kW VSG (simulation); laboratory inverter</w:t>
+            </w:r>
+          </w:p>
+        </w:tc>
+        <w:tc>
+          <w:tcPr>
+            <w:tcW w:type="dxa" w:w="850"/>
+            <w:tcBorders>
+              <w:top w:val="single" w:color="000000" w:sz="4"/>
+              <w:left w:val="single" w:color="000000" w:sz="4"/>
+              <w:bottom w:val="single" w:color="000000" w:sz="4"/>
+              <w:right w:val="single" w:color="000000" w:sz="4"/>
+            </w:tcBorders>
+            <w:shd w:fill="FFFF00" w:color="auto" w:val="clear"/>
+            <w:tcMar>
+              <w:top w:type="dxa" w:w="40"/>
+              <w:left w:type="dxa" w:w="80"/>
+              <w:bottom w:type="dxa" w:w="40"/>
+              <w:right w:type="dxa" w:w="80"/>
+            </w:tcMar>
+            <w:vAlign w:val="center"/>
+          </w:tcPr>
+          <w:p>
+            <w:pPr>
+              <w:jc w:val="center"/>
+            </w:pPr>
+            <w:r>
+              <w:rPr>
+                <w:rFonts w:ascii="Times New Roman" w:cs="Times New Roman" w:eastAsia="Times New Roman" w:hAnsi="Times New Roman"/>
+                <w:b w:val="false"/>
+                <w:bCs w:val="false"/>
+                <w:sz w:val="19"/>
+                <w:szCs w:val="19"/>
+              </w:rPr>
+              <w:t xml:space="preserve">in one case</w:t>
+            </w:r>
+          </w:p>
+        </w:tc>
+        <w:tc>
+          <w:tcPr>
+            <w:tcW w:type="dxa" w:w="1250"/>
+            <w:tcBorders>
+              <w:top w:val="single" w:color="000000" w:sz="4"/>
+              <w:left w:val="single" w:color="000000" w:sz="4"/>
+              <w:bottom w:val="single" w:color="000000" w:sz="4"/>
+              <w:right w:val="single" w:color="000000" w:sz="4"/>
+            </w:tcBorders>
+            <w:shd w:fill="FFFF00" w:color="auto" w:val="clear"/>
+            <w:tcMar>
+              <w:top w:type="dxa" w:w="40"/>
+              <w:left w:type="dxa" w:w="80"/>
+              <w:bottom w:type="dxa" w:w="40"/>
+              <w:right w:type="dxa" w:w="80"/>
+            </w:tcMar>
+            <w:vAlign w:val="center"/>
+          </w:tcPr>
+          <w:p>
+            <w:pPr>
+              <w:jc w:val="center"/>
+            </w:pPr>
+            <w:r>
+              <w:rPr>
+                <w:rFonts w:ascii="Times New Roman" w:cs="Times New Roman" w:eastAsia="Times New Roman" w:hAnsi="Times New Roman"/>
+                <w:b w:val="false"/>
+                <w:bCs w:val="false"/>
+                <w:sz w:val="19"/>
+                <w:szCs w:val="19"/>
+              </w:rPr>
+              <w:t xml:space="preserve">Simulation + lab inverter</w:t>
+            </w:r>
+          </w:p>
+        </w:tc>
+        <w:tc>
+          <w:tcPr>
+            <w:tcW w:type="dxa" w:w="1250"/>
+            <w:tcBorders>
+              <w:top w:val="single" w:color="000000" w:sz="4"/>
+              <w:left w:val="single" w:color="000000" w:sz="4"/>
+              <w:bottom w:val="single" w:color="000000" w:sz="4"/>
+              <w:right w:val="single" w:color="000000" w:sz="4"/>
+            </w:tcBorders>
+            <w:shd w:fill="FFFF00" w:color="auto" w:val="clear"/>
+            <w:tcMar>
+              <w:top w:type="dxa" w:w="40"/>
+              <w:left w:type="dxa" w:w="80"/>
+              <w:bottom w:type="dxa" w:w="40"/>
+              <w:right w:type="dxa" w:w="80"/>
+            </w:tcMar>
+            <w:vAlign w:val="center"/>
+          </w:tcPr>
+          <w:p>
+            <w:pPr>
+              <w:jc w:val="center"/>
+            </w:pPr>
+            <w:r>
+              <w:rPr>
+                <w:rFonts w:ascii="Times New Roman" w:cs="Times New Roman" w:eastAsia="Times New Roman" w:hAnsi="Times New Roman"/>
+                <w:b w:val="false"/>
+                <w:bCs w:val="false"/>
+                <w:sz w:val="19"/>
+                <w:szCs w:val="19"/>
+              </w:rPr>
+              <w:t xml:space="preserve">Fixed J</w:t>
+            </w:r>
+          </w:p>
+        </w:tc>
+        <w:tc>
+          <w:tcPr>
+            <w:tcW w:type="dxa" w:w="1906"/>
+            <w:tcBorders>
+              <w:top w:val="single" w:color="000000" w:sz="4"/>
+              <w:left w:val="single" w:color="000000" w:sz="4"/>
+              <w:bottom w:val="single" w:color="000000" w:sz="4"/>
+              <w:right w:val="single" w:color="000000" w:sz="4"/>
+            </w:tcBorders>
+            <w:shd w:fill="FFFF00" w:color="auto" w:val="clear"/>
+            <w:tcMar>
+              <w:top w:type="dxa" w:w="40"/>
+              <w:left w:type="dxa" w:w="80"/>
+              <w:bottom w:type="dxa" w:w="40"/>
+              <w:right w:type="dxa" w:w="80"/>
+            </w:tcMar>
+            <w:vAlign w:val="center"/>
+          </w:tcPr>
+          <w:p>
+            <w:pPr>
+              <w:jc w:val="center"/>
+            </w:pPr>
+            <w:r>
+              <w:rPr>
+                <w:rFonts w:ascii="Times New Roman" w:cs="Times New Roman" w:eastAsia="Times New Roman" w:hAnsi="Times New Roman"/>
+                <w:b w:val="false"/>
+                <w:bCs w:val="false"/>
+                <w:sz w:val="19"/>
+                <w:szCs w:val="19"/>
+              </w:rPr>
+              <w:t xml:space="preserve">Fixed J tripped after a 3.6 kW step; alternating J followed a 4.5 kW step (Figs. 19–21)</w:t>
+            </w:r>
+          </w:p>
+        </w:tc>
+      </w:tr>
+      <w:tr>
+        <w:trPr>
+          <w:cantSplit/>
+          <w:tblHeader w:val="false"/>
+        </w:trPr>
+        <w:tc>
+          <w:tcPr>
+            <w:tcW w:type="dxa" w:w="1350"/>
+            <w:tcBorders>
+              <w:top w:val="single" w:color="000000" w:sz="4"/>
+              <w:left w:val="single" w:color="000000" w:sz="4"/>
+              <w:bottom w:val="single" w:color="000000" w:sz="4"/>
+              <w:right w:val="single" w:color="000000" w:sz="4"/>
+            </w:tcBorders>
+            <w:shd w:fill="FFFF00" w:color="auto" w:val="clear"/>
+            <w:tcMar>
+              <w:top w:type="dxa" w:w="40"/>
+              <w:left w:type="dxa" w:w="80"/>
+              <w:bottom w:type="dxa" w:w="40"/>
+              <w:right w:type="dxa" w:w="80"/>
+            </w:tcMar>
+            <w:vAlign w:val="center"/>
+          </w:tcPr>
+          <w:p>
+            <w:pPr>
+              <w:jc w:val="left"/>
+            </w:pPr>
+            <w:r>
+              <w:rPr>
+                <w:rFonts w:ascii="Times New Roman" w:cs="Times New Roman" w:eastAsia="Times New Roman" w:hAnsi="Times New Roman"/>
+                <w:b w:val="false"/>
+                <w:bCs w:val="false"/>
+                <w:sz w:val="19"/>
+                <w:szCs w:val="19"/>
+              </w:rPr>
+              <w:t xml:space="preserve">Li et al. (2017)</w:t>
+            </w:r>
+          </w:p>
+        </w:tc>
+        <w:tc>
+          <w:tcPr>
+            <w:tcW w:type="dxa" w:w="1700"/>
+            <w:tcBorders>
+              <w:top w:val="single" w:color="000000" w:sz="4"/>
+              <w:left w:val="single" w:color="000000" w:sz="4"/>
+              <w:bottom w:val="single" w:color="000000" w:sz="4"/>
+              <w:right w:val="single" w:color="000000" w:sz="4"/>
+            </w:tcBorders>
+            <w:shd w:fill="FFFF00" w:color="auto" w:val="clear"/>
+            <w:tcMar>
+              <w:top w:type="dxa" w:w="40"/>
+              <w:left w:type="dxa" w:w="80"/>
+              <w:bottom w:type="dxa" w:w="40"/>
+              <w:right w:type="dxa" w:w="80"/>
+            </w:tcMar>
+            <w:vAlign w:val="center"/>
+          </w:tcPr>
+          <w:p>
+            <w:pPr>
+              <w:jc w:val="center"/>
+            </w:pPr>
+            <w:r>
+              <w:rPr>
+                <w:rFonts w:ascii="Times New Roman" w:cs="Times New Roman" w:eastAsia="Times New Roman" w:hAnsi="Times New Roman"/>
+                <w:b w:val="false"/>
+                <w:bCs w:val="false"/>
+                <w:sz w:val="19"/>
+                <w:szCs w:val="19"/>
+              </w:rPr>
+              <w:t xml:space="preserve">Single VSG, 50 kW load shedding</w:t>
+            </w:r>
+          </w:p>
+        </w:tc>
+        <w:tc>
+          <w:tcPr>
+            <w:tcW w:type="dxa" w:w="850"/>
+            <w:tcBorders>
+              <w:top w:val="single" w:color="000000" w:sz="4"/>
+              <w:left w:val="single" w:color="000000" w:sz="4"/>
+              <w:bottom w:val="single" w:color="000000" w:sz="4"/>
+              <w:right w:val="single" w:color="000000" w:sz="4"/>
+            </w:tcBorders>
+            <w:shd w:fill="FFFF00" w:color="auto" w:val="clear"/>
+            <w:tcMar>
+              <w:top w:type="dxa" w:w="40"/>
+              <w:left w:type="dxa" w:w="80"/>
+              <w:bottom w:type="dxa" w:w="40"/>
+              <w:right w:type="dxa" w:w="80"/>
+            </w:tcMar>
+            <w:vAlign w:val="center"/>
+          </w:tcPr>
+          <w:p>
+            <w:pPr>
+              <w:jc w:val="center"/>
+            </w:pPr>
+            <w:r>
+              <w:rPr>
+                <w:rFonts w:ascii="Times New Roman" w:cs="Times New Roman" w:eastAsia="Times New Roman" w:hAnsi="Times New Roman"/>
+                <w:b w:val="false"/>
+                <w:bCs w:val="false"/>
+                <w:sz w:val="19"/>
+                <w:szCs w:val="19"/>
+              </w:rPr>
+              <w:t xml:space="preserve">no</w:t>
+            </w:r>
+          </w:p>
+        </w:tc>
+        <w:tc>
+          <w:tcPr>
+            <w:tcW w:type="dxa" w:w="1250"/>
+            <w:tcBorders>
+              <w:top w:val="single" w:color="000000" w:sz="4"/>
+              <w:left w:val="single" w:color="000000" w:sz="4"/>
+              <w:bottom w:val="single" w:color="000000" w:sz="4"/>
+              <w:right w:val="single" w:color="000000" w:sz="4"/>
+            </w:tcBorders>
+            <w:shd w:fill="FFFF00" w:color="auto" w:val="clear"/>
+            <w:tcMar>
+              <w:top w:type="dxa" w:w="40"/>
+              <w:left w:type="dxa" w:w="80"/>
+              <w:bottom w:type="dxa" w:w="40"/>
+              <w:right w:type="dxa" w:w="80"/>
+            </w:tcMar>
+            <w:vAlign w:val="center"/>
+          </w:tcPr>
+          <w:p>
+            <w:pPr>
+              <w:jc w:val="center"/>
+            </w:pPr>
+            <w:r>
+              <w:rPr>
+                <w:rFonts w:ascii="Times New Roman" w:cs="Times New Roman" w:eastAsia="Times New Roman" w:hAnsi="Times New Roman"/>
+                <w:b w:val="false"/>
+                <w:bCs w:val="false"/>
+                <w:sz w:val="19"/>
+                <w:szCs w:val="19"/>
+              </w:rPr>
+              <w:t xml:space="preserve">Simulink</w:t>
+            </w:r>
+          </w:p>
+        </w:tc>
+        <w:tc>
+          <w:tcPr>
+            <w:tcW w:type="dxa" w:w="1250"/>
+            <w:tcBorders>
+              <w:top w:val="single" w:color="000000" w:sz="4"/>
+              <w:left w:val="single" w:color="000000" w:sz="4"/>
+              <w:bottom w:val="single" w:color="000000" w:sz="4"/>
+              <w:right w:val="single" w:color="000000" w:sz="4"/>
+            </w:tcBorders>
+            <w:shd w:fill="FFFF00" w:color="auto" w:val="clear"/>
+            <w:tcMar>
+              <w:top w:type="dxa" w:w="40"/>
+              <w:left w:type="dxa" w:w="80"/>
+              <w:bottom w:type="dxa" w:w="40"/>
+              <w:right w:type="dxa" w:w="80"/>
+            </w:tcMar>
+            <w:vAlign w:val="center"/>
+          </w:tcPr>
+          <w:p>
+            <w:pPr>
+              <w:jc w:val="center"/>
+            </w:pPr>
+            <w:r>
+              <w:rPr>
+                <w:rFonts w:ascii="Times New Roman" w:cs="Times New Roman" w:eastAsia="Times New Roman" w:hAnsi="Times New Roman"/>
+                <w:b w:val="false"/>
+                <w:bCs w:val="false"/>
+                <w:sz w:val="19"/>
+                <w:szCs w:val="19"/>
+              </w:rPr>
+              <w:t xml:space="preserve">Constant parameters</w:t>
+            </w:r>
+          </w:p>
+        </w:tc>
+        <w:tc>
+          <w:tcPr>
+            <w:tcW w:type="dxa" w:w="1906"/>
+            <w:tcBorders>
+              <w:top w:val="single" w:color="000000" w:sz="4"/>
+              <w:left w:val="single" w:color="000000" w:sz="4"/>
+              <w:bottom w:val="single" w:color="000000" w:sz="4"/>
+              <w:right w:val="single" w:color="000000" w:sz="4"/>
+            </w:tcBorders>
+            <w:shd w:fill="FFFF00" w:color="auto" w:val="clear"/>
+            <w:tcMar>
+              <w:top w:type="dxa" w:w="40"/>
+              <w:left w:type="dxa" w:w="80"/>
+              <w:bottom w:type="dxa" w:w="40"/>
+              <w:right w:type="dxa" w:w="80"/>
+            </w:tcMar>
+            <w:vAlign w:val="center"/>
+          </w:tcPr>
+          <w:p>
+            <w:pPr>
+              <w:jc w:val="center"/>
+            </w:pPr>
+            <w:r>
+              <w:rPr>
+                <w:rFonts w:ascii="Times New Roman" w:cs="Times New Roman" w:eastAsia="Times New Roman" w:hAnsi="Times New Roman"/>
+                <w:b w:val="false"/>
+                <w:bCs w:val="false"/>
+                <w:sz w:val="19"/>
+                <w:szCs w:val="19"/>
+              </w:rPr>
+              <w:t xml:space="preserve">Δf 0.75 → 0.45 Hz; settling ≈ 0.2 s (Fig. 2)</w:t>
+            </w:r>
+          </w:p>
+        </w:tc>
+      </w:tr>
+      <w:tr>
+        <w:trPr>
+          <w:cantSplit/>
+          <w:tblHeader w:val="false"/>
+        </w:trPr>
+        <w:tc>
+          <w:tcPr>
+            <w:tcW w:type="dxa" w:w="1350"/>
+            <w:tcBorders>
+              <w:top w:val="single" w:color="000000" w:sz="4"/>
+              <w:left w:val="single" w:color="000000" w:sz="4"/>
+              <w:bottom w:val="single" w:color="000000" w:sz="4"/>
+              <w:right w:val="single" w:color="000000" w:sz="4"/>
+            </w:tcBorders>
+            <w:shd w:fill="FFFF00" w:color="auto" w:val="clear"/>
+            <w:tcMar>
+              <w:top w:type="dxa" w:w="40"/>
+              <w:left w:type="dxa" w:w="80"/>
+              <w:bottom w:type="dxa" w:w="40"/>
+              <w:right w:type="dxa" w:w="80"/>
+            </w:tcMar>
+            <w:vAlign w:val="center"/>
+          </w:tcPr>
+          <w:p>
+            <w:pPr>
+              <w:jc w:val="left"/>
+            </w:pPr>
+            <w:r>
+              <w:rPr>
+                <w:rFonts w:ascii="Times New Roman" w:cs="Times New Roman" w:eastAsia="Times New Roman" w:hAnsi="Times New Roman"/>
+                <w:b w:val="false"/>
+                <w:bCs w:val="false"/>
+                <w:sz w:val="19"/>
+                <w:szCs w:val="19"/>
+              </w:rPr>
+              <w:t xml:space="preserve">Han et al. (2023)</w:t>
+            </w:r>
+          </w:p>
+        </w:tc>
+        <w:tc>
+          <w:tcPr>
+            <w:tcW w:type="dxa" w:w="1700"/>
+            <w:tcBorders>
+              <w:top w:val="single" w:color="000000" w:sz="4"/>
+              <w:left w:val="single" w:color="000000" w:sz="4"/>
+              <w:bottom w:val="single" w:color="000000" w:sz="4"/>
+              <w:right w:val="single" w:color="000000" w:sz="4"/>
+            </w:tcBorders>
+            <w:shd w:fill="FFFF00" w:color="auto" w:val="clear"/>
+            <w:tcMar>
+              <w:top w:type="dxa" w:w="40"/>
+              <w:left w:type="dxa" w:w="80"/>
+              <w:bottom w:type="dxa" w:w="40"/>
+              <w:right w:type="dxa" w:w="80"/>
+            </w:tcMar>
+            <w:vAlign w:val="center"/>
+          </w:tcPr>
+          <w:p>
+            <w:pPr>
+              <w:jc w:val="center"/>
+            </w:pPr>
+            <w:r>
+              <w:rPr>
+                <w:rFonts w:ascii="Times New Roman" w:cs="Times New Roman" w:eastAsia="Times New Roman" w:hAnsi="Times New Roman"/>
+                <w:b w:val="false"/>
+                <w:bCs w:val="false"/>
+                <w:sz w:val="19"/>
+                <w:szCs w:val="19"/>
+              </w:rPr>
+              <w:t xml:space="preserve">PV–storage microgrid, 60 kW; 20–60 kW load steps</w:t>
+            </w:r>
+          </w:p>
+        </w:tc>
+        <w:tc>
+          <w:tcPr>
+            <w:tcW w:type="dxa" w:w="850"/>
+            <w:tcBorders>
+              <w:top w:val="single" w:color="000000" w:sz="4"/>
+              <w:left w:val="single" w:color="000000" w:sz="4"/>
+              <w:bottom w:val="single" w:color="000000" w:sz="4"/>
+              <w:right w:val="single" w:color="000000" w:sz="4"/>
+            </w:tcBorders>
+            <w:shd w:fill="FFFF00" w:color="auto" w:val="clear"/>
+            <w:tcMar>
+              <w:top w:type="dxa" w:w="40"/>
+              <w:left w:type="dxa" w:w="80"/>
+              <w:bottom w:type="dxa" w:w="40"/>
+              <w:right w:type="dxa" w:w="80"/>
+            </w:tcMar>
+            <w:vAlign w:val="center"/>
+          </w:tcPr>
+          <w:p>
+            <w:pPr>
+              <w:jc w:val="center"/>
+            </w:pPr>
+            <w:r>
+              <w:rPr>
+                <w:rFonts w:ascii="Times New Roman" w:cs="Times New Roman" w:eastAsia="Times New Roman" w:hAnsi="Times New Roman"/>
+                <w:b w:val="false"/>
+                <w:bCs w:val="false"/>
+                <w:sz w:val="19"/>
+                <w:szCs w:val="19"/>
+              </w:rPr>
+              <w:t xml:space="preserve">no</w:t>
+            </w:r>
+          </w:p>
+        </w:tc>
+        <w:tc>
+          <w:tcPr>
+            <w:tcW w:type="dxa" w:w="1250"/>
+            <w:tcBorders>
+              <w:top w:val="single" w:color="000000" w:sz="4"/>
+              <w:left w:val="single" w:color="000000" w:sz="4"/>
+              <w:bottom w:val="single" w:color="000000" w:sz="4"/>
+              <w:right w:val="single" w:color="000000" w:sz="4"/>
+            </w:tcBorders>
+            <w:shd w:fill="FFFF00" w:color="auto" w:val="clear"/>
+            <w:tcMar>
+              <w:top w:type="dxa" w:w="40"/>
+              <w:left w:type="dxa" w:w="80"/>
+              <w:bottom w:type="dxa" w:w="40"/>
+              <w:right w:type="dxa" w:w="80"/>
+            </w:tcMar>
+            <w:vAlign w:val="center"/>
+          </w:tcPr>
+          <w:p>
+            <w:pPr>
+              <w:jc w:val="center"/>
+            </w:pPr>
+            <w:r>
+              <w:rPr>
+                <w:rFonts w:ascii="Times New Roman" w:cs="Times New Roman" w:eastAsia="Times New Roman" w:hAnsi="Times New Roman"/>
+                <w:b w:val="false"/>
+                <w:bCs w:val="false"/>
+                <w:sz w:val="19"/>
+                <w:szCs w:val="19"/>
+              </w:rPr>
+              <w:t xml:space="preserve">PLECS + HIL</w:t>
+            </w:r>
+          </w:p>
+        </w:tc>
+        <w:tc>
+          <w:tcPr>
+            <w:tcW w:type="dxa" w:w="1250"/>
+            <w:tcBorders>
+              <w:top w:val="single" w:color="000000" w:sz="4"/>
+              <w:left w:val="single" w:color="000000" w:sz="4"/>
+              <w:bottom w:val="single" w:color="000000" w:sz="4"/>
+              <w:right w:val="single" w:color="000000" w:sz="4"/>
+            </w:tcBorders>
+            <w:shd w:fill="FFFF00" w:color="auto" w:val="clear"/>
+            <w:tcMar>
+              <w:top w:type="dxa" w:w="40"/>
+              <w:left w:type="dxa" w:w="80"/>
+              <w:bottom w:type="dxa" w:w="40"/>
+              <w:right w:type="dxa" w:w="80"/>
+            </w:tcMar>
+            <w:vAlign w:val="center"/>
+          </w:tcPr>
+          <w:p>
+            <w:pPr>
+              <w:jc w:val="center"/>
+            </w:pPr>
+            <w:r>
+              <w:rPr>
+                <w:rFonts w:ascii="Times New Roman" w:cs="Times New Roman" w:eastAsia="Times New Roman" w:hAnsi="Times New Roman"/>
+                <w:b w:val="false"/>
+                <w:bCs w:val="false"/>
+                <w:sz w:val="19"/>
+                <w:szCs w:val="19"/>
+              </w:rPr>
+              <w:t xml:space="preserve">Constant inertia</w:t>
+            </w:r>
+          </w:p>
+        </w:tc>
+        <w:tc>
+          <w:tcPr>
+            <w:tcW w:type="dxa" w:w="1906"/>
+            <w:tcBorders>
+              <w:top w:val="single" w:color="000000" w:sz="4"/>
+              <w:left w:val="single" w:color="000000" w:sz="4"/>
+              <w:bottom w:val="single" w:color="000000" w:sz="4"/>
+              <w:right w:val="single" w:color="000000" w:sz="4"/>
+            </w:tcBorders>
+            <w:shd w:fill="FFFF00" w:color="auto" w:val="clear"/>
+            <w:tcMar>
+              <w:top w:type="dxa" w:w="40"/>
+              <w:left w:type="dxa" w:w="80"/>
+              <w:bottom w:type="dxa" w:w="40"/>
+              <w:right w:type="dxa" w:w="80"/>
+            </w:tcMar>
+            <w:vAlign w:val="center"/>
+          </w:tcPr>
+          <w:p>
+            <w:pPr>
+              <w:jc w:val="center"/>
+            </w:pPr>
+            <w:r>
+              <w:rPr>
+                <w:rFonts w:ascii="Times New Roman" w:cs="Times New Roman" w:eastAsia="Times New Roman" w:hAnsi="Times New Roman"/>
+                <w:b w:val="false"/>
+                <w:bCs w:val="false"/>
+                <w:sz w:val="19"/>
+                <w:szCs w:val="19"/>
+              </w:rPr>
+              <w:t xml:space="preserve">Frequency dip −54.67 % at 40 kW (Table 3)</w:t>
+            </w:r>
+          </w:p>
+        </w:tc>
+      </w:tr>
+      <w:tr>
+        <w:trPr>
+          <w:cantSplit/>
+          <w:tblHeader w:val="false"/>
+        </w:trPr>
+        <w:tc>
+          <w:tcPr>
+            <w:tcW w:type="dxa" w:w="1350"/>
+            <w:tcBorders>
+              <w:top w:val="single" w:color="000000" w:sz="4"/>
+              <w:left w:val="single" w:color="000000" w:sz="4"/>
+              <w:bottom w:val="single" w:color="000000" w:sz="4"/>
+              <w:right w:val="single" w:color="000000" w:sz="4"/>
+            </w:tcBorders>
+            <w:shd w:fill="FFFF00" w:color="auto" w:val="clear"/>
+            <w:tcMar>
+              <w:top w:type="dxa" w:w="40"/>
+              <w:left w:type="dxa" w:w="80"/>
+              <w:bottom w:type="dxa" w:w="40"/>
+              <w:right w:type="dxa" w:w="80"/>
+            </w:tcMar>
+            <w:vAlign w:val="center"/>
+          </w:tcPr>
+          <w:p>
+            <w:pPr>
+              <w:jc w:val="left"/>
+            </w:pPr>
+            <w:r>
+              <w:rPr>
+                <w:rFonts w:ascii="Times New Roman" w:cs="Times New Roman" w:eastAsia="Times New Roman" w:hAnsi="Times New Roman"/>
+                <w:b w:val="false"/>
+                <w:bCs w:val="false"/>
+                <w:sz w:val="19"/>
+                <w:szCs w:val="19"/>
+              </w:rPr>
+              <w:t xml:space="preserve">Shi et al. (2024)</w:t>
+            </w:r>
+          </w:p>
+        </w:tc>
+        <w:tc>
+          <w:tcPr>
+            <w:tcW w:type="dxa" w:w="1700"/>
+            <w:tcBorders>
+              <w:top w:val="single" w:color="000000" w:sz="4"/>
+              <w:left w:val="single" w:color="000000" w:sz="4"/>
+              <w:bottom w:val="single" w:color="000000" w:sz="4"/>
+              <w:right w:val="single" w:color="000000" w:sz="4"/>
+            </w:tcBorders>
+            <w:shd w:fill="FFFF00" w:color="auto" w:val="clear"/>
+            <w:tcMar>
+              <w:top w:type="dxa" w:w="40"/>
+              <w:left w:type="dxa" w:w="80"/>
+              <w:bottom w:type="dxa" w:w="40"/>
+              <w:right w:type="dxa" w:w="80"/>
+            </w:tcMar>
+            <w:vAlign w:val="center"/>
+          </w:tcPr>
+          <w:p>
+            <w:pPr>
+              <w:jc w:val="center"/>
+            </w:pPr>
+            <w:r>
+              <w:rPr>
+                <w:rFonts w:ascii="Times New Roman" w:cs="Times New Roman" w:eastAsia="Times New Roman" w:hAnsi="Times New Roman"/>
+                <w:b w:val="false"/>
+                <w:bCs w:val="false"/>
+                <w:sz w:val="19"/>
+                <w:szCs w:val="19"/>
+              </w:rPr>
+              <w:t xml:space="preserve">Grid-connected VSG, 15 kW step</w:t>
+            </w:r>
+          </w:p>
+        </w:tc>
+        <w:tc>
+          <w:tcPr>
+            <w:tcW w:type="dxa" w:w="850"/>
+            <w:tcBorders>
+              <w:top w:val="single" w:color="000000" w:sz="4"/>
+              <w:left w:val="single" w:color="000000" w:sz="4"/>
+              <w:bottom w:val="single" w:color="000000" w:sz="4"/>
+              <w:right w:val="single" w:color="000000" w:sz="4"/>
+            </w:tcBorders>
+            <w:shd w:fill="FFFF00" w:color="auto" w:val="clear"/>
+            <w:tcMar>
+              <w:top w:type="dxa" w:w="40"/>
+              <w:left w:type="dxa" w:w="80"/>
+              <w:bottom w:type="dxa" w:w="40"/>
+              <w:right w:type="dxa" w:w="80"/>
+            </w:tcMar>
+            <w:vAlign w:val="center"/>
+          </w:tcPr>
+          <w:p>
+            <w:pPr>
+              <w:jc w:val="center"/>
+            </w:pPr>
+            <w:r>
+              <w:rPr>
+                <w:rFonts w:ascii="Times New Roman" w:cs="Times New Roman" w:eastAsia="Times New Roman" w:hAnsi="Times New Roman"/>
+                <w:b w:val="false"/>
+                <w:bCs w:val="false"/>
+                <w:sz w:val="19"/>
+                <w:szCs w:val="19"/>
+              </w:rPr>
+              <w:t xml:space="preserve">no</w:t>
+            </w:r>
+          </w:p>
+        </w:tc>
+        <w:tc>
+          <w:tcPr>
+            <w:tcW w:type="dxa" w:w="1250"/>
+            <w:tcBorders>
+              <w:top w:val="single" w:color="000000" w:sz="4"/>
+              <w:left w:val="single" w:color="000000" w:sz="4"/>
+              <w:bottom w:val="single" w:color="000000" w:sz="4"/>
+              <w:right w:val="single" w:color="000000" w:sz="4"/>
+            </w:tcBorders>
+            <w:shd w:fill="FFFF00" w:color="auto" w:val="clear"/>
+            <w:tcMar>
+              <w:top w:type="dxa" w:w="40"/>
+              <w:left w:type="dxa" w:w="80"/>
+              <w:bottom w:type="dxa" w:w="40"/>
+              <w:right w:type="dxa" w:w="80"/>
+            </w:tcMar>
+            <w:vAlign w:val="center"/>
+          </w:tcPr>
+          <w:p>
+            <w:pPr>
+              <w:jc w:val="center"/>
+            </w:pPr>
+            <w:r>
+              <w:rPr>
+                <w:rFonts w:ascii="Times New Roman" w:cs="Times New Roman" w:eastAsia="Times New Roman" w:hAnsi="Times New Roman"/>
+                <w:b w:val="false"/>
+                <w:bCs w:val="false"/>
+                <w:sz w:val="19"/>
+                <w:szCs w:val="19"/>
+              </w:rPr>
+              <w:t xml:space="preserve">Simulink</w:t>
+            </w:r>
+          </w:p>
+        </w:tc>
+        <w:tc>
+          <w:tcPr>
+            <w:tcW w:type="dxa" w:w="1250"/>
+            <w:tcBorders>
+              <w:top w:val="single" w:color="000000" w:sz="4"/>
+              <w:left w:val="single" w:color="000000" w:sz="4"/>
+              <w:bottom w:val="single" w:color="000000" w:sz="4"/>
+              <w:right w:val="single" w:color="000000" w:sz="4"/>
+            </w:tcBorders>
+            <w:shd w:fill="FFFF00" w:color="auto" w:val="clear"/>
+            <w:tcMar>
+              <w:top w:type="dxa" w:w="40"/>
+              <w:left w:type="dxa" w:w="80"/>
+              <w:bottom w:type="dxa" w:w="40"/>
+              <w:right w:type="dxa" w:w="80"/>
+            </w:tcMar>
+            <w:vAlign w:val="center"/>
+          </w:tcPr>
+          <w:p>
+            <w:pPr>
+              <w:jc w:val="center"/>
+            </w:pPr>
+            <w:r>
+              <w:rPr>
+                <w:rFonts w:ascii="Times New Roman" w:cs="Times New Roman" w:eastAsia="Times New Roman" w:hAnsi="Times New Roman"/>
+                <w:b w:val="false"/>
+                <w:bCs w:val="false"/>
+                <w:sz w:val="19"/>
+                <w:szCs w:val="19"/>
+              </w:rPr>
+              <w:t xml:space="preserve">Fixed J and D</w:t>
+            </w:r>
+          </w:p>
+        </w:tc>
+        <w:tc>
+          <w:tcPr>
+            <w:tcW w:type="dxa" w:w="1906"/>
+            <w:tcBorders>
+              <w:top w:val="single" w:color="000000" w:sz="4"/>
+              <w:left w:val="single" w:color="000000" w:sz="4"/>
+              <w:bottom w:val="single" w:color="000000" w:sz="4"/>
+              <w:right w:val="single" w:color="000000" w:sz="4"/>
+            </w:tcBorders>
+            <w:shd w:fill="FFFF00" w:color="auto" w:val="clear"/>
+            <w:tcMar>
+              <w:top w:type="dxa" w:w="40"/>
+              <w:left w:type="dxa" w:w="80"/>
+              <w:bottom w:type="dxa" w:w="40"/>
+              <w:right w:type="dxa" w:w="80"/>
+            </w:tcMar>
+            <w:vAlign w:val="center"/>
+          </w:tcPr>
+          <w:p>
+            <w:pPr>
+              <w:jc w:val="center"/>
+            </w:pPr>
+            <w:r>
+              <w:rPr>
+                <w:rFonts w:ascii="Times New Roman" w:cs="Times New Roman" w:eastAsia="Times New Roman" w:hAnsi="Times New Roman"/>
+                <w:b w:val="false"/>
+                <w:bCs w:val="false"/>
+                <w:sz w:val="19"/>
+                <w:szCs w:val="19"/>
+              </w:rPr>
+              <w:t xml:space="preserve">Δf 0.5 → 0.2 Hz; overshoot 12.7 → 1.3 % (Sec. 5.2)</w:t>
+            </w:r>
+          </w:p>
+        </w:tc>
+      </w:tr>
+      <w:tr>
+        <w:trPr>
+          <w:cantSplit/>
+          <w:tblHeader w:val="false"/>
+        </w:trPr>
+        <w:tc>
+          <w:tcPr>
+            <w:tcW w:type="dxa" w:w="1350"/>
+            <w:tcBorders>
+              <w:top w:val="single" w:color="000000" w:sz="4"/>
+              <w:left w:val="single" w:color="000000" w:sz="4"/>
+              <w:bottom w:val="single" w:color="000000" w:sz="4"/>
+              <w:right w:val="single" w:color="000000" w:sz="4"/>
+            </w:tcBorders>
+            <w:shd w:fill="FFFF00" w:color="auto" w:val="clear"/>
+            <w:tcMar>
+              <w:top w:type="dxa" w:w="40"/>
+              <w:left w:type="dxa" w:w="80"/>
+              <w:bottom w:type="dxa" w:w="40"/>
+              <w:right w:type="dxa" w:w="80"/>
+            </w:tcMar>
+            <w:vAlign w:val="center"/>
+          </w:tcPr>
+          <w:p>
+            <w:pPr>
+              <w:jc w:val="left"/>
+            </w:pPr>
+            <w:r>
+              <w:rPr>
+                <w:rFonts w:ascii="Times New Roman" w:cs="Times New Roman" w:eastAsia="Times New Roman" w:hAnsi="Times New Roman"/>
+                <w:b w:val="false"/>
+                <w:bCs w:val="false"/>
+                <w:sz w:val="19"/>
+                <w:szCs w:val="19"/>
+              </w:rPr>
+              <w:t xml:space="preserve">Afifi et al. (2023)</w:t>
+            </w:r>
+          </w:p>
+        </w:tc>
+        <w:tc>
+          <w:tcPr>
+            <w:tcW w:type="dxa" w:w="1700"/>
+            <w:tcBorders>
+              <w:top w:val="single" w:color="000000" w:sz="4"/>
+              <w:left w:val="single" w:color="000000" w:sz="4"/>
+              <w:bottom w:val="single" w:color="000000" w:sz="4"/>
+              <w:right w:val="single" w:color="000000" w:sz="4"/>
+            </w:tcBorders>
+            <w:shd w:fill="FFFF00" w:color="auto" w:val="clear"/>
+            <w:tcMar>
+              <w:top w:type="dxa" w:w="40"/>
+              <w:left w:type="dxa" w:w="80"/>
+              <w:bottom w:type="dxa" w:w="40"/>
+              <w:right w:type="dxa" w:w="80"/>
+            </w:tcMar>
+            <w:vAlign w:val="center"/>
+          </w:tcPr>
+          <w:p>
+            <w:pPr>
+              <w:jc w:val="center"/>
+            </w:pPr>
+            <w:r>
+              <w:rPr>
+                <w:rFonts w:ascii="Times New Roman" w:cs="Times New Roman" w:eastAsia="Times New Roman" w:hAnsi="Times New Roman"/>
+                <w:b w:val="false"/>
+                <w:bCs w:val="false"/>
+                <w:sz w:val="19"/>
+                <w:szCs w:val="19"/>
+              </w:rPr>
+              <w:t xml:space="preserve">Islanded VSG; second case with SG and RES</w:t>
+            </w:r>
+          </w:p>
+        </w:tc>
+        <w:tc>
+          <w:tcPr>
+            <w:tcW w:type="dxa" w:w="850"/>
+            <w:tcBorders>
+              <w:top w:val="single" w:color="000000" w:sz="4"/>
+              <w:left w:val="single" w:color="000000" w:sz="4"/>
+              <w:bottom w:val="single" w:color="000000" w:sz="4"/>
+              <w:right w:val="single" w:color="000000" w:sz="4"/>
+            </w:tcBorders>
+            <w:shd w:fill="FFFF00" w:color="auto" w:val="clear"/>
+            <w:tcMar>
+              <w:top w:type="dxa" w:w="40"/>
+              <w:left w:type="dxa" w:w="80"/>
+              <w:bottom w:type="dxa" w:w="40"/>
+              <w:right w:type="dxa" w:w="80"/>
+            </w:tcMar>
+            <w:vAlign w:val="center"/>
+          </w:tcPr>
+          <w:p>
+            <w:pPr>
+              <w:jc w:val="center"/>
+            </w:pPr>
+            <w:r>
+              <w:rPr>
+                <w:rFonts w:ascii="Times New Roman" w:cs="Times New Roman" w:eastAsia="Times New Roman" w:hAnsi="Times New Roman"/>
+                <w:b w:val="false"/>
+                <w:bCs w:val="false"/>
+                <w:sz w:val="19"/>
+                <w:szCs w:val="19"/>
+              </w:rPr>
+              <w:t xml:space="preserve">in one case</w:t>
+            </w:r>
+          </w:p>
+        </w:tc>
+        <w:tc>
+          <w:tcPr>
+            <w:tcW w:type="dxa" w:w="1250"/>
+            <w:tcBorders>
+              <w:top w:val="single" w:color="000000" w:sz="4"/>
+              <w:left w:val="single" w:color="000000" w:sz="4"/>
+              <w:bottom w:val="single" w:color="000000" w:sz="4"/>
+              <w:right w:val="single" w:color="000000" w:sz="4"/>
+            </w:tcBorders>
+            <w:shd w:fill="FFFF00" w:color="auto" w:val="clear"/>
+            <w:tcMar>
+              <w:top w:type="dxa" w:w="40"/>
+              <w:left w:type="dxa" w:w="80"/>
+              <w:bottom w:type="dxa" w:w="40"/>
+              <w:right w:type="dxa" w:w="80"/>
+            </w:tcMar>
+            <w:vAlign w:val="center"/>
+          </w:tcPr>
+          <w:p>
+            <w:pPr>
+              <w:jc w:val="center"/>
+            </w:pPr>
+            <w:r>
+              <w:rPr>
+                <w:rFonts w:ascii="Times New Roman" w:cs="Times New Roman" w:eastAsia="Times New Roman" w:hAnsi="Times New Roman"/>
+                <w:b w:val="false"/>
+                <w:bCs w:val="false"/>
+                <w:sz w:val="19"/>
+                <w:szCs w:val="19"/>
+              </w:rPr>
+              <w:t xml:space="preserve">Simulink</w:t>
+            </w:r>
+          </w:p>
+        </w:tc>
+        <w:tc>
+          <w:tcPr>
+            <w:tcW w:type="dxa" w:w="1250"/>
+            <w:tcBorders>
+              <w:top w:val="single" w:color="000000" w:sz="4"/>
+              <w:left w:val="single" w:color="000000" w:sz="4"/>
+              <w:bottom w:val="single" w:color="000000" w:sz="4"/>
+              <w:right w:val="single" w:color="000000" w:sz="4"/>
+            </w:tcBorders>
+            <w:shd w:fill="FFFF00" w:color="auto" w:val="clear"/>
+            <w:tcMar>
+              <w:top w:type="dxa" w:w="40"/>
+              <w:left w:type="dxa" w:w="80"/>
+              <w:bottom w:type="dxa" w:w="40"/>
+              <w:right w:type="dxa" w:w="80"/>
+            </w:tcMar>
+            <w:vAlign w:val="center"/>
+          </w:tcPr>
+          <w:p>
+            <w:pPr>
+              <w:jc w:val="center"/>
+            </w:pPr>
+            <w:r>
+              <w:rPr>
+                <w:rFonts w:ascii="Times New Roman" w:cs="Times New Roman" w:eastAsia="Times New Roman" w:hAnsi="Times New Roman"/>
+                <w:b w:val="false"/>
+                <w:bCs w:val="false"/>
+                <w:sz w:val="19"/>
+                <w:szCs w:val="19"/>
+              </w:rPr>
+              <w:t xml:space="preserve">Tuned PI</w:t>
+            </w:r>
+          </w:p>
+        </w:tc>
+        <w:tc>
+          <w:tcPr>
+            <w:tcW w:type="dxa" w:w="1906"/>
+            <w:tcBorders>
+              <w:top w:val="single" w:color="000000" w:sz="4"/>
+              <w:left w:val="single" w:color="000000" w:sz="4"/>
+              <w:bottom w:val="single" w:color="000000" w:sz="4"/>
+              <w:right w:val="single" w:color="000000" w:sz="4"/>
+            </w:tcBorders>
+            <w:shd w:fill="FFFF00" w:color="auto" w:val="clear"/>
+            <w:tcMar>
+              <w:top w:type="dxa" w:w="40"/>
+              <w:left w:type="dxa" w:w="80"/>
+              <w:bottom w:type="dxa" w:w="40"/>
+              <w:right w:type="dxa" w:w="80"/>
+            </w:tcMar>
+            <w:vAlign w:val="center"/>
+          </w:tcPr>
+          <w:p>
+            <w:pPr>
+              <w:jc w:val="center"/>
+            </w:pPr>
+            <w:r>
+              <w:rPr>
+                <w:rFonts w:ascii="Times New Roman" w:cs="Times New Roman" w:eastAsia="Times New Roman" w:hAnsi="Times New Roman"/>
+                <w:b w:val="false"/>
+                <w:bCs w:val="false"/>
+                <w:sz w:val="19"/>
+                <w:szCs w:val="19"/>
+              </w:rPr>
+              <w:t xml:space="preserve">Nadir 49.992 → 49.998 Hz (Fig. 7)</w:t>
+            </w:r>
+          </w:p>
+        </w:tc>
+      </w:tr>
+      <w:tr>
+        <w:trPr>
+          <w:cantSplit/>
+          <w:tblHeader w:val="false"/>
+        </w:trPr>
+        <w:tc>
+          <w:tcPr>
+            <w:tcW w:type="dxa" w:w="1350"/>
+            <w:tcBorders>
+              <w:top w:val="single" w:color="000000" w:sz="4"/>
+              <w:left w:val="single" w:color="000000" w:sz="4"/>
+              <w:bottom w:val="single" w:color="000000" w:sz="4"/>
+              <w:right w:val="single" w:color="000000" w:sz="4"/>
+            </w:tcBorders>
+            <w:shd w:fill="FFFF00" w:color="auto" w:val="clear"/>
+            <w:tcMar>
+              <w:top w:type="dxa" w:w="40"/>
+              <w:left w:type="dxa" w:w="80"/>
+              <w:bottom w:type="dxa" w:w="40"/>
+              <w:right w:type="dxa" w:w="80"/>
+            </w:tcMar>
+            <w:vAlign w:val="center"/>
+          </w:tcPr>
+          <w:p>
+            <w:pPr>
+              <w:jc w:val="left"/>
+            </w:pPr>
+            <w:r>
+              <w:rPr>
+                <w:rFonts w:ascii="Times New Roman" w:cs="Times New Roman" w:eastAsia="Times New Roman" w:hAnsi="Times New Roman"/>
+                <w:b w:val="false"/>
+                <w:bCs w:val="false"/>
+                <w:sz w:val="19"/>
+                <w:szCs w:val="19"/>
+              </w:rPr>
+              <w:t xml:space="preserve">Lu and Zhuan (2024)</w:t>
+            </w:r>
+          </w:p>
+        </w:tc>
+        <w:tc>
+          <w:tcPr>
+            <w:tcW w:type="dxa" w:w="1700"/>
+            <w:tcBorders>
+              <w:top w:val="single" w:color="000000" w:sz="4"/>
+              <w:left w:val="single" w:color="000000" w:sz="4"/>
+              <w:bottom w:val="single" w:color="000000" w:sz="4"/>
+              <w:right w:val="single" w:color="000000" w:sz="4"/>
+            </w:tcBorders>
+            <w:shd w:fill="FFFF00" w:color="auto" w:val="clear"/>
+            <w:tcMar>
+              <w:top w:type="dxa" w:w="40"/>
+              <w:left w:type="dxa" w:w="80"/>
+              <w:bottom w:type="dxa" w:w="40"/>
+              <w:right w:type="dxa" w:w="80"/>
+            </w:tcMar>
+            <w:vAlign w:val="center"/>
+          </w:tcPr>
+          <w:p>
+            <w:pPr>
+              <w:jc w:val="center"/>
+            </w:pPr>
+            <w:r>
+              <w:rPr>
+                <w:rFonts w:ascii="Times New Roman" w:cs="Times New Roman" w:eastAsia="Times New Roman" w:hAnsi="Times New Roman"/>
+                <w:b w:val="false"/>
+                <w:bCs w:val="false"/>
+                <w:sz w:val="19"/>
+                <w:szCs w:val="19"/>
+              </w:rPr>
+              <w:t xml:space="preserve">100 kW grid-connected VSG, 0 → 20 kW step</w:t>
+            </w:r>
+          </w:p>
+        </w:tc>
+        <w:tc>
+          <w:tcPr>
+            <w:tcW w:type="dxa" w:w="850"/>
+            <w:tcBorders>
+              <w:top w:val="single" w:color="000000" w:sz="4"/>
+              <w:left w:val="single" w:color="000000" w:sz="4"/>
+              <w:bottom w:val="single" w:color="000000" w:sz="4"/>
+              <w:right w:val="single" w:color="000000" w:sz="4"/>
+            </w:tcBorders>
+            <w:shd w:fill="FFFF00" w:color="auto" w:val="clear"/>
+            <w:tcMar>
+              <w:top w:type="dxa" w:w="40"/>
+              <w:left w:type="dxa" w:w="80"/>
+              <w:bottom w:type="dxa" w:w="40"/>
+              <w:right w:type="dxa" w:w="80"/>
+            </w:tcMar>
+            <w:vAlign w:val="center"/>
+          </w:tcPr>
+          <w:p>
+            <w:pPr>
+              <w:jc w:val="center"/>
+            </w:pPr>
+            <w:r>
+              <w:rPr>
+                <w:rFonts w:ascii="Times New Roman" w:cs="Times New Roman" w:eastAsia="Times New Roman" w:hAnsi="Times New Roman"/>
+                <w:b w:val="false"/>
+                <w:bCs w:val="false"/>
+                <w:sz w:val="19"/>
+                <w:szCs w:val="19"/>
+              </w:rPr>
+              <w:t xml:space="preserve">no</w:t>
+            </w:r>
+          </w:p>
+        </w:tc>
+        <w:tc>
+          <w:tcPr>
+            <w:tcW w:type="dxa" w:w="1250"/>
+            <w:tcBorders>
+              <w:top w:val="single" w:color="000000" w:sz="4"/>
+              <w:left w:val="single" w:color="000000" w:sz="4"/>
+              <w:bottom w:val="single" w:color="000000" w:sz="4"/>
+              <w:right w:val="single" w:color="000000" w:sz="4"/>
+            </w:tcBorders>
+            <w:shd w:fill="FFFF00" w:color="auto" w:val="clear"/>
+            <w:tcMar>
+              <w:top w:type="dxa" w:w="40"/>
+              <w:left w:type="dxa" w:w="80"/>
+              <w:bottom w:type="dxa" w:w="40"/>
+              <w:right w:type="dxa" w:w="80"/>
+            </w:tcMar>
+            <w:vAlign w:val="center"/>
+          </w:tcPr>
+          <w:p>
+            <w:pPr>
+              <w:jc w:val="center"/>
+            </w:pPr>
+            <w:r>
+              <w:rPr>
+                <w:rFonts w:ascii="Times New Roman" w:cs="Times New Roman" w:eastAsia="Times New Roman" w:hAnsi="Times New Roman"/>
+                <w:b w:val="false"/>
+                <w:bCs w:val="false"/>
+                <w:sz w:val="19"/>
+                <w:szCs w:val="19"/>
+              </w:rPr>
+              <w:t xml:space="preserve">Simulink</w:t>
+            </w:r>
+          </w:p>
+        </w:tc>
+        <w:tc>
+          <w:tcPr>
+            <w:tcW w:type="dxa" w:w="1250"/>
+            <w:tcBorders>
+              <w:top w:val="single" w:color="000000" w:sz="4"/>
+              <w:left w:val="single" w:color="000000" w:sz="4"/>
+              <w:bottom w:val="single" w:color="000000" w:sz="4"/>
+              <w:right w:val="single" w:color="000000" w:sz="4"/>
+            </w:tcBorders>
+            <w:shd w:fill="FFFF00" w:color="auto" w:val="clear"/>
+            <w:tcMar>
+              <w:top w:type="dxa" w:w="40"/>
+              <w:left w:type="dxa" w:w="80"/>
+              <w:bottom w:type="dxa" w:w="40"/>
+              <w:right w:type="dxa" w:w="80"/>
+            </w:tcMar>
+            <w:vAlign w:val="center"/>
+          </w:tcPr>
+          <w:p>
+            <w:pPr>
+              <w:jc w:val="center"/>
+            </w:pPr>
+            <w:r>
+              <w:rPr>
+                <w:rFonts w:ascii="Times New Roman" w:cs="Times New Roman" w:eastAsia="Times New Roman" w:hAnsi="Times New Roman"/>
+                <w:b w:val="false"/>
+                <w:bCs w:val="false"/>
+                <w:sz w:val="19"/>
+                <w:szCs w:val="19"/>
+              </w:rPr>
+              <w:t xml:space="preserve">Fixed, rule, fuzzy, DDPG</w:t>
+            </w:r>
+          </w:p>
+        </w:tc>
+        <w:tc>
+          <w:tcPr>
+            <w:tcW w:type="dxa" w:w="1906"/>
+            <w:tcBorders>
+              <w:top w:val="single" w:color="000000" w:sz="4"/>
+              <w:left w:val="single" w:color="000000" w:sz="4"/>
+              <w:bottom w:val="single" w:color="000000" w:sz="4"/>
+              <w:right w:val="single" w:color="000000" w:sz="4"/>
+            </w:tcBorders>
+            <w:shd w:fill="FFFF00" w:color="auto" w:val="clear"/>
+            <w:tcMar>
+              <w:top w:type="dxa" w:w="40"/>
+              <w:left w:type="dxa" w:w="80"/>
+              <w:bottom w:type="dxa" w:w="40"/>
+              <w:right w:type="dxa" w:w="80"/>
+            </w:tcMar>
+            <w:vAlign w:val="center"/>
+          </w:tcPr>
+          <w:p>
+            <w:pPr>
+              <w:jc w:val="center"/>
+            </w:pPr>
+            <w:r>
+              <w:rPr>
+                <w:rFonts w:ascii="Times New Roman" w:cs="Times New Roman" w:eastAsia="Times New Roman" w:hAnsi="Times New Roman"/>
+                <w:b w:val="false"/>
+                <w:bCs w:val="false"/>
+                <w:sz w:val="19"/>
+                <w:szCs w:val="19"/>
+              </w:rPr>
+              <w:t xml:space="preserve">Δf 0.35 → 0.21 Hz; t_s 0.30 → 0.12 s (Table 2)</w:t>
+            </w:r>
+          </w:p>
+        </w:tc>
+      </w:tr>
+      <w:tr>
+        <w:trPr>
+          <w:cantSplit/>
+          <w:tblHeader w:val="false"/>
+        </w:trPr>
+        <w:tc>
+          <w:tcPr>
+            <w:tcW w:type="dxa" w:w="1350"/>
+            <w:tcBorders>
+              <w:top w:val="single" w:color="000000" w:sz="4"/>
+              <w:left w:val="single" w:color="000000" w:sz="4"/>
+              <w:bottom w:val="single" w:color="000000" w:sz="4"/>
+              <w:right w:val="single" w:color="000000" w:sz="4"/>
+            </w:tcBorders>
+            <w:shd w:fill="FFFF00" w:color="auto" w:val="clear"/>
+            <w:tcMar>
+              <w:top w:type="dxa" w:w="40"/>
+              <w:left w:type="dxa" w:w="80"/>
+              <w:bottom w:type="dxa" w:w="40"/>
+              <w:right w:type="dxa" w:w="80"/>
+            </w:tcMar>
+            <w:vAlign w:val="center"/>
+          </w:tcPr>
+          <w:p>
+            <w:pPr>
+              <w:jc w:val="left"/>
+            </w:pPr>
+            <w:r>
+              <w:rPr>
+                <w:rFonts w:ascii="Times New Roman" w:cs="Times New Roman" w:eastAsia="Times New Roman" w:hAnsi="Times New Roman"/>
+                <w:b w:val="false"/>
+                <w:bCs w:val="false"/>
+                <w:sz w:val="19"/>
+                <w:szCs w:val="19"/>
+              </w:rPr>
+              <w:t xml:space="preserve">Egbomwan et al. (2023)</w:t>
+            </w:r>
+          </w:p>
+        </w:tc>
+        <w:tc>
+          <w:tcPr>
+            <w:tcW w:type="dxa" w:w="1700"/>
+            <w:tcBorders>
+              <w:top w:val="single" w:color="000000" w:sz="4"/>
+              <w:left w:val="single" w:color="000000" w:sz="4"/>
+              <w:bottom w:val="single" w:color="000000" w:sz="4"/>
+              <w:right w:val="single" w:color="000000" w:sz="4"/>
+            </w:tcBorders>
+            <w:shd w:fill="FFFF00" w:color="auto" w:val="clear"/>
+            <w:tcMar>
+              <w:top w:type="dxa" w:w="40"/>
+              <w:left w:type="dxa" w:w="80"/>
+              <w:bottom w:type="dxa" w:w="40"/>
+              <w:right w:type="dxa" w:w="80"/>
+            </w:tcMar>
+            <w:vAlign w:val="center"/>
+          </w:tcPr>
+          <w:p>
+            <w:pPr>
+              <w:jc w:val="center"/>
+            </w:pPr>
+            <w:r>
+              <w:rPr>
+                <w:rFonts w:ascii="Times New Roman" w:cs="Times New Roman" w:eastAsia="Times New Roman" w:hAnsi="Times New Roman"/>
+                <w:b w:val="false"/>
+                <w:bCs w:val="false"/>
+                <w:sz w:val="19"/>
+                <w:szCs w:val="19"/>
+              </w:rPr>
+              <w:t xml:space="preserve">IEEE 34-node feeder, three DGs</w:t>
+            </w:r>
+          </w:p>
+        </w:tc>
+        <w:tc>
+          <w:tcPr>
+            <w:tcW w:type="dxa" w:w="850"/>
+            <w:tcBorders>
+              <w:top w:val="single" w:color="000000" w:sz="4"/>
+              <w:left w:val="single" w:color="000000" w:sz="4"/>
+              <w:bottom w:val="single" w:color="000000" w:sz="4"/>
+              <w:right w:val="single" w:color="000000" w:sz="4"/>
+            </w:tcBorders>
+            <w:shd w:fill="FFFF00" w:color="auto" w:val="clear"/>
+            <w:tcMar>
+              <w:top w:type="dxa" w:w="40"/>
+              <w:left w:type="dxa" w:w="80"/>
+              <w:bottom w:type="dxa" w:w="40"/>
+              <w:right w:type="dxa" w:w="80"/>
+            </w:tcMar>
+            <w:vAlign w:val="center"/>
+          </w:tcPr>
+          <w:p>
+            <w:pPr>
+              <w:jc w:val="center"/>
+            </w:pPr>
+            <w:r>
+              <w:rPr>
+                <w:rFonts w:ascii="Times New Roman" w:cs="Times New Roman" w:eastAsia="Times New Roman" w:hAnsi="Times New Roman"/>
+                <w:b w:val="false"/>
+                <w:bCs w:val="false"/>
+                <w:sz w:val="19"/>
+                <w:szCs w:val="19"/>
+              </w:rPr>
+              <w:t xml:space="preserve">no</w:t>
+            </w:r>
+          </w:p>
+        </w:tc>
+        <w:tc>
+          <w:tcPr>
+            <w:tcW w:type="dxa" w:w="1250"/>
+            <w:tcBorders>
+              <w:top w:val="single" w:color="000000" w:sz="4"/>
+              <w:left w:val="single" w:color="000000" w:sz="4"/>
+              <w:bottom w:val="single" w:color="000000" w:sz="4"/>
+              <w:right w:val="single" w:color="000000" w:sz="4"/>
+            </w:tcBorders>
+            <w:shd w:fill="FFFF00" w:color="auto" w:val="clear"/>
+            <w:tcMar>
+              <w:top w:type="dxa" w:w="40"/>
+              <w:left w:type="dxa" w:w="80"/>
+              <w:bottom w:type="dxa" w:w="40"/>
+              <w:right w:type="dxa" w:w="80"/>
+            </w:tcMar>
+            <w:vAlign w:val="center"/>
+          </w:tcPr>
+          <w:p>
+            <w:pPr>
+              <w:jc w:val="center"/>
+            </w:pPr>
+            <w:r>
+              <w:rPr>
+                <w:rFonts w:ascii="Times New Roman" w:cs="Times New Roman" w:eastAsia="Times New Roman" w:hAnsi="Times New Roman"/>
+                <w:b w:val="false"/>
+                <w:bCs w:val="false"/>
+                <w:sz w:val="19"/>
+                <w:szCs w:val="19"/>
+              </w:rPr>
+              <w:t xml:space="preserve">Simulink</w:t>
+            </w:r>
+          </w:p>
+        </w:tc>
+        <w:tc>
+          <w:tcPr>
+            <w:tcW w:type="dxa" w:w="1250"/>
+            <w:tcBorders>
+              <w:top w:val="single" w:color="000000" w:sz="4"/>
+              <w:left w:val="single" w:color="000000" w:sz="4"/>
+              <w:bottom w:val="single" w:color="000000" w:sz="4"/>
+              <w:right w:val="single" w:color="000000" w:sz="4"/>
+            </w:tcBorders>
+            <w:shd w:fill="FFFF00" w:color="auto" w:val="clear"/>
+            <w:tcMar>
+              <w:top w:type="dxa" w:w="40"/>
+              <w:left w:type="dxa" w:w="80"/>
+              <w:bottom w:type="dxa" w:w="40"/>
+              <w:right w:type="dxa" w:w="80"/>
+            </w:tcMar>
+            <w:vAlign w:val="center"/>
+          </w:tcPr>
+          <w:p>
+            <w:pPr>
+              <w:jc w:val="center"/>
+            </w:pPr>
+            <w:r>
+              <w:rPr>
+                <w:rFonts w:ascii="Times New Roman" w:cs="Times New Roman" w:eastAsia="Times New Roman" w:hAnsi="Times New Roman"/>
+                <w:b w:val="false"/>
+                <w:bCs w:val="false"/>
+                <w:sz w:val="19"/>
+                <w:szCs w:val="19"/>
+              </w:rPr>
+              <w:t xml:space="preserve">PI</w:t>
+            </w:r>
+          </w:p>
+        </w:tc>
+        <w:tc>
+          <w:tcPr>
+            <w:tcW w:type="dxa" w:w="1906"/>
+            <w:tcBorders>
+              <w:top w:val="single" w:color="000000" w:sz="4"/>
+              <w:left w:val="single" w:color="000000" w:sz="4"/>
+              <w:bottom w:val="single" w:color="000000" w:sz="4"/>
+              <w:right w:val="single" w:color="000000" w:sz="4"/>
+            </w:tcBorders>
+            <w:shd w:fill="FFFF00" w:color="auto" w:val="clear"/>
+            <w:tcMar>
+              <w:top w:type="dxa" w:w="40"/>
+              <w:left w:type="dxa" w:w="80"/>
+              <w:bottom w:type="dxa" w:w="40"/>
+              <w:right w:type="dxa" w:w="80"/>
+            </w:tcMar>
+            <w:vAlign w:val="center"/>
+          </w:tcPr>
+          <w:p>
+            <w:pPr>
+              <w:jc w:val="center"/>
+            </w:pPr>
+            <w:r>
+              <w:rPr>
+                <w:rFonts w:ascii="Times New Roman" w:cs="Times New Roman" w:eastAsia="Times New Roman" w:hAnsi="Times New Roman"/>
+                <w:b w:val="false"/>
+                <w:bCs w:val="false"/>
+                <w:sz w:val="19"/>
+                <w:szCs w:val="19"/>
+              </w:rPr>
+              <w:t xml:space="preserve">Mean absolute Δf error −56.6 % (Sec. V)</w:t>
+            </w:r>
+          </w:p>
+        </w:tc>
+      </w:tr>
+      <w:tr>
+        <w:trPr>
+          <w:cantSplit/>
+          <w:tblHeader w:val="false"/>
+        </w:trPr>
+        <w:tc>
+          <w:tcPr>
+            <w:tcW w:type="dxa" w:w="1350"/>
+            <w:tcBorders>
+              <w:top w:val="single" w:color="000000" w:sz="4"/>
+              <w:left w:val="single" w:color="000000" w:sz="4"/>
+              <w:bottom w:val="single" w:color="000000" w:sz="4"/>
+              <w:right w:val="single" w:color="000000" w:sz="4"/>
+            </w:tcBorders>
+            <w:shd w:fill="FFFF00" w:color="auto" w:val="clear"/>
+            <w:tcMar>
+              <w:top w:type="dxa" w:w="40"/>
+              <w:left w:type="dxa" w:w="80"/>
+              <w:bottom w:type="dxa" w:w="40"/>
+              <w:right w:type="dxa" w:w="80"/>
+            </w:tcMar>
+            <w:vAlign w:val="center"/>
+          </w:tcPr>
+          <w:p>
+            <w:pPr>
+              <w:jc w:val="left"/>
+            </w:pPr>
+            <w:r>
+              <w:rPr>
+                <w:rFonts w:ascii="Times New Roman" w:cs="Times New Roman" w:eastAsia="Times New Roman" w:hAnsi="Times New Roman"/>
+                <w:b w:val="false"/>
+                <w:bCs w:val="false"/>
+                <w:sz w:val="19"/>
+                <w:szCs w:val="19"/>
+              </w:rPr>
+              <w:t xml:space="preserve">Oboreh-Snapps et al. (2024)</w:t>
+            </w:r>
+          </w:p>
+        </w:tc>
+        <w:tc>
+          <w:tcPr>
+            <w:tcW w:type="dxa" w:w="1700"/>
+            <w:tcBorders>
+              <w:top w:val="single" w:color="000000" w:sz="4"/>
+              <w:left w:val="single" w:color="000000" w:sz="4"/>
+              <w:bottom w:val="single" w:color="000000" w:sz="4"/>
+              <w:right w:val="single" w:color="000000" w:sz="4"/>
+            </w:tcBorders>
+            <w:shd w:fill="FFFF00" w:color="auto" w:val="clear"/>
+            <w:tcMar>
+              <w:top w:type="dxa" w:w="40"/>
+              <w:left w:type="dxa" w:w="80"/>
+              <w:bottom w:type="dxa" w:w="40"/>
+              <w:right w:type="dxa" w:w="80"/>
+            </w:tcMar>
+            <w:vAlign w:val="center"/>
+          </w:tcPr>
+          <w:p>
+            <w:pPr>
+              <w:jc w:val="center"/>
+            </w:pPr>
+            <w:r>
+              <w:rPr>
+                <w:rFonts w:ascii="Times New Roman" w:cs="Times New Roman" w:eastAsia="Times New Roman" w:hAnsi="Times New Roman"/>
+                <w:b w:val="false"/>
+                <w:bCs w:val="false"/>
+                <w:sz w:val="19"/>
+                <w:szCs w:val="19"/>
+              </w:rPr>
+              <w:t xml:space="preserve">Banshee microgrid feeder (PV, BESS), MW scale</w:t>
+            </w:r>
+          </w:p>
+        </w:tc>
+        <w:tc>
+          <w:tcPr>
+            <w:tcW w:type="dxa" w:w="850"/>
+            <w:tcBorders>
+              <w:top w:val="single" w:color="000000" w:sz="4"/>
+              <w:left w:val="single" w:color="000000" w:sz="4"/>
+              <w:bottom w:val="single" w:color="000000" w:sz="4"/>
+              <w:right w:val="single" w:color="000000" w:sz="4"/>
+            </w:tcBorders>
+            <w:shd w:fill="FFFF00" w:color="auto" w:val="clear"/>
+            <w:tcMar>
+              <w:top w:type="dxa" w:w="40"/>
+              <w:left w:type="dxa" w:w="80"/>
+              <w:bottom w:type="dxa" w:w="40"/>
+              <w:right w:type="dxa" w:w="80"/>
+            </w:tcMar>
+            <w:vAlign w:val="center"/>
+          </w:tcPr>
+          <w:p>
+            <w:pPr>
+              <w:jc w:val="center"/>
+            </w:pPr>
+            <w:r>
+              <w:rPr>
+                <w:rFonts w:ascii="Times New Roman" w:cs="Times New Roman" w:eastAsia="Times New Roman" w:hAnsi="Times New Roman"/>
+                <w:b w:val="false"/>
+                <w:bCs w:val="false"/>
+                <w:sz w:val="19"/>
+                <w:szCs w:val="19"/>
+              </w:rPr>
+              <w:t xml:space="preserve">no</w:t>
+            </w:r>
+          </w:p>
+        </w:tc>
+        <w:tc>
+          <w:tcPr>
+            <w:tcW w:type="dxa" w:w="1250"/>
+            <w:tcBorders>
+              <w:top w:val="single" w:color="000000" w:sz="4"/>
+              <w:left w:val="single" w:color="000000" w:sz="4"/>
+              <w:bottom w:val="single" w:color="000000" w:sz="4"/>
+              <w:right w:val="single" w:color="000000" w:sz="4"/>
+            </w:tcBorders>
+            <w:shd w:fill="FFFF00" w:color="auto" w:val="clear"/>
+            <w:tcMar>
+              <w:top w:type="dxa" w:w="40"/>
+              <w:left w:type="dxa" w:w="80"/>
+              <w:bottom w:type="dxa" w:w="40"/>
+              <w:right w:type="dxa" w:w="80"/>
+            </w:tcMar>
+            <w:vAlign w:val="center"/>
+          </w:tcPr>
+          <w:p>
+            <w:pPr>
+              <w:jc w:val="center"/>
+            </w:pPr>
+            <w:r>
+              <w:rPr>
+                <w:rFonts w:ascii="Times New Roman" w:cs="Times New Roman" w:eastAsia="Times New Roman" w:hAnsi="Times New Roman"/>
+                <w:b w:val="false"/>
+                <w:bCs w:val="false"/>
+                <w:sz w:val="19"/>
+                <w:szCs w:val="19"/>
+              </w:rPr>
+              <w:t xml:space="preserve">Simulink + RTDS</w:t>
+            </w:r>
+          </w:p>
+        </w:tc>
+        <w:tc>
+          <w:tcPr>
+            <w:tcW w:type="dxa" w:w="1250"/>
+            <w:tcBorders>
+              <w:top w:val="single" w:color="000000" w:sz="4"/>
+              <w:left w:val="single" w:color="000000" w:sz="4"/>
+              <w:bottom w:val="single" w:color="000000" w:sz="4"/>
+              <w:right w:val="single" w:color="000000" w:sz="4"/>
+            </w:tcBorders>
+            <w:shd w:fill="FFFF00" w:color="auto" w:val="clear"/>
+            <w:tcMar>
+              <w:top w:type="dxa" w:w="40"/>
+              <w:left w:type="dxa" w:w="80"/>
+              <w:bottom w:type="dxa" w:w="40"/>
+              <w:right w:type="dxa" w:w="80"/>
+            </w:tcMar>
+            <w:vAlign w:val="center"/>
+          </w:tcPr>
+          <w:p>
+            <w:pPr>
+              <w:jc w:val="center"/>
+            </w:pPr>
+            <w:r>
+              <w:rPr>
+                <w:rFonts w:ascii="Times New Roman" w:cs="Times New Roman" w:eastAsia="Times New Roman" w:hAnsi="Times New Roman"/>
+                <w:b w:val="false"/>
+                <w:bCs w:val="false"/>
+                <w:sz w:val="19"/>
+                <w:szCs w:val="19"/>
+              </w:rPr>
+              <w:t xml:space="preserve">Fixed, fuzzy, DDPG</w:t>
+            </w:r>
+          </w:p>
+        </w:tc>
+        <w:tc>
+          <w:tcPr>
+            <w:tcW w:type="dxa" w:w="1906"/>
+            <w:tcBorders>
+              <w:top w:val="single" w:color="000000" w:sz="4"/>
+              <w:left w:val="single" w:color="000000" w:sz="4"/>
+              <w:bottom w:val="single" w:color="000000" w:sz="4"/>
+              <w:right w:val="single" w:color="000000" w:sz="4"/>
+            </w:tcBorders>
+            <w:shd w:fill="FFFF00" w:color="auto" w:val="clear"/>
+            <w:tcMar>
+              <w:top w:type="dxa" w:w="40"/>
+              <w:left w:type="dxa" w:w="80"/>
+              <w:bottom w:type="dxa" w:w="40"/>
+              <w:right w:type="dxa" w:w="80"/>
+            </w:tcMar>
+            <w:vAlign w:val="center"/>
+          </w:tcPr>
+          <w:p>
+            <w:pPr>
+              <w:jc w:val="center"/>
+            </w:pPr>
+            <w:r>
+              <w:rPr>
+                <w:rFonts w:ascii="Times New Roman" w:cs="Times New Roman" w:eastAsia="Times New Roman" w:hAnsi="Times New Roman"/>
+                <w:b w:val="false"/>
+                <w:bCs w:val="false"/>
+                <w:sz w:val="19"/>
+                <w:szCs w:val="19"/>
+              </w:rPr>
+              <w:t xml:space="preserve">Graphical results only (Figs. 10–15)</w:t>
+            </w:r>
+          </w:p>
+        </w:tc>
+      </w:tr>
+      <w:tr>
+        <w:trPr>
+          <w:cantSplit/>
+          <w:tblHeader w:val="false"/>
+        </w:trPr>
+        <w:tc>
+          <w:tcPr>
+            <w:tcW w:type="dxa" w:w="1350"/>
+            <w:tcBorders>
+              <w:top w:val="single" w:color="000000" w:sz="4"/>
+              <w:left w:val="single" w:color="000000" w:sz="4"/>
+              <w:bottom w:val="single" w:color="000000" w:sz="4"/>
+              <w:right w:val="single" w:color="000000" w:sz="4"/>
+            </w:tcBorders>
+            <w:shd w:fill="FFFF00" w:color="auto" w:val="clear"/>
+            <w:tcMar>
+              <w:top w:type="dxa" w:w="40"/>
+              <w:left w:type="dxa" w:w="80"/>
+              <w:bottom w:type="dxa" w:w="40"/>
+              <w:right w:type="dxa" w:w="80"/>
+            </w:tcMar>
+            <w:vAlign w:val="center"/>
+          </w:tcPr>
+          <w:p>
+            <w:pPr>
+              <w:jc w:val="left"/>
+            </w:pPr>
+            <w:r>
+              <w:rPr>
+                <w:rFonts w:ascii="Times New Roman" w:cs="Times New Roman" w:eastAsia="Times New Roman" w:hAnsi="Times New Roman"/>
+                <w:b w:val="false"/>
+                <w:bCs w:val="false"/>
+                <w:sz w:val="19"/>
+                <w:szCs w:val="19"/>
+              </w:rPr>
+              <w:t xml:space="preserve">Egbomwan et al. (2025)</w:t>
+            </w:r>
+          </w:p>
+        </w:tc>
+        <w:tc>
+          <w:tcPr>
+            <w:tcW w:type="dxa" w:w="1700"/>
+            <w:tcBorders>
+              <w:top w:val="single" w:color="000000" w:sz="4"/>
+              <w:left w:val="single" w:color="000000" w:sz="4"/>
+              <w:bottom w:val="single" w:color="000000" w:sz="4"/>
+              <w:right w:val="single" w:color="000000" w:sz="4"/>
+            </w:tcBorders>
+            <w:shd w:fill="FFFF00" w:color="auto" w:val="clear"/>
+            <w:tcMar>
+              <w:top w:type="dxa" w:w="40"/>
+              <w:left w:type="dxa" w:w="80"/>
+              <w:bottom w:type="dxa" w:w="40"/>
+              <w:right w:type="dxa" w:w="80"/>
+            </w:tcMar>
+            <w:vAlign w:val="center"/>
+          </w:tcPr>
+          <w:p>
+            <w:pPr>
+              <w:jc w:val="center"/>
+            </w:pPr>
+            <w:r>
+              <w:rPr>
+                <w:rFonts w:ascii="Times New Roman" w:cs="Times New Roman" w:eastAsia="Times New Roman" w:hAnsi="Times New Roman"/>
+                <w:b w:val="false"/>
+                <w:bCs w:val="false"/>
+                <w:sz w:val="19"/>
+                <w:szCs w:val="19"/>
+              </w:rPr>
+              <w:t xml:space="preserve">IEEE 34- and 39-bus, 4 × 2 MW DGs</w:t>
+            </w:r>
+          </w:p>
+        </w:tc>
+        <w:tc>
+          <w:tcPr>
+            <w:tcW w:type="dxa" w:w="850"/>
+            <w:tcBorders>
+              <w:top w:val="single" w:color="000000" w:sz="4"/>
+              <w:left w:val="single" w:color="000000" w:sz="4"/>
+              <w:bottom w:val="single" w:color="000000" w:sz="4"/>
+              <w:right w:val="single" w:color="000000" w:sz="4"/>
+            </w:tcBorders>
+            <w:shd w:fill="FFFF00" w:color="auto" w:val="clear"/>
+            <w:tcMar>
+              <w:top w:type="dxa" w:w="40"/>
+              <w:left w:type="dxa" w:w="80"/>
+              <w:bottom w:type="dxa" w:w="40"/>
+              <w:right w:type="dxa" w:w="80"/>
+            </w:tcMar>
+            <w:vAlign w:val="center"/>
+          </w:tcPr>
+          <w:p>
+            <w:pPr>
+              <w:jc w:val="center"/>
+            </w:pPr>
+            <w:r>
+              <w:rPr>
+                <w:rFonts w:ascii="Times New Roman" w:cs="Times New Roman" w:eastAsia="Times New Roman" w:hAnsi="Times New Roman"/>
+                <w:b w:val="false"/>
+                <w:bCs w:val="false"/>
+                <w:sz w:val="19"/>
+                <w:szCs w:val="19"/>
+              </w:rPr>
+              <w:t xml:space="preserve">yes</w:t>
+            </w:r>
+          </w:p>
+        </w:tc>
+        <w:tc>
+          <w:tcPr>
+            <w:tcW w:type="dxa" w:w="1250"/>
+            <w:tcBorders>
+              <w:top w:val="single" w:color="000000" w:sz="4"/>
+              <w:left w:val="single" w:color="000000" w:sz="4"/>
+              <w:bottom w:val="single" w:color="000000" w:sz="4"/>
+              <w:right w:val="single" w:color="000000" w:sz="4"/>
+            </w:tcBorders>
+            <w:shd w:fill="FFFF00" w:color="auto" w:val="clear"/>
+            <w:tcMar>
+              <w:top w:type="dxa" w:w="40"/>
+              <w:left w:type="dxa" w:w="80"/>
+              <w:bottom w:type="dxa" w:w="40"/>
+              <w:right w:type="dxa" w:w="80"/>
+            </w:tcMar>
+            <w:vAlign w:val="center"/>
+          </w:tcPr>
+          <w:p>
+            <w:pPr>
+              <w:jc w:val="center"/>
+            </w:pPr>
+            <w:r>
+              <w:rPr>
+                <w:rFonts w:ascii="Times New Roman" w:cs="Times New Roman" w:eastAsia="Times New Roman" w:hAnsi="Times New Roman"/>
+                <w:b w:val="false"/>
+                <w:bCs w:val="false"/>
+                <w:sz w:val="19"/>
+                <w:szCs w:val="19"/>
+              </w:rPr>
+              <w:t xml:space="preserve">Simulink</w:t>
+            </w:r>
+          </w:p>
+        </w:tc>
+        <w:tc>
+          <w:tcPr>
+            <w:tcW w:type="dxa" w:w="1250"/>
+            <w:tcBorders>
+              <w:top w:val="single" w:color="000000" w:sz="4"/>
+              <w:left w:val="single" w:color="000000" w:sz="4"/>
+              <w:bottom w:val="single" w:color="000000" w:sz="4"/>
+              <w:right w:val="single" w:color="000000" w:sz="4"/>
+            </w:tcBorders>
+            <w:shd w:fill="FFFF00" w:color="auto" w:val="clear"/>
+            <w:tcMar>
+              <w:top w:type="dxa" w:w="40"/>
+              <w:left w:type="dxa" w:w="80"/>
+              <w:bottom w:type="dxa" w:w="40"/>
+              <w:right w:type="dxa" w:w="80"/>
+            </w:tcMar>
+            <w:vAlign w:val="center"/>
+          </w:tcPr>
+          <w:p>
+            <w:pPr>
+              <w:jc w:val="center"/>
+            </w:pPr>
+            <w:r>
+              <w:rPr>
+                <w:rFonts w:ascii="Times New Roman" w:cs="Times New Roman" w:eastAsia="Times New Roman" w:hAnsi="Times New Roman"/>
+                <w:b w:val="false"/>
+                <w:bCs w:val="false"/>
+                <w:sz w:val="19"/>
+                <w:szCs w:val="19"/>
+              </w:rPr>
+              <w:t xml:space="preserve">PI, MPC</w:t>
+            </w:r>
+          </w:p>
+        </w:tc>
+        <w:tc>
+          <w:tcPr>
+            <w:tcW w:type="dxa" w:w="1906"/>
+            <w:tcBorders>
+              <w:top w:val="single" w:color="000000" w:sz="4"/>
+              <w:left w:val="single" w:color="000000" w:sz="4"/>
+              <w:bottom w:val="single" w:color="000000" w:sz="4"/>
+              <w:right w:val="single" w:color="000000" w:sz="4"/>
+            </w:tcBorders>
+            <w:shd w:fill="FFFF00" w:color="auto" w:val="clear"/>
+            <w:tcMar>
+              <w:top w:type="dxa" w:w="40"/>
+              <w:left w:type="dxa" w:w="80"/>
+              <w:bottom w:type="dxa" w:w="40"/>
+              <w:right w:type="dxa" w:w="80"/>
+            </w:tcMar>
+            <w:vAlign w:val="center"/>
+          </w:tcPr>
+          <w:p>
+            <w:pPr>
+              <w:jc w:val="center"/>
+            </w:pPr>
+            <w:r>
+              <w:rPr>
+                <w:rFonts w:ascii="Times New Roman" w:cs="Times New Roman" w:eastAsia="Times New Roman" w:hAnsi="Times New Roman"/>
+                <w:b w:val="false"/>
+                <w:bCs w:val="false"/>
+                <w:sz w:val="19"/>
+                <w:szCs w:val="19"/>
+              </w:rPr>
+              <w:t xml:space="preserve">max |Δf| 0.062 → 0.006 Hz, two-phase fault (Case 1)</w:t>
+            </w:r>
+          </w:p>
+        </w:tc>
+      </w:tr>
+      <w:tr>
+        <w:trPr>
+          <w:cantSplit/>
+          <w:tblHeader w:val="false"/>
+        </w:trPr>
+        <w:tc>
+          <w:tcPr>
+            <w:tcW w:type="dxa" w:w="1350"/>
+            <w:tcBorders>
+              <w:top w:val="single" w:color="000000" w:sz="4"/>
+              <w:left w:val="single" w:color="000000" w:sz="4"/>
+              <w:bottom w:val="single" w:color="000000" w:sz="4"/>
+              <w:right w:val="single" w:color="000000" w:sz="4"/>
+            </w:tcBorders>
+            <w:shd w:fill="FFFF00" w:color="auto" w:val="clear"/>
+            <w:tcMar>
+              <w:top w:type="dxa" w:w="40"/>
+              <w:left w:type="dxa" w:w="80"/>
+              <w:bottom w:type="dxa" w:w="40"/>
+              <w:right w:type="dxa" w:w="80"/>
+            </w:tcMar>
+            <w:vAlign w:val="center"/>
+          </w:tcPr>
+          <w:p>
+            <w:pPr>
+              <w:jc w:val="left"/>
+            </w:pPr>
+            <w:r>
+              <w:rPr>
+                <w:rFonts w:ascii="Times New Roman" w:cs="Times New Roman" w:eastAsia="Times New Roman" w:hAnsi="Times New Roman"/>
+                <w:b w:val="false"/>
+                <w:bCs w:val="false"/>
+                <w:sz w:val="19"/>
+                <w:szCs w:val="19"/>
+              </w:rPr>
+              <w:t xml:space="preserve">Criollo et al. (2026)</w:t>
+            </w:r>
+          </w:p>
+        </w:tc>
+        <w:tc>
+          <w:tcPr>
+            <w:tcW w:type="dxa" w:w="1700"/>
+            <w:tcBorders>
+              <w:top w:val="single" w:color="000000" w:sz="4"/>
+              <w:left w:val="single" w:color="000000" w:sz="4"/>
+              <w:bottom w:val="single" w:color="000000" w:sz="4"/>
+              <w:right w:val="single" w:color="000000" w:sz="4"/>
+            </w:tcBorders>
+            <w:shd w:fill="FFFF00" w:color="auto" w:val="clear"/>
+            <w:tcMar>
+              <w:top w:type="dxa" w:w="40"/>
+              <w:left w:type="dxa" w:w="80"/>
+              <w:bottom w:type="dxa" w:w="40"/>
+              <w:right w:type="dxa" w:w="80"/>
+            </w:tcMar>
+            <w:vAlign w:val="center"/>
+          </w:tcPr>
+          <w:p>
+            <w:pPr>
+              <w:jc w:val="center"/>
+            </w:pPr>
+            <w:r>
+              <w:rPr>
+                <w:rFonts w:ascii="Times New Roman" w:cs="Times New Roman" w:eastAsia="Times New Roman" w:hAnsi="Times New Roman"/>
+                <w:b w:val="false"/>
+                <w:bCs w:val="false"/>
+                <w:sz w:val="19"/>
+                <w:szCs w:val="19"/>
+              </w:rPr>
+              <w:t xml:space="preserve">Two-area frequency model of a PV–wind–diesel laboratory microgrid</w:t>
+            </w:r>
+          </w:p>
+        </w:tc>
+        <w:tc>
+          <w:tcPr>
+            <w:tcW w:type="dxa" w:w="850"/>
+            <w:tcBorders>
+              <w:top w:val="single" w:color="000000" w:sz="4"/>
+              <w:left w:val="single" w:color="000000" w:sz="4"/>
+              <w:bottom w:val="single" w:color="000000" w:sz="4"/>
+              <w:right w:val="single" w:color="000000" w:sz="4"/>
+            </w:tcBorders>
+            <w:shd w:fill="FFFF00" w:color="auto" w:val="clear"/>
+            <w:tcMar>
+              <w:top w:type="dxa" w:w="40"/>
+              <w:left w:type="dxa" w:w="80"/>
+              <w:bottom w:type="dxa" w:w="40"/>
+              <w:right w:type="dxa" w:w="80"/>
+            </w:tcMar>
+            <w:vAlign w:val="center"/>
+          </w:tcPr>
+          <w:p>
+            <w:pPr>
+              <w:jc w:val="center"/>
+            </w:pPr>
+            <w:r>
+              <w:rPr>
+                <w:rFonts w:ascii="Times New Roman" w:cs="Times New Roman" w:eastAsia="Times New Roman" w:hAnsi="Times New Roman"/>
+                <w:b w:val="false"/>
+                <w:bCs w:val="false"/>
+                <w:sz w:val="19"/>
+                <w:szCs w:val="19"/>
+              </w:rPr>
+              <w:t xml:space="preserve">yes</w:t>
+            </w:r>
+          </w:p>
+        </w:tc>
+        <w:tc>
+          <w:tcPr>
+            <w:tcW w:type="dxa" w:w="1250"/>
+            <w:tcBorders>
+              <w:top w:val="single" w:color="000000" w:sz="4"/>
+              <w:left w:val="single" w:color="000000" w:sz="4"/>
+              <w:bottom w:val="single" w:color="000000" w:sz="4"/>
+              <w:right w:val="single" w:color="000000" w:sz="4"/>
+            </w:tcBorders>
+            <w:shd w:fill="FFFF00" w:color="auto" w:val="clear"/>
+            <w:tcMar>
+              <w:top w:type="dxa" w:w="40"/>
+              <w:left w:type="dxa" w:w="80"/>
+              <w:bottom w:type="dxa" w:w="40"/>
+              <w:right w:type="dxa" w:w="80"/>
+            </w:tcMar>
+            <w:vAlign w:val="center"/>
+          </w:tcPr>
+          <w:p>
+            <w:pPr>
+              <w:jc w:val="center"/>
+            </w:pPr>
+            <w:r>
+              <w:rPr>
+                <w:rFonts w:ascii="Times New Roman" w:cs="Times New Roman" w:eastAsia="Times New Roman" w:hAnsi="Times New Roman"/>
+                <w:b w:val="false"/>
+                <w:bCs w:val="false"/>
+                <w:sz w:val="19"/>
+                <w:szCs w:val="19"/>
+              </w:rPr>
+              <w:t xml:space="preserve">Simulink (low-order model)</w:t>
+            </w:r>
+          </w:p>
+        </w:tc>
+        <w:tc>
+          <w:tcPr>
+            <w:tcW w:type="dxa" w:w="1250"/>
+            <w:tcBorders>
+              <w:top w:val="single" w:color="000000" w:sz="4"/>
+              <w:left w:val="single" w:color="000000" w:sz="4"/>
+              <w:bottom w:val="single" w:color="000000" w:sz="4"/>
+              <w:right w:val="single" w:color="000000" w:sz="4"/>
+            </w:tcBorders>
+            <w:shd w:fill="FFFF00" w:color="auto" w:val="clear"/>
+            <w:tcMar>
+              <w:top w:type="dxa" w:w="40"/>
+              <w:left w:type="dxa" w:w="80"/>
+              <w:bottom w:type="dxa" w:w="40"/>
+              <w:right w:type="dxa" w:w="80"/>
+            </w:tcMar>
+            <w:vAlign w:val="center"/>
+          </w:tcPr>
+          <w:p>
+            <w:pPr>
+              <w:jc w:val="center"/>
+            </w:pPr>
+            <w:r>
+              <w:rPr>
+                <w:rFonts w:ascii="Times New Roman" w:cs="Times New Roman" w:eastAsia="Times New Roman" w:hAnsi="Times New Roman"/>
+                <w:b w:val="false"/>
+                <w:bCs w:val="false"/>
+                <w:sz w:val="19"/>
+                <w:szCs w:val="19"/>
+              </w:rPr>
+              <w:t xml:space="preserve">PID</w:t>
+            </w:r>
+          </w:p>
+        </w:tc>
+        <w:tc>
+          <w:tcPr>
+            <w:tcW w:type="dxa" w:w="1906"/>
+            <w:tcBorders>
+              <w:top w:val="single" w:color="000000" w:sz="4"/>
+              <w:left w:val="single" w:color="000000" w:sz="4"/>
+              <w:bottom w:val="single" w:color="000000" w:sz="4"/>
+              <w:right w:val="single" w:color="000000" w:sz="4"/>
+            </w:tcBorders>
+            <w:shd w:fill="FFFF00" w:color="auto" w:val="clear"/>
+            <w:tcMar>
+              <w:top w:type="dxa" w:w="40"/>
+              <w:left w:type="dxa" w:w="80"/>
+              <w:bottom w:type="dxa" w:w="40"/>
+              <w:right w:type="dxa" w:w="80"/>
+            </w:tcMar>
+            <w:vAlign w:val="center"/>
+          </w:tcPr>
+          <w:p>
+            <w:pPr>
+              <w:jc w:val="center"/>
+            </w:pPr>
+            <w:r>
+              <w:rPr>
+                <w:rFonts w:ascii="Times New Roman" w:cs="Times New Roman" w:eastAsia="Times New Roman" w:hAnsi="Times New Roman"/>
+                <w:b w:val="false"/>
+                <w:bCs w:val="false"/>
+                <w:sz w:val="19"/>
+                <w:szCs w:val="19"/>
+              </w:rPr>
+              <w:t xml:space="preserve">RoCoF −37.23 %; nadir +6.78 % (Abstract)</w:t>
+            </w:r>
+          </w:p>
+        </w:tc>
+      </w:tr>
+      <w:tr>
+        <w:trPr>
+          <w:cantSplit/>
+          <w:tblHeader w:val="false"/>
+        </w:trPr>
+        <w:tc>
+          <w:tcPr>
+            <w:tcW w:type="dxa" w:w="1350"/>
+            <w:tcBorders>
+              <w:top w:val="single" w:color="000000" w:sz="4"/>
+              <w:left w:val="single" w:color="000000" w:sz="4"/>
+              <w:bottom w:val="single" w:color="000000" w:sz="4"/>
+              <w:right w:val="single" w:color="000000" w:sz="4"/>
+            </w:tcBorders>
+            <w:shd w:fill="FFFF00" w:color="auto" w:val="clear"/>
+            <w:tcMar>
+              <w:top w:type="dxa" w:w="40"/>
+              <w:left w:type="dxa" w:w="80"/>
+              <w:bottom w:type="dxa" w:w="40"/>
+              <w:right w:type="dxa" w:w="80"/>
+            </w:tcMar>
+            <w:vAlign w:val="center"/>
+          </w:tcPr>
+          <w:p>
+            <w:pPr>
+              <w:jc w:val="left"/>
+            </w:pPr>
+            <w:r>
+              <w:rPr>
+                <w:rFonts w:ascii="Times New Roman" w:cs="Times New Roman" w:eastAsia="Times New Roman" w:hAnsi="Times New Roman"/>
+                <w:b w:val="false"/>
+                <w:bCs w:val="false"/>
+                <w:sz w:val="19"/>
+                <w:szCs w:val="19"/>
+              </w:rPr>
+              <w:t xml:space="preserve">Li et al. (2026)</w:t>
+            </w:r>
+          </w:p>
+        </w:tc>
+        <w:tc>
+          <w:tcPr>
+            <w:tcW w:type="dxa" w:w="1700"/>
+            <w:tcBorders>
+              <w:top w:val="single" w:color="000000" w:sz="4"/>
+              <w:left w:val="single" w:color="000000" w:sz="4"/>
+              <w:bottom w:val="single" w:color="000000" w:sz="4"/>
+              <w:right w:val="single" w:color="000000" w:sz="4"/>
+            </w:tcBorders>
+            <w:shd w:fill="FFFF00" w:color="auto" w:val="clear"/>
+            <w:tcMar>
+              <w:top w:type="dxa" w:w="40"/>
+              <w:left w:type="dxa" w:w="80"/>
+              <w:bottom w:type="dxa" w:w="40"/>
+              <w:right w:type="dxa" w:w="80"/>
+            </w:tcMar>
+            <w:vAlign w:val="center"/>
+          </w:tcPr>
+          <w:p>
+            <w:pPr>
+              <w:jc w:val="center"/>
+            </w:pPr>
+            <w:r>
+              <w:rPr>
+                <w:rFonts w:ascii="Times New Roman" w:cs="Times New Roman" w:eastAsia="Times New Roman" w:hAnsi="Times New Roman"/>
+                <w:b w:val="false"/>
+                <w:bCs w:val="false"/>
+                <w:sz w:val="19"/>
+                <w:szCs w:val="19"/>
+              </w:rPr>
+              <w:t xml:space="preserve">Single 380 V VSG, 0 → 50 kW step</w:t>
+            </w:r>
+          </w:p>
+        </w:tc>
+        <w:tc>
+          <w:tcPr>
+            <w:tcW w:type="dxa" w:w="850"/>
+            <w:tcBorders>
+              <w:top w:val="single" w:color="000000" w:sz="4"/>
+              <w:left w:val="single" w:color="000000" w:sz="4"/>
+              <w:bottom w:val="single" w:color="000000" w:sz="4"/>
+              <w:right w:val="single" w:color="000000" w:sz="4"/>
+            </w:tcBorders>
+            <w:shd w:fill="FFFF00" w:color="auto" w:val="clear"/>
+            <w:tcMar>
+              <w:top w:type="dxa" w:w="40"/>
+              <w:left w:type="dxa" w:w="80"/>
+              <w:bottom w:type="dxa" w:w="40"/>
+              <w:right w:type="dxa" w:w="80"/>
+            </w:tcMar>
+            <w:vAlign w:val="center"/>
+          </w:tcPr>
+          <w:p>
+            <w:pPr>
+              <w:jc w:val="center"/>
+            </w:pPr>
+            <w:r>
+              <w:rPr>
+                <w:rFonts w:ascii="Times New Roman" w:cs="Times New Roman" w:eastAsia="Times New Roman" w:hAnsi="Times New Roman"/>
+                <w:b w:val="false"/>
+                <w:bCs w:val="false"/>
+                <w:sz w:val="19"/>
+                <w:szCs w:val="19"/>
+              </w:rPr>
+              <w:t xml:space="preserve">no</w:t>
+            </w:r>
+          </w:p>
+        </w:tc>
+        <w:tc>
+          <w:tcPr>
+            <w:tcW w:type="dxa" w:w="1250"/>
+            <w:tcBorders>
+              <w:top w:val="single" w:color="000000" w:sz="4"/>
+              <w:left w:val="single" w:color="000000" w:sz="4"/>
+              <w:bottom w:val="single" w:color="000000" w:sz="4"/>
+              <w:right w:val="single" w:color="000000" w:sz="4"/>
+            </w:tcBorders>
+            <w:shd w:fill="FFFF00" w:color="auto" w:val="clear"/>
+            <w:tcMar>
+              <w:top w:type="dxa" w:w="40"/>
+              <w:left w:type="dxa" w:w="80"/>
+              <w:bottom w:type="dxa" w:w="40"/>
+              <w:right w:type="dxa" w:w="80"/>
+            </w:tcMar>
+            <w:vAlign w:val="center"/>
+          </w:tcPr>
+          <w:p>
+            <w:pPr>
+              <w:jc w:val="center"/>
+            </w:pPr>
+            <w:r>
+              <w:rPr>
+                <w:rFonts w:ascii="Times New Roman" w:cs="Times New Roman" w:eastAsia="Times New Roman" w:hAnsi="Times New Roman"/>
+                <w:b w:val="false"/>
+                <w:bCs w:val="false"/>
+                <w:sz w:val="19"/>
+                <w:szCs w:val="19"/>
+              </w:rPr>
+              <w:t xml:space="preserve">Simulink</w:t>
+            </w:r>
+          </w:p>
+        </w:tc>
+        <w:tc>
+          <w:tcPr>
+            <w:tcW w:type="dxa" w:w="1250"/>
+            <w:tcBorders>
+              <w:top w:val="single" w:color="000000" w:sz="4"/>
+              <w:left w:val="single" w:color="000000" w:sz="4"/>
+              <w:bottom w:val="single" w:color="000000" w:sz="4"/>
+              <w:right w:val="single" w:color="000000" w:sz="4"/>
+            </w:tcBorders>
+            <w:shd w:fill="FFFF00" w:color="auto" w:val="clear"/>
+            <w:tcMar>
+              <w:top w:type="dxa" w:w="40"/>
+              <w:left w:type="dxa" w:w="80"/>
+              <w:bottom w:type="dxa" w:w="40"/>
+              <w:right w:type="dxa" w:w="80"/>
+            </w:tcMar>
+            <w:vAlign w:val="center"/>
+          </w:tcPr>
+          <w:p>
+            <w:pPr>
+              <w:jc w:val="center"/>
+            </w:pPr>
+            <w:r>
+              <w:rPr>
+                <w:rFonts w:ascii="Times New Roman" w:cs="Times New Roman" w:eastAsia="Times New Roman" w:hAnsi="Times New Roman"/>
+                <w:b w:val="false"/>
+                <w:bCs w:val="false"/>
+                <w:sz w:val="19"/>
+                <w:szCs w:val="19"/>
+              </w:rPr>
+              <w:t xml:space="preserve">Fixed, grid-searched rule, RBF, DDPG</w:t>
+            </w:r>
+          </w:p>
+        </w:tc>
+        <w:tc>
+          <w:tcPr>
+            <w:tcW w:type="dxa" w:w="1906"/>
+            <w:tcBorders>
+              <w:top w:val="single" w:color="000000" w:sz="4"/>
+              <w:left w:val="single" w:color="000000" w:sz="4"/>
+              <w:bottom w:val="single" w:color="000000" w:sz="4"/>
+              <w:right w:val="single" w:color="000000" w:sz="4"/>
+            </w:tcBorders>
+            <w:shd w:fill="FFFF00" w:color="auto" w:val="clear"/>
+            <w:tcMar>
+              <w:top w:type="dxa" w:w="40"/>
+              <w:left w:type="dxa" w:w="80"/>
+              <w:bottom w:type="dxa" w:w="40"/>
+              <w:right w:type="dxa" w:w="80"/>
+            </w:tcMar>
+            <w:vAlign w:val="center"/>
+          </w:tcPr>
+          <w:p>
+            <w:pPr>
+              <w:jc w:val="center"/>
+            </w:pPr>
+            <w:r>
+              <w:rPr>
+                <w:rFonts w:ascii="Times New Roman" w:cs="Times New Roman" w:eastAsia="Times New Roman" w:hAnsi="Times New Roman"/>
+                <w:b w:val="false"/>
+                <w:bCs w:val="false"/>
+                <w:sz w:val="19"/>
+                <w:szCs w:val="19"/>
+              </w:rPr>
+              <w:t xml:space="preserve">Δf 1.00 → 0.67 Hz; t_s 0.4 → 0.2 s (Table 3)</w:t>
+            </w:r>
+          </w:p>
+        </w:tc>
+      </w:tr>
+      <w:tr>
+        <w:trPr>
+          <w:cantSplit/>
+          <w:tblHeader w:val="false"/>
+        </w:trPr>
+        <w:tc>
+          <w:tcPr>
+            <w:tcW w:type="dxa" w:w="1350"/>
+            <w:tcBorders>
+              <w:top w:val="single" w:color="000000" w:sz="4"/>
+              <w:left w:val="single" w:color="000000" w:sz="4"/>
+              <w:bottom w:val="single" w:color="000000" w:sz="4"/>
+              <w:right w:val="single" w:color="000000" w:sz="4"/>
+            </w:tcBorders>
+            <w:shd w:fill="FFFF00" w:color="auto" w:val="clear"/>
+            <w:tcMar>
+              <w:top w:type="dxa" w:w="40"/>
+              <w:left w:type="dxa" w:w="80"/>
+              <w:bottom w:type="dxa" w:w="40"/>
+              <w:right w:type="dxa" w:w="80"/>
+            </w:tcMar>
+            <w:vAlign w:val="center"/>
+          </w:tcPr>
+          <w:p>
+            <w:pPr>
+              <w:jc w:val="left"/>
+            </w:pPr>
+            <w:r>
+              <w:rPr>
+                <w:rFonts w:ascii="Times New Roman" w:cs="Times New Roman" w:eastAsia="Times New Roman" w:hAnsi="Times New Roman"/>
+                <w:b w:val="false"/>
+                <w:bCs w:val="false"/>
+                <w:sz w:val="19"/>
+                <w:szCs w:val="19"/>
+              </w:rPr>
+              <w:t xml:space="preserve">This thesis, Study 1</w:t>
+            </w:r>
+          </w:p>
+        </w:tc>
+        <w:tc>
+          <w:tcPr>
+            <w:tcW w:type="dxa" w:w="1700"/>
+            <w:tcBorders>
+              <w:top w:val="single" w:color="000000" w:sz="4"/>
+              <w:left w:val="single" w:color="000000" w:sz="4"/>
+              <w:bottom w:val="single" w:color="000000" w:sz="4"/>
+              <w:right w:val="single" w:color="000000" w:sz="4"/>
+            </w:tcBorders>
+            <w:shd w:fill="FFFF00" w:color="auto" w:val="clear"/>
+            <w:tcMar>
+              <w:top w:type="dxa" w:w="40"/>
+              <w:left w:type="dxa" w:w="80"/>
+              <w:bottom w:type="dxa" w:w="40"/>
+              <w:right w:type="dxa" w:w="80"/>
+            </w:tcMar>
+            <w:vAlign w:val="center"/>
+          </w:tcPr>
+          <w:p>
+            <w:pPr>
+              <w:jc w:val="center"/>
+            </w:pPr>
+            <w:r>
+              <w:rPr>
+                <w:rFonts w:ascii="Times New Roman" w:cs="Times New Roman" w:eastAsia="Times New Roman" w:hAnsi="Times New Roman"/>
+                <w:b w:val="false"/>
+                <w:bCs w:val="false"/>
+                <w:sz w:val="19"/>
+                <w:szCs w:val="19"/>
+              </w:rPr>
+              <w:t xml:space="preserve">2.5 MVA converter-only microgrid, measured 1-Hz weather</w:t>
+            </w:r>
+          </w:p>
+        </w:tc>
+        <w:tc>
+          <w:tcPr>
+            <w:tcW w:type="dxa" w:w="850"/>
+            <w:tcBorders>
+              <w:top w:val="single" w:color="000000" w:sz="4"/>
+              <w:left w:val="single" w:color="000000" w:sz="4"/>
+              <w:bottom w:val="single" w:color="000000" w:sz="4"/>
+              <w:right w:val="single" w:color="000000" w:sz="4"/>
+            </w:tcBorders>
+            <w:shd w:fill="FFFF00" w:color="auto" w:val="clear"/>
+            <w:tcMar>
+              <w:top w:type="dxa" w:w="40"/>
+              <w:left w:type="dxa" w:w="80"/>
+              <w:bottom w:type="dxa" w:w="40"/>
+              <w:right w:type="dxa" w:w="80"/>
+            </w:tcMar>
+            <w:vAlign w:val="center"/>
+          </w:tcPr>
+          <w:p>
+            <w:pPr>
+              <w:jc w:val="center"/>
+            </w:pPr>
+            <w:r>
+              <w:rPr>
+                <w:rFonts w:ascii="Times New Roman" w:cs="Times New Roman" w:eastAsia="Times New Roman" w:hAnsi="Times New Roman"/>
+                <w:b w:val="false"/>
+                <w:bCs w:val="false"/>
+                <w:sz w:val="19"/>
+                <w:szCs w:val="19"/>
+              </w:rPr>
+              <w:t xml:space="preserve">no</w:t>
+            </w:r>
+          </w:p>
+        </w:tc>
+        <w:tc>
+          <w:tcPr>
+            <w:tcW w:type="dxa" w:w="1250"/>
+            <w:tcBorders>
+              <w:top w:val="single" w:color="000000" w:sz="4"/>
+              <w:left w:val="single" w:color="000000" w:sz="4"/>
+              <w:bottom w:val="single" w:color="000000" w:sz="4"/>
+              <w:right w:val="single" w:color="000000" w:sz="4"/>
+            </w:tcBorders>
+            <w:shd w:fill="FFFF00" w:color="auto" w:val="clear"/>
+            <w:tcMar>
+              <w:top w:type="dxa" w:w="40"/>
+              <w:left w:type="dxa" w:w="80"/>
+              <w:bottom w:type="dxa" w:w="40"/>
+              <w:right w:type="dxa" w:w="80"/>
+            </w:tcMar>
+            <w:vAlign w:val="center"/>
+          </w:tcPr>
+          <w:p>
+            <w:pPr>
+              <w:jc w:val="center"/>
+            </w:pPr>
+            <w:r>
+              <w:rPr>
+                <w:rFonts w:ascii="Times New Roman" w:cs="Times New Roman" w:eastAsia="Times New Roman" w:hAnsi="Times New Roman"/>
+                <w:b w:val="false"/>
+                <w:bCs w:val="false"/>
+                <w:sz w:val="19"/>
+                <w:szCs w:val="19"/>
+              </w:rPr>
+              <w:t xml:space="preserve">Python</w:t>
+            </w:r>
+          </w:p>
+        </w:tc>
+        <w:tc>
+          <w:tcPr>
+            <w:tcW w:type="dxa" w:w="1250"/>
+            <w:tcBorders>
+              <w:top w:val="single" w:color="000000" w:sz="4"/>
+              <w:left w:val="single" w:color="000000" w:sz="4"/>
+              <w:bottom w:val="single" w:color="000000" w:sz="4"/>
+              <w:right w:val="single" w:color="000000" w:sz="4"/>
+            </w:tcBorders>
+            <w:shd w:fill="FFFF00" w:color="auto" w:val="clear"/>
+            <w:tcMar>
+              <w:top w:type="dxa" w:w="40"/>
+              <w:left w:type="dxa" w:w="80"/>
+              <w:bottom w:type="dxa" w:w="40"/>
+              <w:right w:type="dxa" w:w="80"/>
+            </w:tcMar>
+            <w:vAlign w:val="center"/>
+          </w:tcPr>
+          <w:p>
+            <w:pPr>
+              <w:jc w:val="center"/>
+            </w:pPr>
+            <w:r>
+              <w:rPr>
+                <w:rFonts w:ascii="Times New Roman" w:cs="Times New Roman" w:eastAsia="Times New Roman" w:hAnsi="Times New Roman"/>
+                <w:b w:val="false"/>
+                <w:bCs w:val="false"/>
+                <w:sz w:val="19"/>
+                <w:szCs w:val="19"/>
+              </w:rPr>
+              <w:t xml:space="preserve">Tuned VSG, 10 seeds</w:t>
+            </w:r>
+          </w:p>
+        </w:tc>
+        <w:tc>
+          <w:tcPr>
+            <w:tcW w:type="dxa" w:w="1906"/>
+            <w:tcBorders>
+              <w:top w:val="single" w:color="000000" w:sz="4"/>
+              <w:left w:val="single" w:color="000000" w:sz="4"/>
+              <w:bottom w:val="single" w:color="000000" w:sz="4"/>
+              <w:right w:val="single" w:color="000000" w:sz="4"/>
+            </w:tcBorders>
+            <w:shd w:fill="FFFF00" w:color="auto" w:val="clear"/>
+            <w:tcMar>
+              <w:top w:type="dxa" w:w="40"/>
+              <w:left w:type="dxa" w:w="80"/>
+              <w:bottom w:type="dxa" w:w="40"/>
+              <w:right w:type="dxa" w:w="80"/>
+            </w:tcMar>
+            <w:vAlign w:val="center"/>
+          </w:tcPr>
+          <w:p>
+            <w:pPr>
+              <w:jc w:val="center"/>
+            </w:pPr>
+            <w:r>
+              <w:rPr>
+                <w:rFonts w:ascii="Times New Roman" w:cs="Times New Roman" w:eastAsia="Times New Roman" w:hAnsi="Times New Roman"/>
+                <w:b w:val="false"/>
+                <w:bCs w:val="false"/>
+                <w:sz w:val="19"/>
+                <w:szCs w:val="19"/>
+              </w:rPr>
+              <w:t xml:space="preserve">Comparable IAE with 19–21 % less reserved headroom (Table 4.1)</w:t>
+            </w:r>
+          </w:p>
+        </w:tc>
+      </w:tr>
+      <w:tr>
+        <w:trPr>
+          <w:cantSplit/>
+          <w:tblHeader w:val="false"/>
+        </w:trPr>
+        <w:tc>
+          <w:tcPr>
+            <w:tcW w:type="dxa" w:w="1350"/>
+            <w:tcBorders>
+              <w:top w:val="single" w:color="000000" w:sz="4"/>
+              <w:left w:val="single" w:color="000000" w:sz="4"/>
+              <w:bottom w:val="single" w:color="000000" w:sz="4"/>
+              <w:right w:val="single" w:color="000000" w:sz="4"/>
+            </w:tcBorders>
+            <w:shd w:fill="FFFF00" w:color="auto" w:val="clear"/>
+            <w:tcMar>
+              <w:top w:type="dxa" w:w="40"/>
+              <w:left w:type="dxa" w:w="80"/>
+              <w:bottom w:type="dxa" w:w="40"/>
+              <w:right w:type="dxa" w:w="80"/>
+            </w:tcMar>
+            <w:vAlign w:val="center"/>
+          </w:tcPr>
+          <w:p>
+            <w:pPr>
+              <w:jc w:val="left"/>
+            </w:pPr>
+            <w:r>
+              <w:rPr>
+                <w:rFonts w:ascii="Times New Roman" w:cs="Times New Roman" w:eastAsia="Times New Roman" w:hAnsi="Times New Roman"/>
+                <w:b w:val="false"/>
+                <w:bCs w:val="false"/>
+                <w:sz w:val="19"/>
+                <w:szCs w:val="19"/>
+              </w:rPr>
+              <w:t xml:space="preserve">This thesis, Study 2</w:t>
+            </w:r>
+          </w:p>
+        </w:tc>
+        <w:tc>
+          <w:tcPr>
+            <w:tcW w:type="dxa" w:w="1700"/>
+            <w:tcBorders>
+              <w:top w:val="single" w:color="000000" w:sz="4"/>
+              <w:left w:val="single" w:color="000000" w:sz="4"/>
+              <w:bottom w:val="single" w:color="000000" w:sz="4"/>
+              <w:right w:val="single" w:color="000000" w:sz="4"/>
+            </w:tcBorders>
+            <w:shd w:fill="FFFF00" w:color="auto" w:val="clear"/>
+            <w:tcMar>
+              <w:top w:type="dxa" w:w="40"/>
+              <w:left w:type="dxa" w:w="80"/>
+              <w:bottom w:type="dxa" w:w="40"/>
+              <w:right w:type="dxa" w:w="80"/>
+            </w:tcMar>
+            <w:vAlign w:val="center"/>
+          </w:tcPr>
+          <w:p>
+            <w:pPr>
+              <w:jc w:val="center"/>
+            </w:pPr>
+            <w:r>
+              <w:rPr>
+                <w:rFonts w:ascii="Times New Roman" w:cs="Times New Roman" w:eastAsia="Times New Roman" w:hAnsi="Times New Roman"/>
+                <w:b w:val="false"/>
+                <w:bCs w:val="false"/>
+                <w:sz w:val="19"/>
+                <w:szCs w:val="19"/>
+              </w:rPr>
+              <w:t xml:space="preserve">2 MVA diesel–PV–wind–BESS, ERA5 + NASA POWER, 200 test scenarios</w:t>
+            </w:r>
+          </w:p>
+        </w:tc>
+        <w:tc>
+          <w:tcPr>
+            <w:tcW w:type="dxa" w:w="850"/>
+            <w:tcBorders>
+              <w:top w:val="single" w:color="000000" w:sz="4"/>
+              <w:left w:val="single" w:color="000000" w:sz="4"/>
+              <w:bottom w:val="single" w:color="000000" w:sz="4"/>
+              <w:right w:val="single" w:color="000000" w:sz="4"/>
+            </w:tcBorders>
+            <w:shd w:fill="FFFF00" w:color="auto" w:val="clear"/>
+            <w:tcMar>
+              <w:top w:type="dxa" w:w="40"/>
+              <w:left w:type="dxa" w:w="80"/>
+              <w:bottom w:type="dxa" w:w="40"/>
+              <w:right w:type="dxa" w:w="80"/>
+            </w:tcMar>
+            <w:vAlign w:val="center"/>
+          </w:tcPr>
+          <w:p>
+            <w:pPr>
+              <w:jc w:val="center"/>
+            </w:pPr>
+            <w:r>
+              <w:rPr>
+                <w:rFonts w:ascii="Times New Roman" w:cs="Times New Roman" w:eastAsia="Times New Roman" w:hAnsi="Times New Roman"/>
+                <w:b w:val="false"/>
+                <w:bCs w:val="false"/>
+                <w:sz w:val="19"/>
+                <w:szCs w:val="19"/>
+              </w:rPr>
+              <w:t xml:space="preserve">yes (diesel)</w:t>
+            </w:r>
+          </w:p>
+        </w:tc>
+        <w:tc>
+          <w:tcPr>
+            <w:tcW w:type="dxa" w:w="1250"/>
+            <w:tcBorders>
+              <w:top w:val="single" w:color="000000" w:sz="4"/>
+              <w:left w:val="single" w:color="000000" w:sz="4"/>
+              <w:bottom w:val="single" w:color="000000" w:sz="4"/>
+              <w:right w:val="single" w:color="000000" w:sz="4"/>
+            </w:tcBorders>
+            <w:shd w:fill="FFFF00" w:color="auto" w:val="clear"/>
+            <w:tcMar>
+              <w:top w:type="dxa" w:w="40"/>
+              <w:left w:type="dxa" w:w="80"/>
+              <w:bottom w:type="dxa" w:w="40"/>
+              <w:right w:type="dxa" w:w="80"/>
+            </w:tcMar>
+            <w:vAlign w:val="center"/>
+          </w:tcPr>
+          <w:p>
+            <w:pPr>
+              <w:jc w:val="center"/>
+            </w:pPr>
+            <w:r>
+              <w:rPr>
+                <w:rFonts w:ascii="Times New Roman" w:cs="Times New Roman" w:eastAsia="Times New Roman" w:hAnsi="Times New Roman"/>
+                <w:b w:val="false"/>
+                <w:bCs w:val="false"/>
+                <w:sz w:val="19"/>
+                <w:szCs w:val="19"/>
+              </w:rPr>
+              <w:t xml:space="preserve">Python, MATLAB, Simscape EMT</w:t>
+            </w:r>
+          </w:p>
+        </w:tc>
+        <w:tc>
+          <w:tcPr>
+            <w:tcW w:type="dxa" w:w="1250"/>
+            <w:tcBorders>
+              <w:top w:val="single" w:color="000000" w:sz="4"/>
+              <w:left w:val="single" w:color="000000" w:sz="4"/>
+              <w:bottom w:val="single" w:color="000000" w:sz="4"/>
+              <w:right w:val="single" w:color="000000" w:sz="4"/>
+            </w:tcBorders>
+            <w:shd w:fill="FFFF00" w:color="auto" w:val="clear"/>
+            <w:tcMar>
+              <w:top w:type="dxa" w:w="40"/>
+              <w:left w:type="dxa" w:w="80"/>
+              <w:bottom w:type="dxa" w:w="40"/>
+              <w:right w:type="dxa" w:w="80"/>
+            </w:tcMar>
+            <w:vAlign w:val="center"/>
+          </w:tcPr>
+          <w:p>
+            <w:pPr>
+              <w:jc w:val="center"/>
+            </w:pPr>
+            <w:r>
+              <w:rPr>
+                <w:rFonts w:ascii="Times New Roman" w:cs="Times New Roman" w:eastAsia="Times New Roman" w:hAnsi="Times New Roman"/>
+                <w:b w:val="false"/>
+                <w:bCs w:val="false"/>
+                <w:sz w:val="19"/>
+                <w:szCs w:val="19"/>
+              </w:rPr>
+              <w:t xml:space="preserve">Tuned VSG, 5 seeds</w:t>
+            </w:r>
+          </w:p>
+        </w:tc>
+        <w:tc>
+          <w:tcPr>
+            <w:tcW w:type="dxa" w:w="1906"/>
+            <w:tcBorders>
+              <w:top w:val="single" w:color="000000" w:sz="4"/>
+              <w:left w:val="single" w:color="000000" w:sz="4"/>
+              <w:bottom w:val="single" w:color="000000" w:sz="4"/>
+              <w:right w:val="single" w:color="000000" w:sz="4"/>
+            </w:tcBorders>
+            <w:shd w:fill="FFFF00" w:color="auto" w:val="clear"/>
+            <w:tcMar>
+              <w:top w:type="dxa" w:w="40"/>
+              <w:left w:type="dxa" w:w="80"/>
+              <w:bottom w:type="dxa" w:w="40"/>
+              <w:right w:type="dxa" w:w="80"/>
+            </w:tcMar>
+            <w:vAlign w:val="center"/>
+          </w:tcPr>
+          <w:p>
+            <w:pPr>
+              <w:jc w:val="center"/>
+            </w:pPr>
+            <w:r>
+              <w:rPr>
+                <w:rFonts w:ascii="Times New Roman" w:cs="Times New Roman" w:eastAsia="Times New Roman" w:hAnsi="Times New Roman"/>
+                <w:b w:val="false"/>
+                <w:bCs w:val="false"/>
+                <w:sz w:val="19"/>
+                <w:szCs w:val="19"/>
+              </w:rPr>
+              <w:t xml:space="preserve">Nadir 0.573 → 0.522 Hz (−9 %); infeasible time 5.07 → 0.02 s (Table 4.4)</w:t>
+            </w:r>
+          </w:p>
+        </w:tc>
+      </w:tr>
+    </w:tbl>
+    <w:p>
+      <w:pPr>
+        <w:spacing w:after="160"/>
+      </w:pPr>
+    </w:p>
+    <w:p>
+      <w:pPr>
+        <w:spacing w:after="160" w:line="276"/>
+      </w:pPr>
+      <w:r>
+        <w:rPr>
+          <w:rFonts w:ascii="Times New Roman" w:cs="Times New Roman" w:eastAsia="Times New Roman" w:hAnsi="Times New Roman"/>
+          <w:b w:val="false"/>
+          <w:bCs w:val="false"/>
+          <w:i w:val="false"/>
+          <w:iCs w:val="false"/>
+          <w:sz w:val="22"/>
+          <w:szCs w:val="22"/>
+          <w:shd w:fill="FFFF00" w:color="auto" w:val="clear"/>
+        </w:rPr>
+        <w:t xml:space="preserve">Values are quoted from the cited sections. Systems, disturbances, frequencies (50 or 60 Hz) and baselines differ, so the values show each study's improvement over its own reference and are not directly comparable between rows.</w:t>
+      </w:r>
     </w:p>
     <w:p>
       <w:pPr>
@@ -26941,6 +30297,1149 @@
     </w:p>
     <w:p>
       <w:pPr>
+        <w:spacing w:after="120" w:line="360"/>
+        <w:ind w:firstLine="720"/>
+        <w:jc w:val="both"/>
+      </w:pPr>
+      <w:r>
+        <w:rPr>
+          <w:rFonts w:ascii="Times New Roman" w:cs="Times New Roman" w:eastAsia="Times New Roman" w:hAnsi="Times New Roman"/>
+          <w:b w:val="false"/>
+          <w:bCs w:val="false"/>
+          <w:i w:val="false"/>
+          <w:iCs w:val="false"/>
+          <w:sz w:val="28"/>
+          <w:szCs w:val="28"/>
+          <w:shd w:fill="FFFF00" w:color="auto" w:val="clear"/>
+        </w:rPr>
+        <w:t xml:space="preserve">Table 4.6 places these preliminary results beside the published studies of Table 2.5. The published gains of 33–60 % in frequency deviation are measured against fixed-parameter or PI references, each from one trained agent or controller design. Against a tuned fixed VSG, over 200 test scenarios and five seeds, the nadir gain of TD3 in Study 2 is 9 %, and the oracle bound shows that no scheduler could improve the objective by more than 2.1 % in this system. Because the systems differ, the comparison cannot rank the controllers; it shows how much of a reported gain depends on the reference it is measured against. The feasibility result has no counterpart in the reviewed studies, none of which measures whether the scheduled inertia and damping can be delivered.</w:t>
+      </w:r>
+    </w:p>
+    <w:p>
+      <w:pPr>
+        <w:keepNext/>
+        <w:spacing w:after="80" w:before="200"/>
+        <w:jc w:val="left"/>
+      </w:pPr>
+      <w:r>
+        <w:rPr>
+          <w:rFonts w:ascii="Times New Roman" w:cs="Times New Roman" w:eastAsia="Times New Roman" w:hAnsi="Times New Roman"/>
+          <w:b w:val="false"/>
+          <w:bCs w:val="false"/>
+          <w:i w:val="false"/>
+          <w:iCs w:val="false"/>
+          <w:sz w:val="26"/>
+          <w:szCs w:val="26"/>
+          <w:shd w:fill="FFFF00" w:color="auto" w:val="clear"/>
+        </w:rPr>
+        <w:t xml:space="preserve">Table 4.6 Preliminary results positioned against published studies</w:t>
+      </w:r>
+    </w:p>
+    <w:tbl>
+      <w:tblPr>
+        <w:tblW w:type="dxa" w:w="8306"/>
+        <w:tblBorders>
+          <w:top w:val="single" w:color="auto" w:sz="4"/>
+          <w:left w:val="single" w:color="auto" w:sz="4"/>
+          <w:bottom w:val="single" w:color="auto" w:sz="4"/>
+          <w:right w:val="single" w:color="auto" w:sz="4"/>
+          <w:insideH w:val="single" w:color="auto" w:sz="4"/>
+          <w:insideV w:val="single" w:color="auto" w:sz="4"/>
+        </w:tblBorders>
+      </w:tblPr>
+      <w:tblGrid>
+        <w:gridCol w:w="2500"/>
+        <w:gridCol w:w="2700"/>
+        <w:gridCol w:w="3106"/>
+      </w:tblGrid>
+      <w:tr>
+        <w:trPr>
+          <w:cantSplit/>
+          <w:tblHeader/>
+        </w:trPr>
+        <w:tc>
+          <w:tcPr>
+            <w:tcW w:type="dxa" w:w="2500"/>
+            <w:tcBorders>
+              <w:top w:val="single" w:color="000000" w:sz="4"/>
+              <w:left w:val="single" w:color="000000" w:sz="4"/>
+              <w:bottom w:val="single" w:color="000000" w:sz="4"/>
+              <w:right w:val="single" w:color="000000" w:sz="4"/>
+            </w:tcBorders>
+            <w:shd w:fill="E8E8E8" w:color="auto" w:val="clear"/>
+            <w:tcMar>
+              <w:top w:type="dxa" w:w="40"/>
+              <w:left w:type="dxa" w:w="80"/>
+              <w:bottom w:type="dxa" w:w="40"/>
+              <w:right w:type="dxa" w:w="80"/>
+            </w:tcMar>
+            <w:vAlign w:val="center"/>
+          </w:tcPr>
+          <w:p>
+            <w:pPr>
+              <w:jc w:val="center"/>
+            </w:pPr>
+            <w:r>
+              <w:rPr>
+                <w:rFonts w:ascii="Times New Roman" w:cs="Times New Roman" w:eastAsia="Times New Roman" w:hAnsi="Times New Roman"/>
+                <w:b/>
+                <w:bCs/>
+                <w:sz w:val="21"/>
+                <w:szCs w:val="21"/>
+              </w:rPr>
+              <w:t xml:space="preserve">Study</w:t>
+            </w:r>
+          </w:p>
+        </w:tc>
+        <w:tc>
+          <w:tcPr>
+            <w:tcW w:type="dxa" w:w="2700"/>
+            <w:tcBorders>
+              <w:top w:val="single" w:color="000000" w:sz="4"/>
+              <w:left w:val="single" w:color="000000" w:sz="4"/>
+              <w:bottom w:val="single" w:color="000000" w:sz="4"/>
+              <w:right w:val="single" w:color="000000" w:sz="4"/>
+            </w:tcBorders>
+            <w:shd w:fill="E8E8E8" w:color="auto" w:val="clear"/>
+            <w:tcMar>
+              <w:top w:type="dxa" w:w="40"/>
+              <w:left w:type="dxa" w:w="80"/>
+              <w:bottom w:type="dxa" w:w="40"/>
+              <w:right w:type="dxa" w:w="80"/>
+            </w:tcMar>
+            <w:vAlign w:val="center"/>
+          </w:tcPr>
+          <w:p>
+            <w:pPr>
+              <w:jc w:val="center"/>
+            </w:pPr>
+            <w:r>
+              <w:rPr>
+                <w:rFonts w:ascii="Times New Roman" w:cs="Times New Roman" w:eastAsia="Times New Roman" w:hAnsi="Times New Roman"/>
+                <w:b/>
+                <w:bCs/>
+                <w:sz w:val="21"/>
+                <w:szCs w:val="21"/>
+              </w:rPr>
+              <w:t xml:space="preserve">Reference controller</w:t>
+            </w:r>
+          </w:p>
+        </w:tc>
+        <w:tc>
+          <w:tcPr>
+            <w:tcW w:type="dxa" w:w="3106"/>
+            <w:tcBorders>
+              <w:top w:val="single" w:color="000000" w:sz="4"/>
+              <w:left w:val="single" w:color="000000" w:sz="4"/>
+              <w:bottom w:val="single" w:color="000000" w:sz="4"/>
+              <w:right w:val="single" w:color="000000" w:sz="4"/>
+            </w:tcBorders>
+            <w:shd w:fill="E8E8E8" w:color="auto" w:val="clear"/>
+            <w:tcMar>
+              <w:top w:type="dxa" w:w="40"/>
+              <w:left w:type="dxa" w:w="80"/>
+              <w:bottom w:type="dxa" w:w="40"/>
+              <w:right w:type="dxa" w:w="80"/>
+            </w:tcMar>
+            <w:vAlign w:val="center"/>
+          </w:tcPr>
+          <w:p>
+            <w:pPr>
+              <w:jc w:val="center"/>
+            </w:pPr>
+            <w:r>
+              <w:rPr>
+                <w:rFonts w:ascii="Times New Roman" w:cs="Times New Roman" w:eastAsia="Times New Roman" w:hAnsi="Times New Roman"/>
+                <w:b/>
+                <w:bCs/>
+                <w:sz w:val="21"/>
+                <w:szCs w:val="21"/>
+              </w:rPr>
+              <w:t xml:space="preserve">Reported change</w:t>
+            </w:r>
+          </w:p>
+        </w:tc>
+      </w:tr>
+      <w:tr>
+        <w:trPr>
+          <w:cantSplit/>
+          <w:tblHeader w:val="false"/>
+        </w:trPr>
+        <w:tc>
+          <w:tcPr>
+            <w:tcW w:type="dxa" w:w="2500"/>
+            <w:tcBorders>
+              <w:top w:val="single" w:color="000000" w:sz="4"/>
+              <w:left w:val="single" w:color="000000" w:sz="4"/>
+              <w:bottom w:val="single" w:color="000000" w:sz="4"/>
+              <w:right w:val="single" w:color="000000" w:sz="4"/>
+            </w:tcBorders>
+            <w:shd w:fill="FFFF00" w:color="auto" w:val="clear"/>
+            <w:tcMar>
+              <w:top w:type="dxa" w:w="40"/>
+              <w:left w:type="dxa" w:w="80"/>
+              <w:bottom w:type="dxa" w:w="40"/>
+              <w:right w:type="dxa" w:w="80"/>
+            </w:tcMar>
+            <w:vAlign w:val="center"/>
+          </w:tcPr>
+          <w:p>
+            <w:pPr>
+              <w:jc w:val="left"/>
+            </w:pPr>
+            <w:r>
+              <w:rPr>
+                <w:rFonts w:ascii="Times New Roman" w:cs="Times New Roman" w:eastAsia="Times New Roman" w:hAnsi="Times New Roman"/>
+                <w:b w:val="false"/>
+                <w:bCs w:val="false"/>
+                <w:sz w:val="21"/>
+                <w:szCs w:val="21"/>
+              </w:rPr>
+              <w:t xml:space="preserve">Li et al. (2026), TD3</w:t>
+            </w:r>
+          </w:p>
+        </w:tc>
+        <w:tc>
+          <w:tcPr>
+            <w:tcW w:type="dxa" w:w="2700"/>
+            <w:tcBorders>
+              <w:top w:val="single" w:color="000000" w:sz="4"/>
+              <w:left w:val="single" w:color="000000" w:sz="4"/>
+              <w:bottom w:val="single" w:color="000000" w:sz="4"/>
+              <w:right w:val="single" w:color="000000" w:sz="4"/>
+            </w:tcBorders>
+            <w:shd w:fill="FFFF00" w:color="auto" w:val="clear"/>
+            <w:tcMar>
+              <w:top w:type="dxa" w:w="40"/>
+              <w:left w:type="dxa" w:w="80"/>
+              <w:bottom w:type="dxa" w:w="40"/>
+              <w:right w:type="dxa" w:w="80"/>
+            </w:tcMar>
+            <w:vAlign w:val="center"/>
+          </w:tcPr>
+          <w:p>
+            <w:pPr>
+              <w:jc w:val="center"/>
+            </w:pPr>
+            <w:r>
+              <w:rPr>
+                <w:rFonts w:ascii="Times New Roman" w:cs="Times New Roman" w:eastAsia="Times New Roman" w:hAnsi="Times New Roman"/>
+                <w:b w:val="false"/>
+                <w:bCs w:val="false"/>
+                <w:sz w:val="21"/>
+                <w:szCs w:val="21"/>
+              </w:rPr>
+              <w:t xml:space="preserve">Fixed VSG, default parameters</w:t>
+            </w:r>
+          </w:p>
+        </w:tc>
+        <w:tc>
+          <w:tcPr>
+            <w:tcW w:type="dxa" w:w="3106"/>
+            <w:tcBorders>
+              <w:top w:val="single" w:color="000000" w:sz="4"/>
+              <w:left w:val="single" w:color="000000" w:sz="4"/>
+              <w:bottom w:val="single" w:color="000000" w:sz="4"/>
+              <w:right w:val="single" w:color="000000" w:sz="4"/>
+            </w:tcBorders>
+            <w:shd w:fill="FFFF00" w:color="auto" w:val="clear"/>
+            <w:tcMar>
+              <w:top w:type="dxa" w:w="40"/>
+              <w:left w:type="dxa" w:w="80"/>
+              <w:bottom w:type="dxa" w:w="40"/>
+              <w:right w:type="dxa" w:w="80"/>
+            </w:tcMar>
+            <w:vAlign w:val="center"/>
+          </w:tcPr>
+          <w:p>
+            <w:pPr>
+              <w:jc w:val="center"/>
+            </w:pPr>
+            <w:r>
+              <w:rPr>
+                <w:rFonts w:ascii="Times New Roman" w:cs="Times New Roman" w:eastAsia="Times New Roman" w:hAnsi="Times New Roman"/>
+                <w:b w:val="false"/>
+                <w:bCs w:val="false"/>
+                <w:sz w:val="21"/>
+                <w:szCs w:val="21"/>
+              </w:rPr>
+              <w:t xml:space="preserve">Δf −33 % (power step), −57 % (load step)</w:t>
+            </w:r>
+          </w:p>
+        </w:tc>
+      </w:tr>
+      <w:tr>
+        <w:trPr>
+          <w:cantSplit/>
+          <w:tblHeader w:val="false"/>
+        </w:trPr>
+        <w:tc>
+          <w:tcPr>
+            <w:tcW w:type="dxa" w:w="2500"/>
+            <w:tcBorders>
+              <w:top w:val="single" w:color="000000" w:sz="4"/>
+              <w:left w:val="single" w:color="000000" w:sz="4"/>
+              <w:bottom w:val="single" w:color="000000" w:sz="4"/>
+              <w:right w:val="single" w:color="000000" w:sz="4"/>
+            </w:tcBorders>
+            <w:shd w:fill="FFFF00" w:color="auto" w:val="clear"/>
+            <w:tcMar>
+              <w:top w:type="dxa" w:w="40"/>
+              <w:left w:type="dxa" w:w="80"/>
+              <w:bottom w:type="dxa" w:w="40"/>
+              <w:right w:type="dxa" w:w="80"/>
+            </w:tcMar>
+            <w:vAlign w:val="center"/>
+          </w:tcPr>
+          <w:p>
+            <w:pPr>
+              <w:jc w:val="left"/>
+            </w:pPr>
+            <w:r>
+              <w:rPr>
+                <w:rFonts w:ascii="Times New Roman" w:cs="Times New Roman" w:eastAsia="Times New Roman" w:hAnsi="Times New Roman"/>
+                <w:b w:val="false"/>
+                <w:bCs w:val="false"/>
+                <w:sz w:val="21"/>
+                <w:szCs w:val="21"/>
+              </w:rPr>
+              <w:t xml:space="preserve">Lu and Zhuan (2024), SAC</w:t>
+            </w:r>
+          </w:p>
+        </w:tc>
+        <w:tc>
+          <w:tcPr>
+            <w:tcW w:type="dxa" w:w="2700"/>
+            <w:tcBorders>
+              <w:top w:val="single" w:color="000000" w:sz="4"/>
+              <w:left w:val="single" w:color="000000" w:sz="4"/>
+              <w:bottom w:val="single" w:color="000000" w:sz="4"/>
+              <w:right w:val="single" w:color="000000" w:sz="4"/>
+            </w:tcBorders>
+            <w:shd w:fill="FFFF00" w:color="auto" w:val="clear"/>
+            <w:tcMar>
+              <w:top w:type="dxa" w:w="40"/>
+              <w:left w:type="dxa" w:w="80"/>
+              <w:bottom w:type="dxa" w:w="40"/>
+              <w:right w:type="dxa" w:w="80"/>
+            </w:tcMar>
+            <w:vAlign w:val="center"/>
+          </w:tcPr>
+          <w:p>
+            <w:pPr>
+              <w:jc w:val="center"/>
+            </w:pPr>
+            <w:r>
+              <w:rPr>
+                <w:rFonts w:ascii="Times New Roman" w:cs="Times New Roman" w:eastAsia="Times New Roman" w:hAnsi="Times New Roman"/>
+                <w:b w:val="false"/>
+                <w:bCs w:val="false"/>
+                <w:sz w:val="21"/>
+                <w:szCs w:val="21"/>
+              </w:rPr>
+              <w:t xml:space="preserve">Fixed VSG, default parameters</w:t>
+            </w:r>
+          </w:p>
+        </w:tc>
+        <w:tc>
+          <w:tcPr>
+            <w:tcW w:type="dxa" w:w="3106"/>
+            <w:tcBorders>
+              <w:top w:val="single" w:color="000000" w:sz="4"/>
+              <w:left w:val="single" w:color="000000" w:sz="4"/>
+              <w:bottom w:val="single" w:color="000000" w:sz="4"/>
+              <w:right w:val="single" w:color="000000" w:sz="4"/>
+            </w:tcBorders>
+            <w:shd w:fill="FFFF00" w:color="auto" w:val="clear"/>
+            <w:tcMar>
+              <w:top w:type="dxa" w:w="40"/>
+              <w:left w:type="dxa" w:w="80"/>
+              <w:bottom w:type="dxa" w:w="40"/>
+              <w:right w:type="dxa" w:w="80"/>
+            </w:tcMar>
+            <w:vAlign w:val="center"/>
+          </w:tcPr>
+          <w:p>
+            <w:pPr>
+              <w:jc w:val="center"/>
+            </w:pPr>
+            <w:r>
+              <w:rPr>
+                <w:rFonts w:ascii="Times New Roman" w:cs="Times New Roman" w:eastAsia="Times New Roman" w:hAnsi="Times New Roman"/>
+                <w:b w:val="false"/>
+                <w:bCs w:val="false"/>
+                <w:sz w:val="21"/>
+                <w:szCs w:val="21"/>
+              </w:rPr>
+              <w:t xml:space="preserve">Δf −40 % (power step), −39 % (load step)</w:t>
+            </w:r>
+          </w:p>
+        </w:tc>
+      </w:tr>
+      <w:tr>
+        <w:trPr>
+          <w:cantSplit/>
+          <w:tblHeader w:val="false"/>
+        </w:trPr>
+        <w:tc>
+          <w:tcPr>
+            <w:tcW w:type="dxa" w:w="2500"/>
+            <w:tcBorders>
+              <w:top w:val="single" w:color="000000" w:sz="4"/>
+              <w:left w:val="single" w:color="000000" w:sz="4"/>
+              <w:bottom w:val="single" w:color="000000" w:sz="4"/>
+              <w:right w:val="single" w:color="000000" w:sz="4"/>
+            </w:tcBorders>
+            <w:shd w:fill="FFFF00" w:color="auto" w:val="clear"/>
+            <w:tcMar>
+              <w:top w:type="dxa" w:w="40"/>
+              <w:left w:type="dxa" w:w="80"/>
+              <w:bottom w:type="dxa" w:w="40"/>
+              <w:right w:type="dxa" w:w="80"/>
+            </w:tcMar>
+            <w:vAlign w:val="center"/>
+          </w:tcPr>
+          <w:p>
+            <w:pPr>
+              <w:jc w:val="left"/>
+            </w:pPr>
+            <w:r>
+              <w:rPr>
+                <w:rFonts w:ascii="Times New Roman" w:cs="Times New Roman" w:eastAsia="Times New Roman" w:hAnsi="Times New Roman"/>
+                <w:b w:val="false"/>
+                <w:bCs w:val="false"/>
+                <w:sz w:val="21"/>
+                <w:szCs w:val="21"/>
+              </w:rPr>
+              <w:t xml:space="preserve">Shi et al. (2024), rule</w:t>
+            </w:r>
+          </w:p>
+        </w:tc>
+        <w:tc>
+          <w:tcPr>
+            <w:tcW w:type="dxa" w:w="2700"/>
+            <w:tcBorders>
+              <w:top w:val="single" w:color="000000" w:sz="4"/>
+              <w:left w:val="single" w:color="000000" w:sz="4"/>
+              <w:bottom w:val="single" w:color="000000" w:sz="4"/>
+              <w:right w:val="single" w:color="000000" w:sz="4"/>
+            </w:tcBorders>
+            <w:shd w:fill="FFFF00" w:color="auto" w:val="clear"/>
+            <w:tcMar>
+              <w:top w:type="dxa" w:w="40"/>
+              <w:left w:type="dxa" w:w="80"/>
+              <w:bottom w:type="dxa" w:w="40"/>
+              <w:right w:type="dxa" w:w="80"/>
+            </w:tcMar>
+            <w:vAlign w:val="center"/>
+          </w:tcPr>
+          <w:p>
+            <w:pPr>
+              <w:jc w:val="center"/>
+            </w:pPr>
+            <w:r>
+              <w:rPr>
+                <w:rFonts w:ascii="Times New Roman" w:cs="Times New Roman" w:eastAsia="Times New Roman" w:hAnsi="Times New Roman"/>
+                <w:b w:val="false"/>
+                <w:bCs w:val="false"/>
+                <w:sz w:val="21"/>
+                <w:szCs w:val="21"/>
+              </w:rPr>
+              <w:t xml:space="preserve">Fixed J and D</w:t>
+            </w:r>
+          </w:p>
+        </w:tc>
+        <w:tc>
+          <w:tcPr>
+            <w:tcW w:type="dxa" w:w="3106"/>
+            <w:tcBorders>
+              <w:top w:val="single" w:color="000000" w:sz="4"/>
+              <w:left w:val="single" w:color="000000" w:sz="4"/>
+              <w:bottom w:val="single" w:color="000000" w:sz="4"/>
+              <w:right w:val="single" w:color="000000" w:sz="4"/>
+            </w:tcBorders>
+            <w:shd w:fill="FFFF00" w:color="auto" w:val="clear"/>
+            <w:tcMar>
+              <w:top w:type="dxa" w:w="40"/>
+              <w:left w:type="dxa" w:w="80"/>
+              <w:bottom w:type="dxa" w:w="40"/>
+              <w:right w:type="dxa" w:w="80"/>
+            </w:tcMar>
+            <w:vAlign w:val="center"/>
+          </w:tcPr>
+          <w:p>
+            <w:pPr>
+              <w:jc w:val="center"/>
+            </w:pPr>
+            <w:r>
+              <w:rPr>
+                <w:rFonts w:ascii="Times New Roman" w:cs="Times New Roman" w:eastAsia="Times New Roman" w:hAnsi="Times New Roman"/>
+                <w:b w:val="false"/>
+                <w:bCs w:val="false"/>
+                <w:sz w:val="21"/>
+                <w:szCs w:val="21"/>
+              </w:rPr>
+              <w:t xml:space="preserve">Δf −60 %</w:t>
+            </w:r>
+          </w:p>
+        </w:tc>
+      </w:tr>
+      <w:tr>
+        <w:trPr>
+          <w:cantSplit/>
+          <w:tblHeader w:val="false"/>
+        </w:trPr>
+        <w:tc>
+          <w:tcPr>
+            <w:tcW w:type="dxa" w:w="2500"/>
+            <w:tcBorders>
+              <w:top w:val="single" w:color="000000" w:sz="4"/>
+              <w:left w:val="single" w:color="000000" w:sz="4"/>
+              <w:bottom w:val="single" w:color="000000" w:sz="4"/>
+              <w:right w:val="single" w:color="000000" w:sz="4"/>
+            </w:tcBorders>
+            <w:shd w:fill="FFFF00" w:color="auto" w:val="clear"/>
+            <w:tcMar>
+              <w:top w:type="dxa" w:w="40"/>
+              <w:left w:type="dxa" w:w="80"/>
+              <w:bottom w:type="dxa" w:w="40"/>
+              <w:right w:type="dxa" w:w="80"/>
+            </w:tcMar>
+            <w:vAlign w:val="center"/>
+          </w:tcPr>
+          <w:p>
+            <w:pPr>
+              <w:jc w:val="left"/>
+            </w:pPr>
+            <w:r>
+              <w:rPr>
+                <w:rFonts w:ascii="Times New Roman" w:cs="Times New Roman" w:eastAsia="Times New Roman" w:hAnsi="Times New Roman"/>
+                <w:b w:val="false"/>
+                <w:bCs w:val="false"/>
+                <w:sz w:val="21"/>
+                <w:szCs w:val="21"/>
+              </w:rPr>
+              <w:t xml:space="preserve">Han et al. (2023), rule</w:t>
+            </w:r>
+          </w:p>
+        </w:tc>
+        <w:tc>
+          <w:tcPr>
+            <w:tcW w:type="dxa" w:w="2700"/>
+            <w:tcBorders>
+              <w:top w:val="single" w:color="000000" w:sz="4"/>
+              <w:left w:val="single" w:color="000000" w:sz="4"/>
+              <w:bottom w:val="single" w:color="000000" w:sz="4"/>
+              <w:right w:val="single" w:color="000000" w:sz="4"/>
+            </w:tcBorders>
+            <w:shd w:fill="FFFF00" w:color="auto" w:val="clear"/>
+            <w:tcMar>
+              <w:top w:type="dxa" w:w="40"/>
+              <w:left w:type="dxa" w:w="80"/>
+              <w:bottom w:type="dxa" w:w="40"/>
+              <w:right w:type="dxa" w:w="80"/>
+            </w:tcMar>
+            <w:vAlign w:val="center"/>
+          </w:tcPr>
+          <w:p>
+            <w:pPr>
+              <w:jc w:val="center"/>
+            </w:pPr>
+            <w:r>
+              <w:rPr>
+                <w:rFonts w:ascii="Times New Roman" w:cs="Times New Roman" w:eastAsia="Times New Roman" w:hAnsi="Times New Roman"/>
+                <w:b w:val="false"/>
+                <w:bCs w:val="false"/>
+                <w:sz w:val="21"/>
+                <w:szCs w:val="21"/>
+              </w:rPr>
+              <w:t xml:space="preserve">Constant inertia</w:t>
+            </w:r>
+          </w:p>
+        </w:tc>
+        <w:tc>
+          <w:tcPr>
+            <w:tcW w:type="dxa" w:w="3106"/>
+            <w:tcBorders>
+              <w:top w:val="single" w:color="000000" w:sz="4"/>
+              <w:left w:val="single" w:color="000000" w:sz="4"/>
+              <w:bottom w:val="single" w:color="000000" w:sz="4"/>
+              <w:right w:val="single" w:color="000000" w:sz="4"/>
+            </w:tcBorders>
+            <w:shd w:fill="FFFF00" w:color="auto" w:val="clear"/>
+            <w:tcMar>
+              <w:top w:type="dxa" w:w="40"/>
+              <w:left w:type="dxa" w:w="80"/>
+              <w:bottom w:type="dxa" w:w="40"/>
+              <w:right w:type="dxa" w:w="80"/>
+            </w:tcMar>
+            <w:vAlign w:val="center"/>
+          </w:tcPr>
+          <w:p>
+            <w:pPr>
+              <w:jc w:val="center"/>
+            </w:pPr>
+            <w:r>
+              <w:rPr>
+                <w:rFonts w:ascii="Times New Roman" w:cs="Times New Roman" w:eastAsia="Times New Roman" w:hAnsi="Times New Roman"/>
+                <w:b w:val="false"/>
+                <w:bCs w:val="false"/>
+                <w:sz w:val="21"/>
+                <w:szCs w:val="21"/>
+              </w:rPr>
+              <w:t xml:space="preserve">Frequency dip −13 % to −55 %</w:t>
+            </w:r>
+          </w:p>
+        </w:tc>
+      </w:tr>
+      <w:tr>
+        <w:trPr>
+          <w:cantSplit/>
+          <w:tblHeader w:val="false"/>
+        </w:trPr>
+        <w:tc>
+          <w:tcPr>
+            <w:tcW w:type="dxa" w:w="2500"/>
+            <w:tcBorders>
+              <w:top w:val="single" w:color="000000" w:sz="4"/>
+              <w:left w:val="single" w:color="000000" w:sz="4"/>
+              <w:bottom w:val="single" w:color="000000" w:sz="4"/>
+              <w:right w:val="single" w:color="000000" w:sz="4"/>
+            </w:tcBorders>
+            <w:shd w:fill="FFFF00" w:color="auto" w:val="clear"/>
+            <w:tcMar>
+              <w:top w:type="dxa" w:w="40"/>
+              <w:left w:type="dxa" w:w="80"/>
+              <w:bottom w:type="dxa" w:w="40"/>
+              <w:right w:type="dxa" w:w="80"/>
+            </w:tcMar>
+            <w:vAlign w:val="center"/>
+          </w:tcPr>
+          <w:p>
+            <w:pPr>
+              <w:jc w:val="left"/>
+            </w:pPr>
+            <w:r>
+              <w:rPr>
+                <w:rFonts w:ascii="Times New Roman" w:cs="Times New Roman" w:eastAsia="Times New Roman" w:hAnsi="Times New Roman"/>
+                <w:b w:val="false"/>
+                <w:bCs w:val="false"/>
+                <w:sz w:val="21"/>
+                <w:szCs w:val="21"/>
+              </w:rPr>
+              <w:t xml:space="preserve">Egbomwan et al. (2023), TD3</w:t>
+            </w:r>
+          </w:p>
+        </w:tc>
+        <w:tc>
+          <w:tcPr>
+            <w:tcW w:type="dxa" w:w="2700"/>
+            <w:tcBorders>
+              <w:top w:val="single" w:color="000000" w:sz="4"/>
+              <w:left w:val="single" w:color="000000" w:sz="4"/>
+              <w:bottom w:val="single" w:color="000000" w:sz="4"/>
+              <w:right w:val="single" w:color="000000" w:sz="4"/>
+            </w:tcBorders>
+            <w:shd w:fill="FFFF00" w:color="auto" w:val="clear"/>
+            <w:tcMar>
+              <w:top w:type="dxa" w:w="40"/>
+              <w:left w:type="dxa" w:w="80"/>
+              <w:bottom w:type="dxa" w:w="40"/>
+              <w:right w:type="dxa" w:w="80"/>
+            </w:tcMar>
+            <w:vAlign w:val="center"/>
+          </w:tcPr>
+          <w:p>
+            <w:pPr>
+              <w:jc w:val="center"/>
+            </w:pPr>
+            <w:r>
+              <w:rPr>
+                <w:rFonts w:ascii="Times New Roman" w:cs="Times New Roman" w:eastAsia="Times New Roman" w:hAnsi="Times New Roman"/>
+                <w:b w:val="false"/>
+                <w:bCs w:val="false"/>
+                <w:sz w:val="21"/>
+                <w:szCs w:val="21"/>
+              </w:rPr>
+              <w:t xml:space="preserve">PI</w:t>
+            </w:r>
+          </w:p>
+        </w:tc>
+        <w:tc>
+          <w:tcPr>
+            <w:tcW w:type="dxa" w:w="3106"/>
+            <w:tcBorders>
+              <w:top w:val="single" w:color="000000" w:sz="4"/>
+              <w:left w:val="single" w:color="000000" w:sz="4"/>
+              <w:bottom w:val="single" w:color="000000" w:sz="4"/>
+              <w:right w:val="single" w:color="000000" w:sz="4"/>
+            </w:tcBorders>
+            <w:shd w:fill="FFFF00" w:color="auto" w:val="clear"/>
+            <w:tcMar>
+              <w:top w:type="dxa" w:w="40"/>
+              <w:left w:type="dxa" w:w="80"/>
+              <w:bottom w:type="dxa" w:w="40"/>
+              <w:right w:type="dxa" w:w="80"/>
+            </w:tcMar>
+            <w:vAlign w:val="center"/>
+          </w:tcPr>
+          <w:p>
+            <w:pPr>
+              <w:jc w:val="center"/>
+            </w:pPr>
+            <w:r>
+              <w:rPr>
+                <w:rFonts w:ascii="Times New Roman" w:cs="Times New Roman" w:eastAsia="Times New Roman" w:hAnsi="Times New Roman"/>
+                <w:b w:val="false"/>
+                <w:bCs w:val="false"/>
+                <w:sz w:val="21"/>
+                <w:szCs w:val="21"/>
+              </w:rPr>
+              <w:t xml:space="preserve">Mean absolute Δf error −56.6 %</w:t>
+            </w:r>
+          </w:p>
+        </w:tc>
+      </w:tr>
+      <w:tr>
+        <w:trPr>
+          <w:cantSplit/>
+          <w:tblHeader w:val="false"/>
+        </w:trPr>
+        <w:tc>
+          <w:tcPr>
+            <w:tcW w:type="dxa" w:w="2500"/>
+            <w:tcBorders>
+              <w:top w:val="single" w:color="000000" w:sz="4"/>
+              <w:left w:val="single" w:color="000000" w:sz="4"/>
+              <w:bottom w:val="single" w:color="000000" w:sz="4"/>
+              <w:right w:val="single" w:color="000000" w:sz="4"/>
+            </w:tcBorders>
+            <w:shd w:fill="FFFF00" w:color="auto" w:val="clear"/>
+            <w:tcMar>
+              <w:top w:type="dxa" w:w="40"/>
+              <w:left w:type="dxa" w:w="80"/>
+              <w:bottom w:type="dxa" w:w="40"/>
+              <w:right w:type="dxa" w:w="80"/>
+            </w:tcMar>
+            <w:vAlign w:val="center"/>
+          </w:tcPr>
+          <w:p>
+            <w:pPr>
+              <w:jc w:val="left"/>
+            </w:pPr>
+            <w:r>
+              <w:rPr>
+                <w:rFonts w:ascii="Times New Roman" w:cs="Times New Roman" w:eastAsia="Times New Roman" w:hAnsi="Times New Roman"/>
+                <w:b w:val="false"/>
+                <w:bCs w:val="false"/>
+                <w:sz w:val="21"/>
+                <w:szCs w:val="21"/>
+              </w:rPr>
+              <w:t xml:space="preserve">Criollo et al. (2026), SAC</w:t>
+            </w:r>
+          </w:p>
+        </w:tc>
+        <w:tc>
+          <w:tcPr>
+            <w:tcW w:type="dxa" w:w="2700"/>
+            <w:tcBorders>
+              <w:top w:val="single" w:color="000000" w:sz="4"/>
+              <w:left w:val="single" w:color="000000" w:sz="4"/>
+              <w:bottom w:val="single" w:color="000000" w:sz="4"/>
+              <w:right w:val="single" w:color="000000" w:sz="4"/>
+            </w:tcBorders>
+            <w:shd w:fill="FFFF00" w:color="auto" w:val="clear"/>
+            <w:tcMar>
+              <w:top w:type="dxa" w:w="40"/>
+              <w:left w:type="dxa" w:w="80"/>
+              <w:bottom w:type="dxa" w:w="40"/>
+              <w:right w:type="dxa" w:w="80"/>
+            </w:tcMar>
+            <w:vAlign w:val="center"/>
+          </w:tcPr>
+          <w:p>
+            <w:pPr>
+              <w:jc w:val="center"/>
+            </w:pPr>
+            <w:r>
+              <w:rPr>
+                <w:rFonts w:ascii="Times New Roman" w:cs="Times New Roman" w:eastAsia="Times New Roman" w:hAnsi="Times New Roman"/>
+                <w:b w:val="false"/>
+                <w:bCs w:val="false"/>
+                <w:sz w:val="21"/>
+                <w:szCs w:val="21"/>
+              </w:rPr>
+              <w:t xml:space="preserve">PID</w:t>
+            </w:r>
+          </w:p>
+        </w:tc>
+        <w:tc>
+          <w:tcPr>
+            <w:tcW w:type="dxa" w:w="3106"/>
+            <w:tcBorders>
+              <w:top w:val="single" w:color="000000" w:sz="4"/>
+              <w:left w:val="single" w:color="000000" w:sz="4"/>
+              <w:bottom w:val="single" w:color="000000" w:sz="4"/>
+              <w:right w:val="single" w:color="000000" w:sz="4"/>
+            </w:tcBorders>
+            <w:shd w:fill="FFFF00" w:color="auto" w:val="clear"/>
+            <w:tcMar>
+              <w:top w:type="dxa" w:w="40"/>
+              <w:left w:type="dxa" w:w="80"/>
+              <w:bottom w:type="dxa" w:w="40"/>
+              <w:right w:type="dxa" w:w="80"/>
+            </w:tcMar>
+            <w:vAlign w:val="center"/>
+          </w:tcPr>
+          <w:p>
+            <w:pPr>
+              <w:jc w:val="center"/>
+            </w:pPr>
+            <w:r>
+              <w:rPr>
+                <w:rFonts w:ascii="Times New Roman" w:cs="Times New Roman" w:eastAsia="Times New Roman" w:hAnsi="Times New Roman"/>
+                <w:b w:val="false"/>
+                <w:bCs w:val="false"/>
+                <w:sz w:val="21"/>
+                <w:szCs w:val="21"/>
+              </w:rPr>
+              <w:t xml:space="preserve">RoCoF −37.23 %</w:t>
+            </w:r>
+          </w:p>
+        </w:tc>
+      </w:tr>
+      <w:tr>
+        <w:trPr>
+          <w:cantSplit/>
+          <w:tblHeader w:val="false"/>
+        </w:trPr>
+        <w:tc>
+          <w:tcPr>
+            <w:tcW w:type="dxa" w:w="2500"/>
+            <w:tcBorders>
+              <w:top w:val="single" w:color="000000" w:sz="4"/>
+              <w:left w:val="single" w:color="000000" w:sz="4"/>
+              <w:bottom w:val="single" w:color="000000" w:sz="4"/>
+              <w:right w:val="single" w:color="000000" w:sz="4"/>
+            </w:tcBorders>
+            <w:shd w:fill="FFFF00" w:color="auto" w:val="clear"/>
+            <w:tcMar>
+              <w:top w:type="dxa" w:w="40"/>
+              <w:left w:type="dxa" w:w="80"/>
+              <w:bottom w:type="dxa" w:w="40"/>
+              <w:right w:type="dxa" w:w="80"/>
+            </w:tcMar>
+            <w:vAlign w:val="center"/>
+          </w:tcPr>
+          <w:p>
+            <w:pPr>
+              <w:jc w:val="left"/>
+            </w:pPr>
+            <w:r>
+              <w:rPr>
+                <w:rFonts w:ascii="Times New Roman" w:cs="Times New Roman" w:eastAsia="Times New Roman" w:hAnsi="Times New Roman"/>
+                <w:b w:val="false"/>
+                <w:bCs w:val="false"/>
+                <w:sz w:val="21"/>
+                <w:szCs w:val="21"/>
+              </w:rPr>
+              <w:t xml:space="preserve">This thesis, Study 2, TD3</w:t>
+            </w:r>
+          </w:p>
+        </w:tc>
+        <w:tc>
+          <w:tcPr>
+            <w:tcW w:type="dxa" w:w="2700"/>
+            <w:tcBorders>
+              <w:top w:val="single" w:color="000000" w:sz="4"/>
+              <w:left w:val="single" w:color="000000" w:sz="4"/>
+              <w:bottom w:val="single" w:color="000000" w:sz="4"/>
+              <w:right w:val="single" w:color="000000" w:sz="4"/>
+            </w:tcBorders>
+            <w:shd w:fill="FFFF00" w:color="auto" w:val="clear"/>
+            <w:tcMar>
+              <w:top w:type="dxa" w:w="40"/>
+              <w:left w:type="dxa" w:w="80"/>
+              <w:bottom w:type="dxa" w:w="40"/>
+              <w:right w:type="dxa" w:w="80"/>
+            </w:tcMar>
+            <w:vAlign w:val="center"/>
+          </w:tcPr>
+          <w:p>
+            <w:pPr>
+              <w:jc w:val="center"/>
+            </w:pPr>
+            <w:r>
+              <w:rPr>
+                <w:rFonts w:ascii="Times New Roman" w:cs="Times New Roman" w:eastAsia="Times New Roman" w:hAnsi="Times New Roman"/>
+                <w:b w:val="false"/>
+                <w:bCs w:val="false"/>
+                <w:sz w:val="21"/>
+                <w:szCs w:val="21"/>
+              </w:rPr>
+              <w:t xml:space="preserve">Tuned fixed VSG, 5 seeds, 200 scenarios</w:t>
+            </w:r>
+          </w:p>
+        </w:tc>
+        <w:tc>
+          <w:tcPr>
+            <w:tcW w:type="dxa" w:w="3106"/>
+            <w:tcBorders>
+              <w:top w:val="single" w:color="000000" w:sz="4"/>
+              <w:left w:val="single" w:color="000000" w:sz="4"/>
+              <w:bottom w:val="single" w:color="000000" w:sz="4"/>
+              <w:right w:val="single" w:color="000000" w:sz="4"/>
+            </w:tcBorders>
+            <w:shd w:fill="FFFF00" w:color="auto" w:val="clear"/>
+            <w:tcMar>
+              <w:top w:type="dxa" w:w="40"/>
+              <w:left w:type="dxa" w:w="80"/>
+              <w:bottom w:type="dxa" w:w="40"/>
+              <w:right w:type="dxa" w:w="80"/>
+            </w:tcMar>
+            <w:vAlign w:val="center"/>
+          </w:tcPr>
+          <w:p>
+            <w:pPr>
+              <w:jc w:val="center"/>
+            </w:pPr>
+            <w:r>
+              <w:rPr>
+                <w:rFonts w:ascii="Times New Roman" w:cs="Times New Roman" w:eastAsia="Times New Roman" w:hAnsi="Times New Roman"/>
+                <w:b w:val="false"/>
+                <w:bCs w:val="false"/>
+                <w:sz w:val="21"/>
+                <w:szCs w:val="21"/>
+              </w:rPr>
+              <w:t xml:space="preserve">Nadir −9 % (p_Holm ≈ 7 × 10⁻²¹); RoCoF not significant</w:t>
+            </w:r>
+          </w:p>
+        </w:tc>
+      </w:tr>
+      <w:tr>
+        <w:trPr>
+          <w:cantSplit/>
+          <w:tblHeader w:val="false"/>
+        </w:trPr>
+        <w:tc>
+          <w:tcPr>
+            <w:tcW w:type="dxa" w:w="2500"/>
+            <w:tcBorders>
+              <w:top w:val="single" w:color="000000" w:sz="4"/>
+              <w:left w:val="single" w:color="000000" w:sz="4"/>
+              <w:bottom w:val="single" w:color="000000" w:sz="4"/>
+              <w:right w:val="single" w:color="000000" w:sz="4"/>
+            </w:tcBorders>
+            <w:shd w:fill="FFFF00" w:color="auto" w:val="clear"/>
+            <w:tcMar>
+              <w:top w:type="dxa" w:w="40"/>
+              <w:left w:type="dxa" w:w="80"/>
+              <w:bottom w:type="dxa" w:w="40"/>
+              <w:right w:type="dxa" w:w="80"/>
+            </w:tcMar>
+            <w:vAlign w:val="center"/>
+          </w:tcPr>
+          <w:p>
+            <w:pPr>
+              <w:jc w:val="left"/>
+            </w:pPr>
+            <w:r>
+              <w:rPr>
+                <w:rFonts w:ascii="Times New Roman" w:cs="Times New Roman" w:eastAsia="Times New Roman" w:hAnsi="Times New Roman"/>
+                <w:b w:val="false"/>
+                <w:bCs w:val="false"/>
+                <w:sz w:val="21"/>
+                <w:szCs w:val="21"/>
+              </w:rPr>
+              <w:t xml:space="preserve">This thesis, Study 2, oracle</w:t>
+            </w:r>
+          </w:p>
+        </w:tc>
+        <w:tc>
+          <w:tcPr>
+            <w:tcW w:type="dxa" w:w="2700"/>
+            <w:tcBorders>
+              <w:top w:val="single" w:color="000000" w:sz="4"/>
+              <w:left w:val="single" w:color="000000" w:sz="4"/>
+              <w:bottom w:val="single" w:color="000000" w:sz="4"/>
+              <w:right w:val="single" w:color="000000" w:sz="4"/>
+            </w:tcBorders>
+            <w:shd w:fill="FFFF00" w:color="auto" w:val="clear"/>
+            <w:tcMar>
+              <w:top w:type="dxa" w:w="40"/>
+              <w:left w:type="dxa" w:w="80"/>
+              <w:bottom w:type="dxa" w:w="40"/>
+              <w:right w:type="dxa" w:w="80"/>
+            </w:tcMar>
+            <w:vAlign w:val="center"/>
+          </w:tcPr>
+          <w:p>
+            <w:pPr>
+              <w:jc w:val="center"/>
+            </w:pPr>
+            <w:r>
+              <w:rPr>
+                <w:rFonts w:ascii="Times New Roman" w:cs="Times New Roman" w:eastAsia="Times New Roman" w:hAnsi="Times New Roman"/>
+                <w:b w:val="false"/>
+                <w:bCs w:val="false"/>
+                <w:sz w:val="21"/>
+                <w:szCs w:val="21"/>
+              </w:rPr>
+              <w:t xml:space="preserve">Best single fixed VSG</w:t>
+            </w:r>
+          </w:p>
+        </w:tc>
+        <w:tc>
+          <w:tcPr>
+            <w:tcW w:type="dxa" w:w="3106"/>
+            <w:tcBorders>
+              <w:top w:val="single" w:color="000000" w:sz="4"/>
+              <w:left w:val="single" w:color="000000" w:sz="4"/>
+              <w:bottom w:val="single" w:color="000000" w:sz="4"/>
+              <w:right w:val="single" w:color="000000" w:sz="4"/>
+            </w:tcBorders>
+            <w:shd w:fill="FFFF00" w:color="auto" w:val="clear"/>
+            <w:tcMar>
+              <w:top w:type="dxa" w:w="40"/>
+              <w:left w:type="dxa" w:w="80"/>
+              <w:bottom w:type="dxa" w:w="40"/>
+              <w:right w:type="dxa" w:w="80"/>
+            </w:tcMar>
+            <w:vAlign w:val="center"/>
+          </w:tcPr>
+          <w:p>
+            <w:pPr>
+              <w:jc w:val="center"/>
+            </w:pPr>
+            <w:r>
+              <w:rPr>
+                <w:rFonts w:ascii="Times New Roman" w:cs="Times New Roman" w:eastAsia="Times New Roman" w:hAnsi="Times New Roman"/>
+                <w:b w:val="false"/>
+                <w:bCs w:val="false"/>
+                <w:sz w:val="21"/>
+                <w:szCs w:val="21"/>
+              </w:rPr>
+              <w:t xml:space="preserve">At most 2.1 % gain in objective</w:t>
+            </w:r>
+          </w:p>
+        </w:tc>
+      </w:tr>
+      <w:tr>
+        <w:trPr>
+          <w:cantSplit/>
+          <w:tblHeader w:val="false"/>
+        </w:trPr>
+        <w:tc>
+          <w:tcPr>
+            <w:tcW w:type="dxa" w:w="2500"/>
+            <w:tcBorders>
+              <w:top w:val="single" w:color="000000" w:sz="4"/>
+              <w:left w:val="single" w:color="000000" w:sz="4"/>
+              <w:bottom w:val="single" w:color="000000" w:sz="4"/>
+              <w:right w:val="single" w:color="000000" w:sz="4"/>
+            </w:tcBorders>
+            <w:shd w:fill="FFFF00" w:color="auto" w:val="clear"/>
+            <w:tcMar>
+              <w:top w:type="dxa" w:w="40"/>
+              <w:left w:type="dxa" w:w="80"/>
+              <w:bottom w:type="dxa" w:w="40"/>
+              <w:right w:type="dxa" w:w="80"/>
+            </w:tcMar>
+            <w:vAlign w:val="center"/>
+          </w:tcPr>
+          <w:p>
+            <w:pPr>
+              <w:jc w:val="left"/>
+            </w:pPr>
+            <w:r>
+              <w:rPr>
+                <w:rFonts w:ascii="Times New Roman" w:cs="Times New Roman" w:eastAsia="Times New Roman" w:hAnsi="Times New Roman"/>
+                <w:b w:val="false"/>
+                <w:bCs w:val="false"/>
+                <w:sz w:val="21"/>
+                <w:szCs w:val="21"/>
+              </w:rPr>
+              <w:t xml:space="preserve">This thesis, Study 2, constraint</w:t>
+            </w:r>
+          </w:p>
+        </w:tc>
+        <w:tc>
+          <w:tcPr>
+            <w:tcW w:type="dxa" w:w="2700"/>
+            <w:tcBorders>
+              <w:top w:val="single" w:color="000000" w:sz="4"/>
+              <w:left w:val="single" w:color="000000" w:sz="4"/>
+              <w:bottom w:val="single" w:color="000000" w:sz="4"/>
+              <w:right w:val="single" w:color="000000" w:sz="4"/>
+            </w:tcBorders>
+            <w:shd w:fill="FFFF00" w:color="auto" w:val="clear"/>
+            <w:tcMar>
+              <w:top w:type="dxa" w:w="40"/>
+              <w:left w:type="dxa" w:w="80"/>
+              <w:bottom w:type="dxa" w:w="40"/>
+              <w:right w:type="dxa" w:w="80"/>
+            </w:tcMar>
+            <w:vAlign w:val="center"/>
+          </w:tcPr>
+          <w:p>
+            <w:pPr>
+              <w:jc w:val="center"/>
+            </w:pPr>
+            <w:r>
+              <w:rPr>
+                <w:rFonts w:ascii="Times New Roman" w:cs="Times New Roman" w:eastAsia="Times New Roman" w:hAnsi="Times New Roman"/>
+                <w:b w:val="false"/>
+                <w:bCs w:val="false"/>
+                <w:sz w:val="21"/>
+                <w:szCs w:val="21"/>
+              </w:rPr>
+              <w:t xml:space="preserve">TD3 without constraint</w:t>
+            </w:r>
+          </w:p>
+        </w:tc>
+        <w:tc>
+          <w:tcPr>
+            <w:tcW w:type="dxa" w:w="3106"/>
+            <w:tcBorders>
+              <w:top w:val="single" w:color="000000" w:sz="4"/>
+              <w:left w:val="single" w:color="000000" w:sz="4"/>
+              <w:bottom w:val="single" w:color="000000" w:sz="4"/>
+              <w:right w:val="single" w:color="000000" w:sz="4"/>
+            </w:tcBorders>
+            <w:shd w:fill="FFFF00" w:color="auto" w:val="clear"/>
+            <w:tcMar>
+              <w:top w:type="dxa" w:w="40"/>
+              <w:left w:type="dxa" w:w="80"/>
+              <w:bottom w:type="dxa" w:w="40"/>
+              <w:right w:type="dxa" w:w="80"/>
+            </w:tcMar>
+            <w:vAlign w:val="center"/>
+          </w:tcPr>
+          <w:p>
+            <w:pPr>
+              <w:jc w:val="center"/>
+            </w:pPr>
+            <w:r>
+              <w:rPr>
+                <w:rFonts w:ascii="Times New Roman" w:cs="Times New Roman" w:eastAsia="Times New Roman" w:hAnsi="Times New Roman"/>
+                <w:b w:val="false"/>
+                <w:bCs w:val="false"/>
+                <w:sz w:val="21"/>
+                <w:szCs w:val="21"/>
+              </w:rPr>
+              <w:t xml:space="preserve">Infeasible time 5.07 → 0.02 s per episode (−99.6 %)</w:t>
+            </w:r>
+          </w:p>
+        </w:tc>
+      </w:tr>
+    </w:tbl>
+    <w:p>
+      <w:pPr>
+        <w:spacing w:after="160"/>
+      </w:pPr>
+    </w:p>
+    <w:p>
+      <w:pPr>
         <w:pStyle w:val="Heading1"/>
         <w:pageBreakBefore/>
         <w:spacing w:after="480" w:before="240" w:line="360"/>
@@ -32830,6 +37329,26 @@
           <w:szCs w:val="26"/>
         </w:rPr>
         <w:t xml:space="preserve">T. P. Lillicrap et al., Continuous control with deep reinforcement learning, in International Conference on Learning Representations (ICLR), 2016.</w:t>
+      </w:r>
+    </w:p>
+    <w:p>
+      <w:pPr>
+        <w:spacing w:after="120" w:line="300"/>
+        <w:ind w:left="720" w:hanging="720"/>
+        <w:jc w:val="left"/>
+      </w:pPr>
+      <w:r>
+        <w:rPr>
+          <w:rFonts w:ascii="Times New Roman" w:cs="Times New Roman" w:eastAsia="Times New Roman" w:hAnsi="Times New Roman"/>
+          <w:b w:val="false"/>
+          <w:bCs w:val="false"/>
+          <w:i w:val="false"/>
+          <w:iCs w:val="false"/>
+          <w:sz w:val="26"/>
+          <w:szCs w:val="26"/>
+          <w:shd w:fill="FFFF00" w:color="auto" w:val="clear"/>
+        </w:rPr>
+        <w:t xml:space="preserve">M. H. N. Liyanage, H. S. Wickramadara and K. G. C. Perera, Reinforcement learning control strategies for virtual-inertia grid-connected inverters and stability, J. Res. Technol. Eng., vol. 7, no. 2, pp. 73-88, 2026.</w:t>
       </w:r>
     </w:p>
     <w:p>

</xml_diff>